<commit_message>
TS Kramam corr TS 2.3-2.6, 5.1 Tamil
</commit_message>
<xml_diff>
--- a/TS-Kramam/TS-5.1/TS 5.1 Tamil Krama Paatam Corrections.docx
+++ b/TS-Kramam/TS-5.1/TS 5.1 Tamil Krama Paatam Corrections.docx
@@ -1,7 +1,4599 @@
 
 <file path=word/document.xml><?xml version="1.0" encoding="utf-8"?>
-<w:document xmlns:wpc="http://schemas.microsoft.com/office/word/2010/wordprocessingCanvas" xmlns:cx="http://schemas.microsoft.com/office/drawing/2014/chartex" xmlns:cx1="http://schemas.microsoft.com/office/drawing/2015/9/8/chartex" xmlns:cx2="http://schemas.microsoft.com/office/drawing/2015/10/21/chartex" xmlns:cx3="http://schemas.microsoft.com/office/drawing/2016/5/9/chartex" xmlns:cx4="http://schemas.microsoft.com/office/drawing/2016/5/10/chartex" xmlns:cx5="http://schemas.microsoft.com/office/drawing/2016/5/11/chartex" xmlns:cx6="http://schemas.microsoft.com/office/drawing/2016/5/12/chartex" xmlns:cx7="http://schemas.microsoft.com/office/drawing/2016/5/13/chartex" xmlns:cx8="http://schemas.microsoft.com/office/drawing/2016/5/14/chartex" xmlns:mc="http://schemas.openxmlformats.org/markup-compatibility/2006" xmlns:aink="http://schemas.microsoft.com/office/drawing/2016/ink" xmlns:am3d="http://schemas.microsoft.com/office/drawing/2017/model3d" xmlns:o="urn:schemas-microsoft-com:office:office" xmlns:oel="http://schemas.microsoft.com/office/2019/extlst" xmlns:r="http://schemas.openxmlformats.org/officeDocument/2006/relationships" xmlns:m="http://schemas.openxmlformats.org/officeDocument/2006/math" xmlns:v="urn:schemas-microsoft-com:vml" xmlns:wp14="http://schemas.microsoft.com/office/word/2010/wordprocessingDrawing" xmlns:wp="http://schemas.openxmlformats.org/drawingml/2006/wordprocessingDrawing" xmlns:w10="urn:schemas-microsoft-com:office:word" xmlns:w="http://schemas.openxmlformats.org/wordprocessingml/2006/main" xmlns:w14="http://schemas.microsoft.com/office/word/2010/wordml" xmlns:w15="http://schemas.microsoft.com/office/word/2012/wordml" xmlns:w16cex="http://schemas.microsoft.com/office/word/2018/wordml/cex" xmlns:w16cid="http://schemas.microsoft.com/office/word/2016/wordml/cid" xmlns:w16="http://schemas.microsoft.com/office/word/2018/wordml" xmlns:w16sdtdh="http://schemas.microsoft.com/office/word/2020/wordml/sdtdatahash" xmlns:w16se="http://schemas.microsoft.com/office/word/2015/wordml/symex" xmlns:wpg="http://schemas.microsoft.com/office/word/2010/wordprocessingGroup" xmlns:wpi="http://schemas.microsoft.com/office/word/2010/wordprocessingInk" xmlns:wne="http://schemas.microsoft.com/office/word/2006/wordml" xmlns:wps="http://schemas.microsoft.com/office/word/2010/wordprocessingShape" mc:Ignorable="w14 w15 w16se w16cid w16 w16cex w16sdtdh wp14">
+<w:document xmlns:wpc="http://schemas.microsoft.com/office/word/2010/wordprocessingCanvas" xmlns:cx="http://schemas.microsoft.com/office/drawing/2014/chartex" xmlns:cx1="http://schemas.microsoft.com/office/drawing/2015/9/8/chartex" xmlns:cx2="http://schemas.microsoft.com/office/drawing/2015/10/21/chartex" xmlns:cx3="http://schemas.microsoft.com/office/drawing/2016/5/9/chartex" xmlns:cx4="http://schemas.microsoft.com/office/drawing/2016/5/10/chartex" xmlns:cx5="http://schemas.microsoft.com/office/drawing/2016/5/11/chartex" xmlns:cx6="http://schemas.microsoft.com/office/drawing/2016/5/12/chartex" xmlns:cx7="http://schemas.microsoft.com/office/drawing/2016/5/13/chartex" xmlns:cx8="http://schemas.microsoft.com/office/drawing/2016/5/14/chartex" xmlns:mc="http://schemas.openxmlformats.org/markup-compatibility/2006" xmlns:aink="http://schemas.microsoft.com/office/drawing/2016/ink" xmlns:am3d="http://schemas.microsoft.com/office/drawing/2017/model3d" xmlns:o="urn:schemas-microsoft-com:office:office" xmlns:oel="http://schemas.microsoft.com/office/2019/extlst" xmlns:r="http://schemas.openxmlformats.org/officeDocument/2006/relationships" xmlns:m="http://schemas.openxmlformats.org/officeDocument/2006/math" xmlns:v="urn:schemas-microsoft-com:vml" xmlns:wp14="http://schemas.microsoft.com/office/word/2010/wordprocessingDrawing" xmlns:wp="http://schemas.openxmlformats.org/drawingml/2006/wordprocessingDrawing" xmlns:w10="urn:schemas-microsoft-com:office:word" xmlns:w="http://schemas.openxmlformats.org/wordprocessingml/2006/main" xmlns:w14="http://schemas.microsoft.com/office/word/2010/wordml" xmlns:w15="http://schemas.microsoft.com/office/word/2012/wordml" xmlns:w16cex="http://schemas.microsoft.com/office/word/2018/wordml/cex" xmlns:w16cid="http://schemas.microsoft.com/office/word/2016/wordml/cid" xmlns:w16="http://schemas.microsoft.com/office/word/2018/wordml" xmlns:w16du="http://schemas.microsoft.com/office/word/2023/wordml/word16du" xmlns:w16sdtdh="http://schemas.microsoft.com/office/word/2020/wordml/sdtdatahash" xmlns:w16sdtfl="http://schemas.microsoft.com/office/word/2024/wordml/sdtformatlock" xmlns:w16se="http://schemas.microsoft.com/office/word/2015/wordml/symex" xmlns:wpg="http://schemas.microsoft.com/office/word/2010/wordprocessingGroup" xmlns:wpi="http://schemas.microsoft.com/office/word/2010/wordprocessingInk" xmlns:wne="http://schemas.microsoft.com/office/word/2006/wordml" xmlns:wps="http://schemas.microsoft.com/office/word/2010/wordprocessingShape" mc:Ignorable="w14 w15 w16se w16cid w16 w16cex w16sdtdh w16sdtfl w16du wp14">
   <w:body>
+    <w:p>
+      <w:pPr>
+        <w:jc w:val="center"/>
+        <w:rPr>
+          <w:b/>
+          <w:bCs/>
+          <w:color w:val="EE0000"/>
+          <w:sz w:val="32"/>
+          <w:szCs w:val="32"/>
+          <w:u w:val="single"/>
+        </w:rPr>
+      </w:pPr>
+      <w:r>
+        <w:rPr>
+          <w:b/>
+          <w:bCs/>
+          <w:sz w:val="32"/>
+          <w:szCs w:val="32"/>
+          <w:u w:val="single"/>
+        </w:rPr>
+        <w:t xml:space="preserve">TS </w:t>
+      </w:r>
+      <w:r>
+        <w:rPr>
+          <w:b/>
+          <w:bCs/>
+          <w:sz w:val="32"/>
+          <w:szCs w:val="32"/>
+          <w:u w:val="single"/>
+        </w:rPr>
+        <w:t>Krama</w:t>
+      </w:r>
+      <w:r>
+        <w:rPr>
+          <w:b/>
+          <w:bCs/>
+          <w:sz w:val="32"/>
+          <w:szCs w:val="32"/>
+          <w:u w:val="single"/>
+        </w:rPr>
+        <w:t xml:space="preserve"> Paatam – TS </w:t>
+      </w:r>
+      <w:r>
+        <w:rPr>
+          <w:b/>
+          <w:bCs/>
+          <w:sz w:val="32"/>
+          <w:szCs w:val="32"/>
+          <w:u w:val="single"/>
+        </w:rPr>
+        <w:t>5.1 Tamil</w:t>
+      </w:r>
+      <w:r>
+        <w:rPr>
+          <w:b/>
+          <w:bCs/>
+          <w:sz w:val="32"/>
+          <w:szCs w:val="32"/>
+          <w:u w:val="single"/>
+        </w:rPr>
+        <w:t xml:space="preserve"> Corrections –</w:t>
+      </w:r>
+      <w:r>
+        <w:rPr>
+          <w:b/>
+          <w:bCs/>
+          <w:sz w:val="32"/>
+          <w:szCs w:val="32"/>
+          <w:u w:val="single"/>
+        </w:rPr>
+        <w:t xml:space="preserve"> </w:t>
+      </w:r>
+      <w:r>
+        <w:rPr>
+          <w:b/>
+          <w:bCs/>
+          <w:sz w:val="32"/>
+          <w:szCs w:val="32"/>
+          <w:u w:val="single"/>
+        </w:rPr>
+        <w:t xml:space="preserve">Observed till </w:t>
+      </w:r>
+      <w:proofErr w:type="spellStart"/>
+      <w:r>
+        <w:rPr>
+          <w:b/>
+          <w:bCs/>
+          <w:color w:val="EE0000"/>
+          <w:sz w:val="32"/>
+          <w:szCs w:val="32"/>
+          <w:highlight w:val="yellow"/>
+          <w:u w:val="single"/>
+        </w:rPr>
+        <w:t>xxxxxxxxxx</w:t>
+      </w:r>
+      <w:proofErr w:type="spellEnd"/>
+    </w:p>
+    <w:p>
+      <w:pPr>
+        <w:spacing w:before="0" w:line="240" w:lineRule="auto"/>
+        <w:jc w:val="center"/>
+        <w:rPr>
+          <w:b/>
+          <w:bCs/>
+        </w:rPr>
+      </w:pPr>
+      <w:r>
+        <w:rPr>
+          <w:b/>
+          <w:bCs/>
+        </w:rPr>
+        <w:t>(ignore those which are already incorporated in your book’s version and date)</w:t>
+      </w:r>
+    </w:p>
+    <w:tbl>
+      <w:tblPr>
+        <w:tblW w:w="14395" w:type="dxa"/>
+        <w:tblInd w:w="-792" w:type="dxa"/>
+        <w:tblBorders>
+          <w:top w:val="single" w:sz="4" w:space="0" w:color="000000"/>
+          <w:left w:val="single" w:sz="4" w:space="0" w:color="000000"/>
+          <w:bottom w:val="single" w:sz="4" w:space="0" w:color="000000"/>
+          <w:right w:val="single" w:sz="4" w:space="0" w:color="000000"/>
+          <w:insideH w:val="single" w:sz="4" w:space="0" w:color="000000"/>
+          <w:insideV w:val="single" w:sz="4" w:space="0" w:color="000000"/>
+        </w:tblBorders>
+        <w:tblLook w:val="04A0" w:firstRow="1" w:lastRow="0" w:firstColumn="1" w:lastColumn="0" w:noHBand="0" w:noVBand="1"/>
+      </w:tblPr>
+      <w:tblGrid>
+        <w:gridCol w:w="3764"/>
+        <w:gridCol w:w="5245"/>
+        <w:gridCol w:w="5386"/>
+      </w:tblGrid>
+      <w:tr>
+        <w:trPr>
+          <w:trHeight w:val="867"/>
+        </w:trPr>
+        <w:tc>
+          <w:tcPr>
+            <w:tcW w:w="3764" w:type="dxa"/>
+          </w:tcPr>
+          <w:p>
+            <w:pPr>
+              <w:spacing w:before="0" w:line="240" w:lineRule="auto"/>
+              <w:jc w:val="center"/>
+              <w:rPr>
+                <w:b/>
+                <w:bCs/>
+                <w:sz w:val="32"/>
+                <w:szCs w:val="32"/>
+              </w:rPr>
+            </w:pPr>
+            <w:r>
+              <w:rPr>
+                <w:b/>
+                <w:bCs/>
+                <w:sz w:val="32"/>
+                <w:szCs w:val="32"/>
+              </w:rPr>
+              <w:t>Section, Paragraph</w:t>
+            </w:r>
+          </w:p>
+          <w:p>
+            <w:pPr>
+              <w:spacing w:before="0" w:line="240" w:lineRule="auto"/>
+              <w:jc w:val="center"/>
+              <w:rPr>
+                <w:b/>
+                <w:bCs/>
+                <w:sz w:val="32"/>
+                <w:szCs w:val="32"/>
+              </w:rPr>
+            </w:pPr>
+            <w:r>
+              <w:rPr>
+                <w:b/>
+                <w:bCs/>
+                <w:sz w:val="32"/>
+                <w:szCs w:val="32"/>
+              </w:rPr>
+              <w:t>Reference</w:t>
+            </w:r>
+          </w:p>
+        </w:tc>
+        <w:tc>
+          <w:tcPr>
+            <w:tcW w:w="5245" w:type="dxa"/>
+          </w:tcPr>
+          <w:p>
+            <w:pPr>
+              <w:spacing w:before="0" w:line="240" w:lineRule="auto"/>
+              <w:jc w:val="center"/>
+              <w:rPr>
+                <w:b/>
+                <w:bCs/>
+                <w:sz w:val="32"/>
+                <w:szCs w:val="32"/>
+              </w:rPr>
+            </w:pPr>
+            <w:r>
+              <w:rPr>
+                <w:b/>
+                <w:bCs/>
+                <w:sz w:val="32"/>
+                <w:szCs w:val="32"/>
+              </w:rPr>
+              <w:t>As Printed</w:t>
+            </w:r>
+          </w:p>
+        </w:tc>
+        <w:tc>
+          <w:tcPr>
+            <w:tcW w:w="5386" w:type="dxa"/>
+          </w:tcPr>
+          <w:p>
+            <w:pPr>
+              <w:spacing w:before="0" w:line="240" w:lineRule="auto"/>
+              <w:ind w:right="-18"/>
+              <w:jc w:val="center"/>
+              <w:rPr>
+                <w:b/>
+                <w:bCs/>
+                <w:sz w:val="32"/>
+                <w:szCs w:val="32"/>
+              </w:rPr>
+            </w:pPr>
+            <w:r>
+              <w:rPr>
+                <w:b/>
+                <w:bCs/>
+                <w:sz w:val="32"/>
+                <w:szCs w:val="32"/>
+              </w:rPr>
+              <w:t>To be read as or corrected as</w:t>
+            </w:r>
+          </w:p>
+        </w:tc>
+      </w:tr>
+      <w:tr>
+        <w:trPr>
+          <w:trHeight w:val="962"/>
+        </w:trPr>
+        <w:tc>
+          <w:tcPr>
+            <w:tcW w:w="3764" w:type="dxa"/>
+          </w:tcPr>
+          <w:p>
+            <w:pPr>
+              <w:widowControl w:val="0"/>
+              <w:tabs>
+                <w:tab w:val="left" w:pos="993"/>
+              </w:tabs>
+              <w:autoSpaceDE w:val="0"/>
+              <w:autoSpaceDN w:val="0"/>
+              <w:adjustRightInd w:val="0"/>
+              <w:spacing w:before="0" w:line="252" w:lineRule="auto"/>
+              <w:ind w:right="297"/>
+              <w:rPr>
+                <w:rFonts w:cs="Arial"/>
+                <w:b/>
+                <w:color w:val="000000"/>
+                <w:sz w:val="28"/>
+                <w:szCs w:val="28"/>
+              </w:rPr>
+            </w:pPr>
+            <w:r>
+              <w:rPr>
+                <w:rFonts w:cs="Arial"/>
+                <w:b/>
+                <w:color w:val="000000"/>
+                <w:sz w:val="28"/>
+                <w:szCs w:val="28"/>
+              </w:rPr>
+              <w:t>T.S.5.1.</w:t>
+            </w:r>
+            <w:r>
+              <w:rPr>
+                <w:rFonts w:cs="Arial"/>
+                <w:b/>
+                <w:color w:val="000000"/>
+                <w:sz w:val="28"/>
+                <w:szCs w:val="28"/>
+              </w:rPr>
+              <w:t>2.1</w:t>
+            </w:r>
+            <w:r>
+              <w:rPr>
+                <w:rFonts w:cs="Arial"/>
+                <w:b/>
+                <w:color w:val="000000"/>
+                <w:sz w:val="28"/>
+                <w:szCs w:val="28"/>
+              </w:rPr>
+              <w:t xml:space="preserve"> – Kramam</w:t>
+            </w:r>
+          </w:p>
+          <w:p>
+            <w:pPr>
+              <w:widowControl w:val="0"/>
+              <w:tabs>
+                <w:tab w:val="left" w:pos="993"/>
+              </w:tabs>
+              <w:autoSpaceDE w:val="0"/>
+              <w:autoSpaceDN w:val="0"/>
+              <w:adjustRightInd w:val="0"/>
+              <w:spacing w:before="0" w:line="252" w:lineRule="auto"/>
+              <w:ind w:right="297"/>
+              <w:rPr>
+                <w:rFonts w:cs="Arial"/>
+                <w:b/>
+                <w:color w:val="000000"/>
+                <w:sz w:val="28"/>
+                <w:szCs w:val="28"/>
+              </w:rPr>
+            </w:pPr>
+            <w:r>
+              <w:rPr>
+                <w:rFonts w:cs="Arial"/>
+                <w:b/>
+                <w:color w:val="000000"/>
+                <w:sz w:val="28"/>
+                <w:szCs w:val="28"/>
+              </w:rPr>
+              <w:t xml:space="preserve">Krama Vaakyam No.– </w:t>
+            </w:r>
+            <w:r>
+              <w:rPr>
+                <w:rFonts w:cs="Arial"/>
+                <w:b/>
+                <w:color w:val="000000"/>
+                <w:sz w:val="28"/>
+                <w:szCs w:val="28"/>
+              </w:rPr>
+              <w:t>11</w:t>
+            </w:r>
+          </w:p>
+          <w:p>
+            <w:pPr>
+              <w:widowControl w:val="0"/>
+              <w:tabs>
+                <w:tab w:val="left" w:pos="993"/>
+              </w:tabs>
+              <w:autoSpaceDE w:val="0"/>
+              <w:autoSpaceDN w:val="0"/>
+              <w:adjustRightInd w:val="0"/>
+              <w:spacing w:before="0" w:line="252" w:lineRule="auto"/>
+              <w:ind w:right="297"/>
+              <w:rPr>
+                <w:rFonts w:cs="Arial"/>
+                <w:b/>
+                <w:color w:val="000000"/>
+                <w:sz w:val="28"/>
+                <w:szCs w:val="32"/>
+              </w:rPr>
+            </w:pPr>
+            <w:r>
+              <w:rPr>
+                <w:rFonts w:cs="Arial"/>
+                <w:b/>
+                <w:color w:val="000000"/>
+                <w:sz w:val="28"/>
+                <w:szCs w:val="28"/>
+              </w:rPr>
+              <w:t xml:space="preserve">Panchaati No. - </w:t>
+            </w:r>
+            <w:r>
+              <w:rPr>
+                <w:rFonts w:cs="Arial"/>
+                <w:b/>
+                <w:color w:val="000000"/>
+                <w:sz w:val="28"/>
+                <w:szCs w:val="28"/>
+              </w:rPr>
+              <w:t>5</w:t>
+            </w:r>
+          </w:p>
+        </w:tc>
+        <w:tc>
+          <w:tcPr>
+            <w:tcW w:w="5245" w:type="dxa"/>
+          </w:tcPr>
+          <w:p>
+            <w:pPr>
+              <w:widowControl w:val="0"/>
+              <w:autoSpaceDE w:val="0"/>
+              <w:autoSpaceDN w:val="0"/>
+              <w:adjustRightInd w:val="0"/>
+              <w:spacing w:before="0" w:line="240" w:lineRule="auto"/>
+              <w:rPr>
+                <w:rFonts w:ascii="BRH Malayalam Extra" w:hAnsi="BRH Malayalam Extra" w:cs="BRH Malayalam Extra"/>
+                <w:color w:val="000000"/>
+                <w:sz w:val="36"/>
+                <w:szCs w:val="40"/>
+              </w:rPr>
+            </w:pPr>
+            <w:r>
+              <w:rPr>
+                <w:rFonts w:ascii="Latha" w:hAnsi="Latha" w:cs="Latha"/>
+                <w:sz w:val="28"/>
+                <w:szCs w:val="28"/>
+                <w:cs/>
+                <w:lang w:bidi="ta-IN"/>
+              </w:rPr>
+              <w:t>அ</w:t>
+            </w:r>
+            <w:r>
+              <w:rPr>
+                <w:rFonts w:ascii="BRH Tamil Tab Extra" w:hAnsi="BRH Tamil Tab Extra" w:cs="Latha"/>
+                <w:b/>
+                <w:sz w:val="32"/>
+                <w:szCs w:val="28"/>
+                <w:lang w:bidi="ta-IN"/>
+              </w:rPr>
+              <w:t>…</w:t>
+            </w:r>
+            <w:r>
+              <w:rPr>
+                <w:rFonts w:ascii="Latha" w:hAnsi="Latha" w:cs="Latha"/>
+                <w:sz w:val="28"/>
+                <w:szCs w:val="28"/>
+                <w:cs/>
+                <w:lang w:bidi="ta-IN"/>
+              </w:rPr>
+              <w:t>க்</w:t>
+            </w:r>
+            <w:r>
+              <w:rPr>
+                <w:rFonts w:ascii="Latha" w:hAnsi="Latha" w:cs="Latha"/>
+                <w:b/>
+                <w:bCs/>
+                <w:position w:val="-12"/>
+                <w:sz w:val="28"/>
+                <w:szCs w:val="28"/>
+                <w:cs/>
+                <w:lang w:bidi="ta-IN"/>
+              </w:rPr>
+              <w:t>3</w:t>
+            </w:r>
+            <w:r>
+              <w:rPr>
+                <w:rFonts w:ascii="Latha" w:hAnsi="Latha" w:cs="Latha"/>
+                <w:b/>
+                <w:bCs/>
+                <w:i/>
+                <w:iCs/>
+                <w:sz w:val="28"/>
+                <w:szCs w:val="28"/>
+                <w:cs/>
+                <w:lang w:bidi="ta-IN"/>
+              </w:rPr>
+              <w:t>ரு</w:t>
+            </w:r>
+            <w:r>
+              <w:rPr>
+                <w:rFonts w:ascii="BRH Tamil Tab Extra" w:hAnsi="BRH Tamil Tab Extra" w:cs="Latha"/>
+                <w:b/>
+                <w:sz w:val="32"/>
+                <w:szCs w:val="28"/>
+                <w:lang w:bidi="ta-IN"/>
+              </w:rPr>
+              <w:t>…</w:t>
+            </w:r>
+            <w:r>
+              <w:rPr>
+                <w:rFonts w:ascii="Latha" w:hAnsi="Latha" w:cs="Latha"/>
+                <w:sz w:val="28"/>
+                <w:szCs w:val="28"/>
+                <w:cs/>
+                <w:lang w:bidi="ta-IN"/>
+              </w:rPr>
+              <w:t>ப்ண</w:t>
+            </w:r>
+            <w:r>
+              <w:rPr>
+                <w:rFonts w:ascii="BRH Tamil Tab Extra" w:hAnsi="BRH Tamil Tab Extra" w:cs="Latha"/>
+                <w:b/>
+                <w:sz w:val="32"/>
+                <w:szCs w:val="28"/>
+                <w:lang w:bidi="ta-IN"/>
+              </w:rPr>
+              <w:t>…</w:t>
+            </w:r>
+            <w:r>
+              <w:rPr>
+                <w:rFonts w:ascii="Latha" w:hAnsi="Latha" w:cs="Latha"/>
+                <w:sz w:val="28"/>
+                <w:szCs w:val="28"/>
+                <w:cs/>
+                <w:lang w:bidi="ta-IN"/>
+              </w:rPr>
+              <w:t>ன்</w:t>
+            </w:r>
+            <w:r>
+              <w:rPr>
+                <w:rFonts w:ascii="Latha" w:hAnsi="Latha" w:cs="Latha"/>
+                <w:sz w:val="28"/>
+                <w:szCs w:val="28"/>
+                <w:lang w:bidi="ta-IN"/>
+              </w:rPr>
+              <w:t xml:space="preserve"> </w:t>
+            </w:r>
+            <w:r>
+              <w:rPr>
+                <w:rFonts w:ascii="Latha" w:hAnsi="Latha" w:cs="Latha"/>
+                <w:sz w:val="28"/>
+                <w:szCs w:val="28"/>
+                <w:highlight w:val="yellow"/>
+                <w:cs/>
+                <w:lang w:bidi="ta-IN"/>
+              </w:rPr>
+              <w:t>ரஶ</w:t>
+            </w:r>
+            <w:r>
+              <w:rPr>
+                <w:rFonts w:ascii="BRH Tamil Tab Extra" w:hAnsi="BRH Tamil Tab Extra" w:cs="Latha"/>
+                <w:b/>
+                <w:sz w:val="36"/>
+                <w:szCs w:val="28"/>
+                <w:lang w:bidi="ta-IN"/>
+              </w:rPr>
+              <w:t>†</w:t>
+            </w:r>
+            <w:r>
+              <w:rPr>
+                <w:rFonts w:ascii="Latha" w:hAnsi="Latha" w:cs="Latha"/>
+                <w:sz w:val="28"/>
+                <w:szCs w:val="28"/>
+                <w:cs/>
+                <w:lang w:bidi="ta-IN"/>
+              </w:rPr>
+              <w:t>னாம்</w:t>
+            </w:r>
+            <w:r>
+              <w:rPr>
+                <w:rFonts w:ascii="Latha" w:hAnsi="Latha" w:cs="Latha"/>
+                <w:sz w:val="28"/>
+                <w:szCs w:val="28"/>
+                <w:lang w:bidi="ta-IN"/>
+              </w:rPr>
+              <w:t xml:space="preserve"> | </w:t>
+            </w:r>
+            <w:r>
+              <w:rPr>
+                <w:rFonts w:ascii="Latha" w:hAnsi="Latha" w:cs="Latha"/>
+                <w:sz w:val="28"/>
+                <w:szCs w:val="28"/>
+                <w:cs/>
+                <w:lang w:bidi="ta-IN"/>
+              </w:rPr>
+              <w:t>ர</w:t>
+            </w:r>
+            <w:r>
+              <w:rPr>
+                <w:rFonts w:ascii="BRH Tamil Tab Extra" w:hAnsi="BRH Tamil Tab Extra" w:cs="Latha"/>
+                <w:b/>
+                <w:sz w:val="32"/>
+                <w:szCs w:val="28"/>
+                <w:lang w:bidi="ta-IN"/>
+              </w:rPr>
+              <w:t>…</w:t>
+            </w:r>
+            <w:r>
+              <w:rPr>
+                <w:rFonts w:ascii="Latha" w:hAnsi="Latha" w:cs="Latha"/>
+                <w:sz w:val="28"/>
+                <w:szCs w:val="28"/>
+                <w:cs/>
+                <w:lang w:bidi="ta-IN"/>
+              </w:rPr>
+              <w:t>ஶ</w:t>
+            </w:r>
+            <w:r>
+              <w:rPr>
+                <w:rFonts w:ascii="BRH Tamil Tab Extra" w:hAnsi="BRH Tamil Tab Extra" w:cs="Latha"/>
+                <w:b/>
+                <w:sz w:val="32"/>
+                <w:szCs w:val="28"/>
+                <w:lang w:bidi="ta-IN"/>
+              </w:rPr>
+              <w:t>…</w:t>
+            </w:r>
+            <w:r>
+              <w:rPr>
+                <w:rFonts w:ascii="Latha" w:hAnsi="Latha" w:cs="Latha"/>
+                <w:sz w:val="28"/>
+                <w:szCs w:val="28"/>
+                <w:cs/>
+                <w:lang w:bidi="ta-IN"/>
+              </w:rPr>
+              <w:t>னாம்</w:t>
+            </w:r>
+            <w:r>
+              <w:rPr>
+                <w:rFonts w:ascii="Latha" w:hAnsi="Latha" w:cs="Latha"/>
+                <w:b/>
+                <w:bCs/>
+                <w:i/>
+                <w:iCs/>
+                <w:sz w:val="28"/>
+                <w:szCs w:val="28"/>
+                <w:cs/>
+                <w:lang w:bidi="ta-IN"/>
+              </w:rPr>
+              <w:t>ரு</w:t>
+            </w:r>
+            <w:r>
+              <w:rPr>
+                <w:rFonts w:ascii="BRH Tamil Tab Extra" w:hAnsi="BRH Tamil Tab Extra" w:cs="Latha"/>
+                <w:b/>
+                <w:sz w:val="32"/>
+                <w:szCs w:val="28"/>
+                <w:lang w:bidi="ta-IN"/>
+              </w:rPr>
+              <w:t>…</w:t>
+            </w:r>
+            <w:r>
+              <w:rPr>
+                <w:rFonts w:ascii="Latha" w:hAnsi="Latha" w:cs="Latha"/>
+                <w:sz w:val="28"/>
+                <w:szCs w:val="28"/>
+                <w:cs/>
+                <w:lang w:bidi="ta-IN"/>
+              </w:rPr>
+              <w:t>தஸ்ய</w:t>
+            </w:r>
+            <w:r>
+              <w:rPr>
+                <w:rFonts w:ascii="BRH Tamil Tab Extra" w:hAnsi="BRH Tamil Tab Extra" w:cs="Latha"/>
+                <w:b/>
+                <w:sz w:val="36"/>
+                <w:szCs w:val="28"/>
+                <w:lang w:bidi="ta-IN"/>
+              </w:rPr>
+              <w:t>†</w:t>
+            </w:r>
+            <w:r>
+              <w:rPr>
+                <w:rFonts w:ascii="Latha" w:hAnsi="Latha" w:cs="Latha"/>
+                <w:sz w:val="28"/>
+                <w:szCs w:val="28"/>
+                <w:lang w:bidi="ta-IN"/>
+              </w:rPr>
+              <w:t xml:space="preserve"> |</w:t>
+            </w:r>
+          </w:p>
+        </w:tc>
+        <w:tc>
+          <w:tcPr>
+            <w:tcW w:w="5386" w:type="dxa"/>
+          </w:tcPr>
+          <w:p>
+            <w:pPr>
+              <w:widowControl w:val="0"/>
+              <w:autoSpaceDE w:val="0"/>
+              <w:autoSpaceDN w:val="0"/>
+              <w:adjustRightInd w:val="0"/>
+              <w:spacing w:before="0" w:line="240" w:lineRule="auto"/>
+              <w:rPr>
+                <w:rFonts w:ascii="Cambria" w:hAnsi="Cambria" w:cs="BRH Malayalam Extra"/>
+                <w:color w:val="000000"/>
+                <w:sz w:val="36"/>
+                <w:szCs w:val="40"/>
+              </w:rPr>
+            </w:pPr>
+            <w:r>
+              <w:rPr>
+                <w:rFonts w:ascii="Latha" w:hAnsi="Latha" w:cs="Latha"/>
+                <w:sz w:val="28"/>
+                <w:szCs w:val="28"/>
+                <w:cs/>
+                <w:lang w:bidi="ta-IN"/>
+              </w:rPr>
+              <w:t>அ</w:t>
+            </w:r>
+            <w:r>
+              <w:rPr>
+                <w:rFonts w:ascii="BRH Tamil Tab Extra" w:hAnsi="BRH Tamil Tab Extra" w:cs="Latha"/>
+                <w:b/>
+                <w:sz w:val="32"/>
+                <w:szCs w:val="28"/>
+                <w:lang w:bidi="ta-IN"/>
+              </w:rPr>
+              <w:t>…</w:t>
+            </w:r>
+            <w:r>
+              <w:rPr>
+                <w:rFonts w:ascii="Latha" w:hAnsi="Latha" w:cs="Latha"/>
+                <w:sz w:val="28"/>
+                <w:szCs w:val="28"/>
+                <w:cs/>
+                <w:lang w:bidi="ta-IN"/>
+              </w:rPr>
+              <w:t>க்</w:t>
+            </w:r>
+            <w:r>
+              <w:rPr>
+                <w:rFonts w:ascii="Latha" w:hAnsi="Latha" w:cs="Latha"/>
+                <w:b/>
+                <w:bCs/>
+                <w:position w:val="-12"/>
+                <w:sz w:val="28"/>
+                <w:szCs w:val="28"/>
+                <w:cs/>
+                <w:lang w:bidi="ta-IN"/>
+              </w:rPr>
+              <w:t>3</w:t>
+            </w:r>
+            <w:r>
+              <w:rPr>
+                <w:rFonts w:ascii="Latha" w:hAnsi="Latha" w:cs="Latha"/>
+                <w:b/>
+                <w:bCs/>
+                <w:i/>
+                <w:iCs/>
+                <w:sz w:val="28"/>
+                <w:szCs w:val="28"/>
+                <w:cs/>
+                <w:lang w:bidi="ta-IN"/>
+              </w:rPr>
+              <w:t>ரு</w:t>
+            </w:r>
+            <w:r>
+              <w:rPr>
+                <w:rFonts w:ascii="BRH Tamil Tab Extra" w:hAnsi="BRH Tamil Tab Extra" w:cs="Latha"/>
+                <w:b/>
+                <w:sz w:val="32"/>
+                <w:szCs w:val="28"/>
+                <w:lang w:bidi="ta-IN"/>
+              </w:rPr>
+              <w:t>…</w:t>
+            </w:r>
+            <w:r>
+              <w:rPr>
+                <w:rFonts w:ascii="Latha" w:hAnsi="Latha" w:cs="Latha"/>
+                <w:sz w:val="28"/>
+                <w:szCs w:val="28"/>
+                <w:cs/>
+                <w:lang w:bidi="ta-IN"/>
+              </w:rPr>
+              <w:t>ப்ண</w:t>
+            </w:r>
+            <w:r>
+              <w:rPr>
+                <w:rFonts w:ascii="BRH Tamil Tab Extra" w:hAnsi="BRH Tamil Tab Extra" w:cs="Latha"/>
+                <w:b/>
+                <w:sz w:val="32"/>
+                <w:szCs w:val="28"/>
+                <w:lang w:bidi="ta-IN"/>
+              </w:rPr>
+              <w:t>…</w:t>
+            </w:r>
+            <w:r>
+              <w:rPr>
+                <w:rFonts w:ascii="Latha" w:hAnsi="Latha" w:cs="Latha"/>
+                <w:sz w:val="28"/>
+                <w:szCs w:val="28"/>
+                <w:cs/>
+                <w:lang w:bidi="ta-IN"/>
+              </w:rPr>
+              <w:t>ன்</w:t>
+            </w:r>
+            <w:r>
+              <w:rPr>
+                <w:rFonts w:ascii="Latha" w:hAnsi="Latha" w:cs="Latha"/>
+                <w:sz w:val="28"/>
+                <w:szCs w:val="28"/>
+                <w:lang w:bidi="ta-IN"/>
+              </w:rPr>
+              <w:t xml:space="preserve"> </w:t>
+            </w:r>
+            <w:r>
+              <w:rPr>
+                <w:rFonts w:ascii="Latha" w:hAnsi="Latha" w:cs="Latha"/>
+                <w:sz w:val="28"/>
+                <w:szCs w:val="28"/>
+                <w:highlight w:val="green"/>
+                <w:cs/>
+                <w:lang w:bidi="ta-IN"/>
+              </w:rPr>
+              <w:t>ர</w:t>
+            </w:r>
+            <w:r>
+              <w:rPr>
+                <w:rFonts w:ascii="BRH Tamil Tab Extra" w:hAnsi="BRH Tamil Tab Extra" w:cs="Latha"/>
+                <w:b/>
+                <w:sz w:val="32"/>
+                <w:szCs w:val="28"/>
+                <w:highlight w:val="green"/>
+                <w:lang w:bidi="ta-IN"/>
+              </w:rPr>
+              <w:t>…</w:t>
+            </w:r>
+            <w:r>
+              <w:rPr>
+                <w:rFonts w:ascii="Latha" w:hAnsi="Latha" w:cs="Latha"/>
+                <w:sz w:val="28"/>
+                <w:szCs w:val="28"/>
+                <w:highlight w:val="green"/>
+                <w:cs/>
+                <w:lang w:bidi="ta-IN"/>
+              </w:rPr>
+              <w:t>ஶ</w:t>
+            </w:r>
+            <w:r>
+              <w:rPr>
+                <w:rFonts w:ascii="BRH Tamil Tab Extra" w:hAnsi="BRH Tamil Tab Extra" w:cs="Latha"/>
+                <w:b/>
+                <w:sz w:val="32"/>
+                <w:szCs w:val="28"/>
+                <w:highlight w:val="green"/>
+                <w:lang w:bidi="ta-IN"/>
+              </w:rPr>
+              <w:t>…</w:t>
+            </w:r>
+            <w:r>
+              <w:rPr>
+                <w:rFonts w:ascii="Latha" w:hAnsi="Latha" w:cs="Latha"/>
+                <w:sz w:val="28"/>
+                <w:szCs w:val="28"/>
+                <w:cs/>
+                <w:lang w:bidi="ta-IN"/>
+              </w:rPr>
+              <w:t>னாம்</w:t>
+            </w:r>
+            <w:r>
+              <w:rPr>
+                <w:rFonts w:ascii="Latha" w:hAnsi="Latha" w:cs="Latha"/>
+                <w:sz w:val="28"/>
+                <w:szCs w:val="28"/>
+                <w:lang w:bidi="ta-IN"/>
+              </w:rPr>
+              <w:t xml:space="preserve"> | </w:t>
+            </w:r>
+            <w:r>
+              <w:rPr>
+                <w:rFonts w:ascii="Latha" w:hAnsi="Latha" w:cs="Latha"/>
+                <w:sz w:val="28"/>
+                <w:szCs w:val="28"/>
+                <w:cs/>
+                <w:lang w:bidi="ta-IN"/>
+              </w:rPr>
+              <w:t>ர</w:t>
+            </w:r>
+            <w:r>
+              <w:rPr>
+                <w:rFonts w:ascii="BRH Tamil Tab Extra" w:hAnsi="BRH Tamil Tab Extra" w:cs="Latha"/>
+                <w:b/>
+                <w:sz w:val="32"/>
+                <w:szCs w:val="28"/>
+                <w:lang w:bidi="ta-IN"/>
+              </w:rPr>
+              <w:t>…</w:t>
+            </w:r>
+            <w:r>
+              <w:rPr>
+                <w:rFonts w:ascii="Latha" w:hAnsi="Latha" w:cs="Latha"/>
+                <w:sz w:val="28"/>
+                <w:szCs w:val="28"/>
+                <w:cs/>
+                <w:lang w:bidi="ta-IN"/>
+              </w:rPr>
+              <w:t>ஶ</w:t>
+            </w:r>
+            <w:r>
+              <w:rPr>
+                <w:rFonts w:ascii="BRH Tamil Tab Extra" w:hAnsi="BRH Tamil Tab Extra" w:cs="Latha"/>
+                <w:b/>
+                <w:sz w:val="32"/>
+                <w:szCs w:val="28"/>
+                <w:lang w:bidi="ta-IN"/>
+              </w:rPr>
+              <w:t>…</w:t>
+            </w:r>
+            <w:r>
+              <w:rPr>
+                <w:rFonts w:ascii="Latha" w:hAnsi="Latha" w:cs="Latha"/>
+                <w:sz w:val="28"/>
+                <w:szCs w:val="28"/>
+                <w:cs/>
+                <w:lang w:bidi="ta-IN"/>
+              </w:rPr>
+              <w:t>னாம்</w:t>
+            </w:r>
+            <w:r>
+              <w:rPr>
+                <w:rFonts w:ascii="Latha" w:hAnsi="Latha" w:cs="Latha"/>
+                <w:b/>
+                <w:bCs/>
+                <w:i/>
+                <w:iCs/>
+                <w:sz w:val="28"/>
+                <w:szCs w:val="28"/>
+                <w:cs/>
+                <w:lang w:bidi="ta-IN"/>
+              </w:rPr>
+              <w:t>ரு</w:t>
+            </w:r>
+            <w:r>
+              <w:rPr>
+                <w:rFonts w:ascii="BRH Tamil Tab Extra" w:hAnsi="BRH Tamil Tab Extra" w:cs="Latha"/>
+                <w:b/>
+                <w:sz w:val="32"/>
+                <w:szCs w:val="28"/>
+                <w:lang w:bidi="ta-IN"/>
+              </w:rPr>
+              <w:t>…</w:t>
+            </w:r>
+            <w:r>
+              <w:rPr>
+                <w:rFonts w:ascii="Latha" w:hAnsi="Latha" w:cs="Latha"/>
+                <w:sz w:val="28"/>
+                <w:szCs w:val="28"/>
+                <w:cs/>
+                <w:lang w:bidi="ta-IN"/>
+              </w:rPr>
+              <w:t>தஸ்ய</w:t>
+            </w:r>
+            <w:r>
+              <w:rPr>
+                <w:rFonts w:ascii="BRH Tamil Tab Extra" w:hAnsi="BRH Tamil Tab Extra" w:cs="Latha"/>
+                <w:b/>
+                <w:sz w:val="36"/>
+                <w:szCs w:val="28"/>
+                <w:lang w:bidi="ta-IN"/>
+              </w:rPr>
+              <w:t>†</w:t>
+            </w:r>
+            <w:r>
+              <w:rPr>
+                <w:rFonts w:ascii="Latha" w:hAnsi="Latha" w:cs="Latha"/>
+                <w:sz w:val="28"/>
+                <w:szCs w:val="28"/>
+                <w:lang w:bidi="ta-IN"/>
+              </w:rPr>
+              <w:t xml:space="preserve"> |</w:t>
+            </w:r>
+          </w:p>
+        </w:tc>
+      </w:tr>
+      <w:tr>
+        <w:trPr>
+          <w:trHeight w:val="962"/>
+        </w:trPr>
+        <w:tc>
+          <w:tcPr>
+            <w:tcW w:w="3764" w:type="dxa"/>
+          </w:tcPr>
+          <w:p>
+            <w:pPr>
+              <w:widowControl w:val="0"/>
+              <w:tabs>
+                <w:tab w:val="left" w:pos="993"/>
+              </w:tabs>
+              <w:autoSpaceDE w:val="0"/>
+              <w:autoSpaceDN w:val="0"/>
+              <w:adjustRightInd w:val="0"/>
+              <w:spacing w:before="0" w:line="252" w:lineRule="auto"/>
+              <w:ind w:right="297"/>
+              <w:rPr>
+                <w:rFonts w:cs="Arial"/>
+                <w:b/>
+                <w:color w:val="000000"/>
+                <w:sz w:val="28"/>
+                <w:szCs w:val="28"/>
+              </w:rPr>
+            </w:pPr>
+            <w:r>
+              <w:rPr>
+                <w:rFonts w:cs="Arial"/>
+                <w:b/>
+                <w:color w:val="000000"/>
+                <w:sz w:val="28"/>
+                <w:szCs w:val="28"/>
+              </w:rPr>
+              <w:t>T.S.5.1.2.</w:t>
+            </w:r>
+            <w:r>
+              <w:rPr>
+                <w:rFonts w:cs="Arial"/>
+                <w:b/>
+                <w:color w:val="000000"/>
+                <w:sz w:val="28"/>
+                <w:szCs w:val="28"/>
+              </w:rPr>
+              <w:t>2</w:t>
+            </w:r>
+            <w:r>
+              <w:rPr>
+                <w:rFonts w:cs="Arial"/>
+                <w:b/>
+                <w:color w:val="000000"/>
+                <w:sz w:val="28"/>
+                <w:szCs w:val="28"/>
+              </w:rPr>
+              <w:t xml:space="preserve"> – Kramam</w:t>
+            </w:r>
+          </w:p>
+          <w:p>
+            <w:pPr>
+              <w:widowControl w:val="0"/>
+              <w:tabs>
+                <w:tab w:val="left" w:pos="993"/>
+              </w:tabs>
+              <w:autoSpaceDE w:val="0"/>
+              <w:autoSpaceDN w:val="0"/>
+              <w:adjustRightInd w:val="0"/>
+              <w:spacing w:before="0" w:line="252" w:lineRule="auto"/>
+              <w:ind w:right="297"/>
+              <w:rPr>
+                <w:rFonts w:cs="Arial"/>
+                <w:b/>
+                <w:color w:val="000000"/>
+                <w:sz w:val="28"/>
+                <w:szCs w:val="28"/>
+              </w:rPr>
+            </w:pPr>
+            <w:r>
+              <w:rPr>
+                <w:rFonts w:cs="Arial"/>
+                <w:b/>
+                <w:color w:val="000000"/>
+                <w:sz w:val="28"/>
+                <w:szCs w:val="28"/>
+              </w:rPr>
+              <w:t xml:space="preserve">Krama Vaakyam No.– </w:t>
+            </w:r>
+            <w:r>
+              <w:rPr>
+                <w:rFonts w:cs="Arial"/>
+                <w:b/>
+                <w:color w:val="000000"/>
+                <w:sz w:val="28"/>
+                <w:szCs w:val="28"/>
+              </w:rPr>
+              <w:t>40,41,42</w:t>
+            </w:r>
+          </w:p>
+          <w:p>
+            <w:pPr>
+              <w:widowControl w:val="0"/>
+              <w:tabs>
+                <w:tab w:val="left" w:pos="993"/>
+              </w:tabs>
+              <w:autoSpaceDE w:val="0"/>
+              <w:autoSpaceDN w:val="0"/>
+              <w:adjustRightInd w:val="0"/>
+              <w:spacing w:before="0" w:line="252" w:lineRule="auto"/>
+              <w:ind w:right="297"/>
+              <w:rPr>
+                <w:rFonts w:cs="Arial"/>
+                <w:b/>
+                <w:color w:val="000000"/>
+                <w:sz w:val="28"/>
+                <w:szCs w:val="28"/>
+              </w:rPr>
+            </w:pPr>
+            <w:r>
+              <w:rPr>
+                <w:rFonts w:cs="Arial"/>
+                <w:b/>
+                <w:color w:val="000000"/>
+                <w:sz w:val="28"/>
+                <w:szCs w:val="28"/>
+              </w:rPr>
+              <w:t xml:space="preserve">Panchaati No. - </w:t>
+            </w:r>
+            <w:r>
+              <w:rPr>
+                <w:rFonts w:cs="Arial"/>
+                <w:b/>
+                <w:color w:val="000000"/>
+                <w:sz w:val="28"/>
+                <w:szCs w:val="28"/>
+              </w:rPr>
+              <w:t>6</w:t>
+            </w:r>
+          </w:p>
+        </w:tc>
+        <w:tc>
+          <w:tcPr>
+            <w:tcW w:w="5245" w:type="dxa"/>
+          </w:tcPr>
+          <w:p>
+            <w:pPr>
+              <w:widowControl w:val="0"/>
+              <w:autoSpaceDE w:val="0"/>
+              <w:autoSpaceDN w:val="0"/>
+              <w:adjustRightInd w:val="0"/>
+              <w:spacing w:before="0" w:line="240" w:lineRule="auto"/>
+              <w:rPr>
+                <w:rFonts w:ascii="Latha" w:hAnsi="Latha" w:cs="Latha"/>
+                <w:sz w:val="28"/>
+                <w:szCs w:val="28"/>
+                <w:cs/>
+                <w:lang w:bidi="ta-IN"/>
+              </w:rPr>
+            </w:pPr>
+            <w:r>
+              <w:rPr>
+                <w:rFonts w:ascii="Latha" w:hAnsi="Latha" w:cs="Latha"/>
+                <w:sz w:val="28"/>
+                <w:szCs w:val="28"/>
+                <w:cs/>
+                <w:lang w:bidi="ta-IN"/>
+              </w:rPr>
+              <w:t>ப</w:t>
+            </w:r>
+            <w:r>
+              <w:rPr>
+                <w:rFonts w:ascii="BRH Tamil Tab Extra" w:hAnsi="BRH Tamil Tab Extra" w:cs="Latha"/>
+                <w:b/>
+                <w:sz w:val="32"/>
+                <w:szCs w:val="28"/>
+                <w:lang w:bidi="ta-IN"/>
+              </w:rPr>
+              <w:t>…</w:t>
+            </w:r>
+            <w:r>
+              <w:rPr>
+                <w:rFonts w:ascii="Latha" w:hAnsi="Latha" w:cs="Latha"/>
+                <w:b/>
+                <w:bCs/>
+                <w:position w:val="-12"/>
+                <w:sz w:val="28"/>
+                <w:szCs w:val="28"/>
+                <w:cs/>
+                <w:lang w:bidi="ta-IN"/>
+              </w:rPr>
+              <w:t>4</w:t>
+            </w:r>
+            <w:r>
+              <w:rPr>
+                <w:rFonts w:ascii="Latha" w:hAnsi="Latha" w:cs="Latha"/>
+                <w:sz w:val="28"/>
+                <w:szCs w:val="28"/>
+                <w:cs/>
+                <w:lang w:bidi="ta-IN"/>
+              </w:rPr>
+              <w:t>ர</w:t>
+            </w:r>
+            <w:r>
+              <w:rPr>
+                <w:rFonts w:ascii="BRH Tamil Tab Extra" w:hAnsi="BRH Tamil Tab Extra" w:cs="Latha"/>
+                <w:b/>
+                <w:sz w:val="32"/>
+                <w:szCs w:val="28"/>
+                <w:lang w:bidi="ta-IN"/>
+              </w:rPr>
+              <w:t>…</w:t>
+            </w:r>
+            <w:r>
+              <w:rPr>
+                <w:rFonts w:ascii="Latha" w:hAnsi="Latha" w:cs="Latha"/>
+                <w:sz w:val="28"/>
+                <w:szCs w:val="28"/>
+                <w:cs/>
+                <w:lang w:bidi="ta-IN"/>
+              </w:rPr>
+              <w:t>த்யனு</w:t>
+            </w:r>
+            <w:r>
+              <w:rPr>
+                <w:rFonts w:ascii="BRH Tamil Tab Extra" w:hAnsi="BRH Tamil Tab Extra" w:cs="Latha"/>
+                <w:b/>
+                <w:sz w:val="36"/>
+                <w:szCs w:val="28"/>
+                <w:lang w:bidi="ta-IN"/>
+              </w:rPr>
+              <w:t>†</w:t>
+            </w:r>
+            <w:r>
+              <w:rPr>
+                <w:rFonts w:ascii="Latha" w:hAnsi="Latha" w:cs="Latha"/>
+                <w:sz w:val="28"/>
+                <w:szCs w:val="28"/>
+                <w:cs/>
+                <w:lang w:bidi="ta-IN"/>
+              </w:rPr>
+              <w:t>வி</w:t>
+            </w:r>
+            <w:r>
+              <w:rPr>
+                <w:rFonts w:ascii="Latha" w:hAnsi="Latha" w:cs="Latha"/>
+                <w:sz w:val="28"/>
+                <w:szCs w:val="28"/>
+                <w:highlight w:val="yellow"/>
+                <w:cs/>
+                <w:lang w:bidi="ta-IN"/>
+              </w:rPr>
+              <w:t>த்யை</w:t>
+            </w:r>
+            <w:r>
+              <w:rPr>
+                <w:rFonts w:ascii="Latha" w:hAnsi="Latha" w:cs="Latha"/>
+                <w:sz w:val="28"/>
+                <w:szCs w:val="28"/>
+                <w:lang w:bidi="ta-IN"/>
+              </w:rPr>
+              <w:t xml:space="preserve"> | </w:t>
+            </w:r>
+            <w:r>
+              <w:rPr>
+                <w:rFonts w:ascii="Latha" w:hAnsi="Latha" w:cs="Latha"/>
+                <w:sz w:val="28"/>
+                <w:szCs w:val="28"/>
+                <w:cs/>
+                <w:lang w:bidi="ta-IN"/>
+              </w:rPr>
+              <w:t>அனு</w:t>
+            </w:r>
+            <w:r>
+              <w:rPr>
+                <w:rFonts w:ascii="BRH Tamil Tab Extra" w:hAnsi="BRH Tamil Tab Extra" w:cs="Latha"/>
+                <w:b/>
+                <w:sz w:val="36"/>
+                <w:szCs w:val="28"/>
+                <w:lang w:bidi="ta-IN"/>
+              </w:rPr>
+              <w:t>†</w:t>
+            </w:r>
+            <w:r>
+              <w:rPr>
+                <w:rFonts w:ascii="Latha" w:hAnsi="Latha" w:cs="Latha"/>
+                <w:sz w:val="28"/>
+                <w:szCs w:val="28"/>
+                <w:cs/>
+                <w:lang w:bidi="ta-IN"/>
+              </w:rPr>
+              <w:t>வி</w:t>
+            </w:r>
+            <w:r>
+              <w:rPr>
+                <w:rFonts w:ascii="Latha" w:hAnsi="Latha" w:cs="Latha"/>
+                <w:sz w:val="28"/>
+                <w:szCs w:val="28"/>
+                <w:highlight w:val="yellow"/>
+                <w:cs/>
+                <w:lang w:bidi="ta-IN"/>
+              </w:rPr>
+              <w:t>த்</w:t>
+            </w:r>
+            <w:r>
+              <w:rPr>
+                <w:rFonts w:ascii="Latha" w:hAnsi="Latha" w:cs="Latha"/>
+                <w:sz w:val="28"/>
+                <w:szCs w:val="28"/>
+                <w:cs/>
+                <w:lang w:bidi="ta-IN"/>
+              </w:rPr>
+              <w:t>யை</w:t>
+            </w:r>
+            <w:r>
+              <w:rPr>
+                <w:rFonts w:ascii="Latha" w:hAnsi="Latha" w:cs="Latha"/>
+                <w:sz w:val="28"/>
+                <w:szCs w:val="28"/>
+                <w:lang w:bidi="ta-IN"/>
+              </w:rPr>
+              <w:t xml:space="preserve"> </w:t>
+            </w:r>
+            <w:r>
+              <w:rPr>
+                <w:rFonts w:ascii="Latha" w:hAnsi="Latha" w:cs="Latha"/>
+                <w:sz w:val="28"/>
+                <w:szCs w:val="28"/>
+                <w:cs/>
+                <w:lang w:bidi="ta-IN"/>
+              </w:rPr>
+              <w:t>பாபவஸ்ய</w:t>
+            </w:r>
+            <w:r>
+              <w:rPr>
+                <w:rFonts w:ascii="BRH Tamil Tab Extra" w:hAnsi="BRH Tamil Tab Extra" w:cs="Latha"/>
+                <w:b/>
+                <w:sz w:val="32"/>
+                <w:szCs w:val="28"/>
+                <w:lang w:bidi="ta-IN"/>
+              </w:rPr>
+              <w:t>…</w:t>
+            </w:r>
+            <w:r>
+              <w:rPr>
+                <w:rFonts w:ascii="Latha" w:hAnsi="Latha" w:cs="Latha"/>
+                <w:sz w:val="28"/>
+                <w:szCs w:val="28"/>
+                <w:cs/>
+                <w:lang w:bidi="ta-IN"/>
+              </w:rPr>
+              <w:t>ஸம்</w:t>
+            </w:r>
+            <w:r>
+              <w:rPr>
+                <w:rFonts w:ascii="Latha" w:hAnsi="Latha" w:cs="Latha"/>
+                <w:sz w:val="28"/>
+                <w:szCs w:val="28"/>
+                <w:lang w:bidi="ta-IN"/>
+              </w:rPr>
+              <w:t xml:space="preserve">| </w:t>
+            </w:r>
+            <w:r>
+              <w:rPr>
+                <w:rFonts w:ascii="Latha" w:hAnsi="Latha" w:cs="Latha"/>
+                <w:sz w:val="28"/>
+                <w:szCs w:val="28"/>
+                <w:cs/>
+                <w:lang w:bidi="ta-IN"/>
+              </w:rPr>
+              <w:t>அனு</w:t>
+            </w:r>
+            <w:r>
+              <w:rPr>
+                <w:rFonts w:ascii="BRH Tamil Tab Extra" w:hAnsi="BRH Tamil Tab Extra" w:cs="Latha"/>
+                <w:b/>
+                <w:sz w:val="36"/>
+                <w:szCs w:val="28"/>
+                <w:lang w:bidi="ta-IN"/>
+              </w:rPr>
+              <w:t>†</w:t>
+            </w:r>
+            <w:r>
+              <w:rPr>
+                <w:rFonts w:ascii="Latha" w:hAnsi="Latha" w:cs="Latha"/>
+                <w:sz w:val="28"/>
+                <w:szCs w:val="28"/>
+                <w:cs/>
+                <w:lang w:bidi="ta-IN"/>
+              </w:rPr>
+              <w:t>வி</w:t>
+            </w:r>
+            <w:r>
+              <w:rPr>
+                <w:rFonts w:ascii="Latha" w:hAnsi="Latha" w:cs="Latha"/>
+                <w:sz w:val="28"/>
+                <w:szCs w:val="28"/>
+                <w:highlight w:val="yellow"/>
+                <w:cs/>
+                <w:lang w:bidi="ta-IN"/>
+              </w:rPr>
+              <w:t>த்யா</w:t>
+            </w:r>
+            <w:r>
+              <w:rPr>
+                <w:rFonts w:ascii="BRH Tamil Tab Extra" w:hAnsi="BRH Tamil Tab Extra" w:cs="Latha"/>
+                <w:b/>
+                <w:sz w:val="32"/>
+                <w:szCs w:val="28"/>
+                <w:lang w:bidi="ta-IN"/>
+              </w:rPr>
+              <w:t>…</w:t>
+            </w:r>
+            <w:r>
+              <w:rPr>
+                <w:rFonts w:ascii="Latha" w:hAnsi="Latha" w:cs="Latha"/>
+                <w:sz w:val="28"/>
+                <w:szCs w:val="28"/>
+                <w:lang w:bidi="ta-IN"/>
+              </w:rPr>
+              <w:t xml:space="preserve"> </w:t>
+            </w:r>
+            <w:r>
+              <w:rPr>
+                <w:rFonts w:ascii="Latha" w:hAnsi="Latha" w:cs="Latha"/>
+                <w:sz w:val="28"/>
+                <w:szCs w:val="28"/>
+                <w:cs/>
+                <w:lang w:bidi="ta-IN"/>
+              </w:rPr>
+              <w:t>இத்யனு</w:t>
+            </w:r>
+            <w:r>
+              <w:rPr>
+                <w:rFonts w:ascii="BRH Tamil Tab Extra" w:hAnsi="BRH Tamil Tab Extra" w:cs="Latha"/>
+                <w:b/>
+                <w:sz w:val="36"/>
+                <w:szCs w:val="28"/>
+                <w:lang w:bidi="ta-IN"/>
+              </w:rPr>
+              <w:t>†</w:t>
+            </w:r>
+            <w:r>
+              <w:rPr>
+                <w:rFonts w:ascii="Latha" w:hAnsi="Latha" w:cs="Latha"/>
+                <w:sz w:val="28"/>
+                <w:szCs w:val="28"/>
+                <w:lang w:bidi="ta-IN"/>
+              </w:rPr>
+              <w:t xml:space="preserve"> - </w:t>
+            </w:r>
+            <w:r>
+              <w:rPr>
+                <w:rFonts w:ascii="Latha" w:hAnsi="Latha" w:cs="Latha"/>
+                <w:sz w:val="28"/>
+                <w:szCs w:val="28"/>
+                <w:cs/>
+                <w:lang w:bidi="ta-IN"/>
+              </w:rPr>
+              <w:t>வி</w:t>
+            </w:r>
+            <w:r>
+              <w:rPr>
+                <w:rFonts w:ascii="BRH Tamil Tab Extra" w:hAnsi="BRH Tamil Tab Extra" w:cs="Latha"/>
+                <w:b/>
+                <w:sz w:val="32"/>
+                <w:szCs w:val="28"/>
+                <w:highlight w:val="yellow"/>
+                <w:lang w:bidi="ta-IN"/>
+              </w:rPr>
+              <w:t>…</w:t>
+            </w:r>
+            <w:r>
+              <w:rPr>
+                <w:rFonts w:ascii="Latha" w:hAnsi="Latha" w:cs="Latha"/>
+                <w:sz w:val="28"/>
+                <w:szCs w:val="28"/>
+                <w:highlight w:val="yellow"/>
+                <w:cs/>
+                <w:lang w:bidi="ta-IN"/>
+              </w:rPr>
+              <w:t>த்யை</w:t>
+            </w:r>
+            <w:r>
+              <w:rPr>
+                <w:rFonts w:ascii="BRH Tamil Tab Extra" w:hAnsi="BRH Tamil Tab Extra" w:cs="Latha"/>
+                <w:b/>
+                <w:sz w:val="32"/>
+                <w:szCs w:val="28"/>
+                <w:lang w:bidi="ta-IN"/>
+              </w:rPr>
+              <w:t>…</w:t>
+            </w:r>
+            <w:r>
+              <w:rPr>
+                <w:rFonts w:ascii="Latha" w:hAnsi="Latha" w:cs="Latha"/>
+                <w:sz w:val="28"/>
+                <w:szCs w:val="28"/>
+                <w:lang w:bidi="ta-IN"/>
+              </w:rPr>
+              <w:t xml:space="preserve"> |</w:t>
+            </w:r>
+          </w:p>
+        </w:tc>
+        <w:tc>
+          <w:tcPr>
+            <w:tcW w:w="5386" w:type="dxa"/>
+          </w:tcPr>
+          <w:p>
+            <w:pPr>
+              <w:widowControl w:val="0"/>
+              <w:autoSpaceDE w:val="0"/>
+              <w:autoSpaceDN w:val="0"/>
+              <w:adjustRightInd w:val="0"/>
+              <w:spacing w:before="0" w:line="240" w:lineRule="auto"/>
+              <w:rPr>
+                <w:rFonts w:ascii="Latha" w:hAnsi="Latha" w:cs="Latha"/>
+                <w:sz w:val="28"/>
+                <w:szCs w:val="28"/>
+                <w:cs/>
+                <w:lang w:bidi="ta-IN"/>
+              </w:rPr>
+            </w:pPr>
+            <w:r>
+              <w:rPr>
+                <w:rFonts w:ascii="Latha" w:hAnsi="Latha" w:cs="Latha"/>
+                <w:sz w:val="28"/>
+                <w:szCs w:val="28"/>
+                <w:cs/>
+                <w:lang w:bidi="ta-IN"/>
+              </w:rPr>
+              <w:t>ப</w:t>
+            </w:r>
+            <w:r>
+              <w:rPr>
+                <w:rFonts w:ascii="BRH Tamil Tab Extra" w:hAnsi="BRH Tamil Tab Extra" w:cs="Latha"/>
+                <w:b/>
+                <w:sz w:val="32"/>
+                <w:szCs w:val="28"/>
+                <w:lang w:bidi="ta-IN"/>
+              </w:rPr>
+              <w:t>…</w:t>
+            </w:r>
+            <w:r>
+              <w:rPr>
+                <w:rFonts w:ascii="Latha" w:hAnsi="Latha" w:cs="Latha"/>
+                <w:b/>
+                <w:bCs/>
+                <w:position w:val="-12"/>
+                <w:sz w:val="28"/>
+                <w:szCs w:val="28"/>
+                <w:cs/>
+                <w:lang w:bidi="ta-IN"/>
+              </w:rPr>
+              <w:t>4</w:t>
+            </w:r>
+            <w:r>
+              <w:rPr>
+                <w:rFonts w:ascii="Latha" w:hAnsi="Latha" w:cs="Latha"/>
+                <w:sz w:val="28"/>
+                <w:szCs w:val="28"/>
+                <w:cs/>
+                <w:lang w:bidi="ta-IN"/>
+              </w:rPr>
+              <w:t>ர</w:t>
+            </w:r>
+            <w:r>
+              <w:rPr>
+                <w:rFonts w:ascii="BRH Tamil Tab Extra" w:hAnsi="BRH Tamil Tab Extra" w:cs="Latha"/>
+                <w:b/>
+                <w:sz w:val="32"/>
+                <w:szCs w:val="28"/>
+                <w:lang w:bidi="ta-IN"/>
+              </w:rPr>
+              <w:t>…</w:t>
+            </w:r>
+            <w:r>
+              <w:rPr>
+                <w:rFonts w:ascii="Latha" w:hAnsi="Latha" w:cs="Latha"/>
+                <w:sz w:val="28"/>
+                <w:szCs w:val="28"/>
+                <w:cs/>
+                <w:lang w:bidi="ta-IN"/>
+              </w:rPr>
+              <w:t>த்யனு</w:t>
+            </w:r>
+            <w:r>
+              <w:rPr>
+                <w:rFonts w:ascii="BRH Tamil Tab Extra" w:hAnsi="BRH Tamil Tab Extra" w:cs="Latha"/>
+                <w:b/>
+                <w:sz w:val="36"/>
+                <w:szCs w:val="28"/>
+                <w:lang w:bidi="ta-IN"/>
+              </w:rPr>
+              <w:t>†</w:t>
+            </w:r>
+            <w:r>
+              <w:rPr>
+                <w:rFonts w:ascii="Latha" w:hAnsi="Latha" w:cs="Latha"/>
+                <w:sz w:val="28"/>
+                <w:szCs w:val="28"/>
+                <w:cs/>
+                <w:lang w:bidi="ta-IN"/>
+              </w:rPr>
+              <w:t>வி</w:t>
+            </w:r>
+            <w:r>
+              <w:rPr>
+                <w:rFonts w:ascii="Latha" w:hAnsi="Latha" w:cs="Latha"/>
+                <w:sz w:val="28"/>
+                <w:szCs w:val="28"/>
+                <w:highlight w:val="green"/>
+                <w:cs/>
+                <w:lang w:bidi="ta-IN"/>
+              </w:rPr>
+              <w:t>த்த்யை</w:t>
+            </w:r>
+            <w:r>
+              <w:rPr>
+                <w:rFonts w:ascii="Latha" w:hAnsi="Latha" w:cs="Latha"/>
+                <w:sz w:val="28"/>
+                <w:szCs w:val="28"/>
+                <w:lang w:bidi="ta-IN"/>
+              </w:rPr>
+              <w:t xml:space="preserve"> | </w:t>
+            </w:r>
+            <w:r>
+              <w:rPr>
+                <w:rFonts w:ascii="Latha" w:hAnsi="Latha" w:cs="Latha"/>
+                <w:sz w:val="28"/>
+                <w:szCs w:val="28"/>
+                <w:cs/>
+                <w:lang w:bidi="ta-IN"/>
+              </w:rPr>
+              <w:t>அனு</w:t>
+            </w:r>
+            <w:r>
+              <w:rPr>
+                <w:rFonts w:ascii="BRH Tamil Tab Extra" w:hAnsi="BRH Tamil Tab Extra" w:cs="Latha"/>
+                <w:b/>
+                <w:sz w:val="36"/>
+                <w:szCs w:val="28"/>
+                <w:lang w:bidi="ta-IN"/>
+              </w:rPr>
+              <w:t>†</w:t>
+            </w:r>
+            <w:r>
+              <w:rPr>
+                <w:rFonts w:ascii="Latha" w:hAnsi="Latha" w:cs="Latha"/>
+                <w:sz w:val="28"/>
+                <w:szCs w:val="28"/>
+                <w:cs/>
+                <w:lang w:bidi="ta-IN"/>
+              </w:rPr>
+              <w:t>வி</w:t>
+            </w:r>
+            <w:r>
+              <w:rPr>
+                <w:rFonts w:ascii="Latha" w:hAnsi="Latha" w:cs="Latha"/>
+                <w:sz w:val="28"/>
+                <w:szCs w:val="28"/>
+                <w:highlight w:val="green"/>
+                <w:cs/>
+                <w:lang w:bidi="ta-IN"/>
+              </w:rPr>
+              <w:t>த்த்யை</w:t>
+            </w:r>
+            <w:r>
+              <w:rPr>
+                <w:rFonts w:ascii="Latha" w:hAnsi="Latha" w:cs="Latha"/>
+                <w:sz w:val="28"/>
+                <w:szCs w:val="28"/>
+                <w:lang w:bidi="ta-IN"/>
+              </w:rPr>
+              <w:t xml:space="preserve"> </w:t>
+            </w:r>
+            <w:r>
+              <w:rPr>
+                <w:rFonts w:ascii="Latha" w:hAnsi="Latha" w:cs="Latha"/>
+                <w:sz w:val="28"/>
+                <w:szCs w:val="28"/>
+                <w:cs/>
+                <w:lang w:bidi="ta-IN"/>
+              </w:rPr>
+              <w:t>பாபவஸ்ய</w:t>
+            </w:r>
+            <w:r>
+              <w:rPr>
+                <w:rFonts w:ascii="BRH Tamil Tab Extra" w:hAnsi="BRH Tamil Tab Extra" w:cs="Latha"/>
+                <w:b/>
+                <w:sz w:val="32"/>
+                <w:szCs w:val="28"/>
+                <w:lang w:bidi="ta-IN"/>
+              </w:rPr>
+              <w:t>…</w:t>
+            </w:r>
+            <w:r>
+              <w:rPr>
+                <w:rFonts w:ascii="Latha" w:hAnsi="Latha" w:cs="Latha"/>
+                <w:sz w:val="28"/>
+                <w:szCs w:val="28"/>
+                <w:cs/>
+                <w:lang w:bidi="ta-IN"/>
+              </w:rPr>
+              <w:t>ஸம்</w:t>
+            </w:r>
+            <w:r>
+              <w:rPr>
+                <w:rFonts w:ascii="Latha" w:hAnsi="Latha" w:cs="Latha"/>
+                <w:sz w:val="28"/>
+                <w:szCs w:val="28"/>
+                <w:lang w:bidi="ta-IN"/>
+              </w:rPr>
+              <w:t xml:space="preserve">| </w:t>
+            </w:r>
+            <w:r>
+              <w:rPr>
+                <w:rFonts w:ascii="Latha" w:hAnsi="Latha" w:cs="Latha"/>
+                <w:sz w:val="28"/>
+                <w:szCs w:val="28"/>
+                <w:cs/>
+                <w:lang w:bidi="ta-IN"/>
+              </w:rPr>
+              <w:t>அனு</w:t>
+            </w:r>
+            <w:r>
+              <w:rPr>
+                <w:rFonts w:ascii="BRH Tamil Tab Extra" w:hAnsi="BRH Tamil Tab Extra" w:cs="Latha"/>
+                <w:b/>
+                <w:sz w:val="36"/>
+                <w:szCs w:val="28"/>
+                <w:lang w:bidi="ta-IN"/>
+              </w:rPr>
+              <w:t>†</w:t>
+            </w:r>
+            <w:r>
+              <w:rPr>
+                <w:rFonts w:ascii="Latha" w:hAnsi="Latha" w:cs="Latha"/>
+                <w:sz w:val="28"/>
+                <w:szCs w:val="28"/>
+                <w:cs/>
+                <w:lang w:bidi="ta-IN"/>
+              </w:rPr>
+              <w:t>வி</w:t>
+            </w:r>
+            <w:r>
+              <w:rPr>
+                <w:rFonts w:ascii="Latha" w:hAnsi="Latha" w:cs="Latha"/>
+                <w:sz w:val="28"/>
+                <w:szCs w:val="28"/>
+                <w:highlight w:val="green"/>
+                <w:cs/>
+                <w:lang w:bidi="ta-IN"/>
+              </w:rPr>
+              <w:t>த்த்யா</w:t>
+            </w:r>
+            <w:r>
+              <w:rPr>
+                <w:rFonts w:ascii="BRH Tamil Tab Extra" w:hAnsi="BRH Tamil Tab Extra" w:cs="Latha"/>
+                <w:b/>
+                <w:sz w:val="32"/>
+                <w:szCs w:val="28"/>
+                <w:highlight w:val="green"/>
+                <w:lang w:bidi="ta-IN"/>
+              </w:rPr>
+              <w:t>…</w:t>
+            </w:r>
+            <w:r>
+              <w:rPr>
+                <w:rFonts w:ascii="Latha" w:hAnsi="Latha" w:cs="Latha"/>
+                <w:sz w:val="28"/>
+                <w:szCs w:val="28"/>
+                <w:lang w:bidi="ta-IN"/>
+              </w:rPr>
+              <w:t xml:space="preserve"> </w:t>
+            </w:r>
+            <w:r>
+              <w:rPr>
+                <w:rFonts w:ascii="Latha" w:hAnsi="Latha" w:cs="Latha"/>
+                <w:sz w:val="28"/>
+                <w:szCs w:val="28"/>
+                <w:cs/>
+                <w:lang w:bidi="ta-IN"/>
+              </w:rPr>
+              <w:t>இத்யனு</w:t>
+            </w:r>
+            <w:r>
+              <w:rPr>
+                <w:rFonts w:ascii="BRH Tamil Tab Extra" w:hAnsi="BRH Tamil Tab Extra" w:cs="Latha"/>
+                <w:b/>
+                <w:sz w:val="36"/>
+                <w:szCs w:val="28"/>
+                <w:lang w:bidi="ta-IN"/>
+              </w:rPr>
+              <w:t>†</w:t>
+            </w:r>
+            <w:r>
+              <w:rPr>
+                <w:rFonts w:ascii="Latha" w:hAnsi="Latha" w:cs="Latha"/>
+                <w:sz w:val="28"/>
+                <w:szCs w:val="28"/>
+                <w:lang w:bidi="ta-IN"/>
+              </w:rPr>
+              <w:t xml:space="preserve"> - </w:t>
+            </w:r>
+            <w:r>
+              <w:rPr>
+                <w:rFonts w:ascii="Latha" w:hAnsi="Latha" w:cs="Latha"/>
+                <w:sz w:val="28"/>
+                <w:szCs w:val="28"/>
+                <w:cs/>
+                <w:lang w:bidi="ta-IN"/>
+              </w:rPr>
+              <w:t>வி</w:t>
+            </w:r>
+            <w:r>
+              <w:rPr>
+                <w:rFonts w:ascii="BRH Tamil Tab Extra" w:hAnsi="BRH Tamil Tab Extra" w:cs="Latha"/>
+                <w:b/>
+                <w:sz w:val="32"/>
+                <w:szCs w:val="28"/>
+                <w:highlight w:val="green"/>
+                <w:lang w:bidi="ta-IN"/>
+              </w:rPr>
+              <w:t>…</w:t>
+            </w:r>
+            <w:r>
+              <w:rPr>
+                <w:rFonts w:ascii="Latha" w:hAnsi="Latha" w:cs="Latha"/>
+                <w:sz w:val="28"/>
+                <w:szCs w:val="28"/>
+                <w:highlight w:val="green"/>
+                <w:cs/>
+                <w:lang w:bidi="ta-IN"/>
+              </w:rPr>
+              <w:t>த்த்யை</w:t>
+            </w:r>
+            <w:r>
+              <w:rPr>
+                <w:rFonts w:ascii="BRH Tamil Tab Extra" w:hAnsi="BRH Tamil Tab Extra" w:cs="Latha"/>
+                <w:b/>
+                <w:sz w:val="32"/>
+                <w:szCs w:val="28"/>
+                <w:highlight w:val="green"/>
+                <w:lang w:bidi="ta-IN"/>
+              </w:rPr>
+              <w:t>…</w:t>
+            </w:r>
+            <w:r>
+              <w:rPr>
+                <w:rFonts w:ascii="Latha" w:hAnsi="Latha" w:cs="Latha"/>
+                <w:sz w:val="28"/>
+                <w:szCs w:val="28"/>
+                <w:lang w:bidi="ta-IN"/>
+              </w:rPr>
+              <w:t xml:space="preserve"> |</w:t>
+            </w:r>
+          </w:p>
+        </w:tc>
+      </w:tr>
+      <w:tr>
+        <w:trPr>
+          <w:trHeight w:val="962"/>
+        </w:trPr>
+        <w:tc>
+          <w:tcPr>
+            <w:tcW w:w="3764" w:type="dxa"/>
+          </w:tcPr>
+          <w:p>
+            <w:pPr>
+              <w:widowControl w:val="0"/>
+              <w:tabs>
+                <w:tab w:val="left" w:pos="993"/>
+              </w:tabs>
+              <w:autoSpaceDE w:val="0"/>
+              <w:autoSpaceDN w:val="0"/>
+              <w:adjustRightInd w:val="0"/>
+              <w:spacing w:before="0" w:line="252" w:lineRule="auto"/>
+              <w:ind w:right="297"/>
+              <w:rPr>
+                <w:rFonts w:cs="Arial"/>
+                <w:b/>
+                <w:color w:val="000000"/>
+                <w:sz w:val="28"/>
+                <w:szCs w:val="28"/>
+              </w:rPr>
+            </w:pPr>
+            <w:r>
+              <w:rPr>
+                <w:rFonts w:cs="Arial"/>
+                <w:b/>
+                <w:color w:val="000000"/>
+                <w:sz w:val="28"/>
+                <w:szCs w:val="28"/>
+              </w:rPr>
+              <w:t>T.S.5.1.2.</w:t>
+            </w:r>
+            <w:r>
+              <w:rPr>
+                <w:rFonts w:cs="Arial"/>
+                <w:b/>
+                <w:color w:val="000000"/>
+                <w:sz w:val="28"/>
+                <w:szCs w:val="28"/>
+              </w:rPr>
+              <w:t>4</w:t>
+            </w:r>
+            <w:r>
+              <w:rPr>
+                <w:rFonts w:cs="Arial"/>
+                <w:b/>
+                <w:color w:val="000000"/>
+                <w:sz w:val="28"/>
+                <w:szCs w:val="28"/>
+              </w:rPr>
+              <w:t xml:space="preserve"> – Kramam</w:t>
+            </w:r>
+          </w:p>
+          <w:p>
+            <w:pPr>
+              <w:widowControl w:val="0"/>
+              <w:tabs>
+                <w:tab w:val="left" w:pos="993"/>
+              </w:tabs>
+              <w:autoSpaceDE w:val="0"/>
+              <w:autoSpaceDN w:val="0"/>
+              <w:adjustRightInd w:val="0"/>
+              <w:spacing w:before="0" w:line="252" w:lineRule="auto"/>
+              <w:ind w:right="297"/>
+              <w:rPr>
+                <w:rFonts w:cs="Arial"/>
+                <w:b/>
+                <w:color w:val="000000"/>
+                <w:sz w:val="28"/>
+                <w:szCs w:val="28"/>
+              </w:rPr>
+            </w:pPr>
+            <w:r>
+              <w:rPr>
+                <w:rFonts w:cs="Arial"/>
+                <w:b/>
+                <w:color w:val="000000"/>
+                <w:sz w:val="28"/>
+                <w:szCs w:val="28"/>
+              </w:rPr>
+              <w:t xml:space="preserve">Krama Vaakyam No.– </w:t>
+            </w:r>
+            <w:r>
+              <w:rPr>
+                <w:rFonts w:cs="Arial"/>
+                <w:b/>
+                <w:color w:val="000000"/>
+                <w:sz w:val="28"/>
+                <w:szCs w:val="28"/>
+              </w:rPr>
+              <w:t>2</w:t>
+            </w:r>
+          </w:p>
+          <w:p>
+            <w:pPr>
+              <w:widowControl w:val="0"/>
+              <w:tabs>
+                <w:tab w:val="left" w:pos="993"/>
+              </w:tabs>
+              <w:autoSpaceDE w:val="0"/>
+              <w:autoSpaceDN w:val="0"/>
+              <w:adjustRightInd w:val="0"/>
+              <w:spacing w:before="0" w:line="252" w:lineRule="auto"/>
+              <w:ind w:right="297"/>
+              <w:rPr>
+                <w:rFonts w:cs="Arial"/>
+                <w:b/>
+                <w:color w:val="000000"/>
+                <w:sz w:val="28"/>
+                <w:szCs w:val="28"/>
+              </w:rPr>
+            </w:pPr>
+            <w:r>
+              <w:rPr>
+                <w:rFonts w:cs="Arial"/>
+                <w:b/>
+                <w:color w:val="000000"/>
+                <w:sz w:val="28"/>
+                <w:szCs w:val="28"/>
+              </w:rPr>
+              <w:t xml:space="preserve">Panchaati No. - </w:t>
+            </w:r>
+            <w:r>
+              <w:rPr>
+                <w:rFonts w:cs="Arial"/>
+                <w:b/>
+                <w:color w:val="000000"/>
+                <w:sz w:val="28"/>
+                <w:szCs w:val="28"/>
+              </w:rPr>
+              <w:t>8</w:t>
+            </w:r>
+          </w:p>
+        </w:tc>
+        <w:tc>
+          <w:tcPr>
+            <w:tcW w:w="5245" w:type="dxa"/>
+          </w:tcPr>
+          <w:p>
+            <w:pPr>
+              <w:widowControl w:val="0"/>
+              <w:autoSpaceDE w:val="0"/>
+              <w:autoSpaceDN w:val="0"/>
+              <w:adjustRightInd w:val="0"/>
+              <w:spacing w:before="0" w:line="240" w:lineRule="auto"/>
+              <w:rPr>
+                <w:rFonts w:ascii="Latha" w:hAnsi="Latha" w:cs="Latha"/>
+                <w:sz w:val="28"/>
+                <w:szCs w:val="28"/>
+                <w:cs/>
+                <w:lang w:bidi="ta-IN"/>
+              </w:rPr>
+            </w:pPr>
+            <w:r>
+              <w:rPr>
+                <w:rFonts w:ascii="Latha" w:hAnsi="Latha" w:cs="Latha"/>
+                <w:sz w:val="28"/>
+                <w:szCs w:val="28"/>
+                <w:cs/>
+                <w:lang w:bidi="ta-IN"/>
+              </w:rPr>
+              <w:t>ஏ</w:t>
+            </w:r>
+            <w:r>
+              <w:rPr>
+                <w:rFonts w:ascii="BRH Tamil Tab Extra" w:hAnsi="BRH Tamil Tab Extra" w:cs="Latha"/>
+                <w:b/>
+                <w:sz w:val="32"/>
+                <w:szCs w:val="28"/>
+                <w:lang w:bidi="ta-IN"/>
+              </w:rPr>
+              <w:t>…</w:t>
+            </w:r>
+            <w:r>
+              <w:rPr>
+                <w:rFonts w:ascii="Latha" w:hAnsi="Latha" w:cs="Latha"/>
+                <w:sz w:val="28"/>
+                <w:szCs w:val="28"/>
+                <w:cs/>
+                <w:lang w:bidi="ta-IN"/>
+              </w:rPr>
+              <w:t>வ</w:t>
+            </w:r>
+            <w:r>
+              <w:rPr>
+                <w:rFonts w:ascii="Latha" w:hAnsi="Latha" w:cs="Latha"/>
+                <w:sz w:val="28"/>
+                <w:szCs w:val="28"/>
+                <w:lang w:bidi="ta-IN"/>
+              </w:rPr>
+              <w:t xml:space="preserve"> </w:t>
+            </w:r>
+            <w:r>
+              <w:rPr>
+                <w:rFonts w:ascii="Latha" w:hAnsi="Latha" w:cs="Latha"/>
+                <w:sz w:val="28"/>
+                <w:szCs w:val="28"/>
+                <w:cs/>
+                <w:lang w:bidi="ta-IN"/>
+              </w:rPr>
+              <w:t>ப</w:t>
+            </w:r>
+            <w:r>
+              <w:rPr>
+                <w:rFonts w:ascii="BRH Tamil Tab Extra" w:hAnsi="BRH Tamil Tab Extra" w:cs="Latha"/>
+                <w:b/>
+                <w:sz w:val="32"/>
+                <w:szCs w:val="28"/>
+                <w:lang w:bidi="ta-IN"/>
+              </w:rPr>
+              <w:t>…</w:t>
+            </w:r>
+            <w:r>
+              <w:rPr>
+                <w:rFonts w:ascii="Latha" w:hAnsi="Latha" w:cs="Latha"/>
+                <w:sz w:val="28"/>
+                <w:szCs w:val="28"/>
+                <w:cs/>
+                <w:lang w:bidi="ta-IN"/>
+              </w:rPr>
+              <w:t>ஶூன்</w:t>
+            </w:r>
+            <w:r>
+              <w:rPr>
+                <w:rFonts w:ascii="Latha" w:hAnsi="Latha" w:cs="Latha"/>
+                <w:sz w:val="28"/>
+                <w:szCs w:val="28"/>
+                <w:lang w:bidi="ta-IN"/>
+              </w:rPr>
+              <w:t xml:space="preserve"> | </w:t>
+            </w:r>
+            <w:r>
+              <w:rPr>
+                <w:rFonts w:ascii="Latha" w:hAnsi="Latha" w:cs="Latha"/>
+                <w:sz w:val="28"/>
+                <w:szCs w:val="28"/>
+                <w:lang w:bidi="ta-IN"/>
+              </w:rPr>
+              <w:br/>
+            </w:r>
+            <w:r>
+              <w:rPr>
+                <w:rFonts w:ascii="Latha" w:hAnsi="Latha" w:cs="Latha"/>
+                <w:sz w:val="28"/>
+                <w:szCs w:val="28"/>
+                <w:cs/>
+                <w:lang w:bidi="ta-IN"/>
+              </w:rPr>
+              <w:t>ப</w:t>
+            </w:r>
+            <w:r>
+              <w:rPr>
+                <w:rFonts w:ascii="BRH Tamil Tab Extra" w:hAnsi="BRH Tamil Tab Extra" w:cs="Latha"/>
+                <w:b/>
+                <w:sz w:val="32"/>
+                <w:szCs w:val="28"/>
+                <w:highlight w:val="yellow"/>
+                <w:lang w:bidi="ta-IN"/>
+              </w:rPr>
+              <w:t>…</w:t>
+            </w:r>
+            <w:r>
+              <w:rPr>
+                <w:rFonts w:ascii="Latha" w:hAnsi="Latha" w:cs="Latha"/>
+                <w:sz w:val="28"/>
+                <w:szCs w:val="28"/>
+                <w:highlight w:val="yellow"/>
+                <w:cs/>
+                <w:lang w:bidi="ta-IN"/>
+              </w:rPr>
+              <w:t>ஶ</w:t>
+            </w:r>
+            <w:r>
+              <w:rPr>
+                <w:rFonts w:ascii="Latha" w:hAnsi="Latha" w:cs="Latha" w:hint="cs"/>
+                <w:sz w:val="28"/>
+                <w:szCs w:val="28"/>
+                <w:highlight w:val="yellow"/>
+                <w:cs/>
+                <w:lang w:bidi="ta-IN"/>
+              </w:rPr>
+              <w:t>ு</w:t>
+            </w:r>
+            <w:r>
+              <w:rPr>
+                <w:rFonts w:ascii="Latha" w:hAnsi="Latha" w:cs="Latha"/>
+                <w:sz w:val="28"/>
+                <w:szCs w:val="28"/>
+                <w:cs/>
+                <w:lang w:bidi="ta-IN"/>
+              </w:rPr>
+              <w:t>ன்</w:t>
+            </w:r>
+            <w:r>
+              <w:rPr>
+                <w:rFonts w:ascii="Latha" w:hAnsi="Latha" w:cs="Latha"/>
+                <w:sz w:val="28"/>
+                <w:szCs w:val="28"/>
+                <w:lang w:bidi="ta-IN"/>
+              </w:rPr>
+              <w:t xml:space="preserve"> </w:t>
+            </w:r>
+            <w:r>
+              <w:rPr>
+                <w:rFonts w:ascii="Latha" w:hAnsi="Latha" w:cs="Latha"/>
+                <w:sz w:val="28"/>
+                <w:szCs w:val="28"/>
+                <w:cs/>
+                <w:lang w:bidi="ta-IN"/>
+              </w:rPr>
+              <w:t>நி</w:t>
+            </w:r>
+            <w:r>
+              <w:rPr>
+                <w:rFonts w:ascii="BRH Tamil Tab Extra" w:hAnsi="BRH Tamil Tab Extra" w:cs="Latha"/>
+                <w:b/>
+                <w:sz w:val="32"/>
+                <w:szCs w:val="28"/>
+                <w:lang w:bidi="ta-IN"/>
+              </w:rPr>
+              <w:t>…</w:t>
+            </w:r>
+            <w:r>
+              <w:rPr>
+                <w:rFonts w:ascii="Latha" w:hAnsi="Latha" w:cs="Latha"/>
+                <w:sz w:val="28"/>
+                <w:szCs w:val="28"/>
+                <w:cs/>
+                <w:lang w:bidi="ta-IN"/>
+              </w:rPr>
+              <w:t>ர்யாச்ய</w:t>
+            </w:r>
+            <w:r>
+              <w:rPr>
+                <w:rFonts w:ascii="BRH Tamil Tab Extra" w:hAnsi="BRH Tamil Tab Extra" w:cs="Latha"/>
+                <w:b/>
+                <w:sz w:val="36"/>
+                <w:szCs w:val="28"/>
+                <w:lang w:bidi="ta-IN"/>
+              </w:rPr>
+              <w:t>†</w:t>
+            </w:r>
+            <w:r>
+              <w:rPr>
+                <w:rFonts w:ascii="Latha" w:hAnsi="Latha" w:cs="Latha"/>
+                <w:sz w:val="28"/>
+                <w:szCs w:val="28"/>
+                <w:lang w:bidi="ta-IN"/>
+              </w:rPr>
+              <w:t xml:space="preserve"> |</w:t>
+            </w:r>
+          </w:p>
+        </w:tc>
+        <w:tc>
+          <w:tcPr>
+            <w:tcW w:w="5386" w:type="dxa"/>
+          </w:tcPr>
+          <w:p>
+            <w:pPr>
+              <w:widowControl w:val="0"/>
+              <w:autoSpaceDE w:val="0"/>
+              <w:autoSpaceDN w:val="0"/>
+              <w:adjustRightInd w:val="0"/>
+              <w:spacing w:before="0" w:line="240" w:lineRule="auto"/>
+              <w:rPr>
+                <w:rFonts w:ascii="Latha" w:hAnsi="Latha" w:cs="Latha"/>
+                <w:sz w:val="28"/>
+                <w:szCs w:val="28"/>
+                <w:cs/>
+                <w:lang w:bidi="ta-IN"/>
+              </w:rPr>
+            </w:pPr>
+            <w:r>
+              <w:rPr>
+                <w:rFonts w:ascii="Latha" w:hAnsi="Latha" w:cs="Latha"/>
+                <w:sz w:val="28"/>
+                <w:szCs w:val="28"/>
+                <w:cs/>
+                <w:lang w:bidi="ta-IN"/>
+              </w:rPr>
+              <w:t>ஏ</w:t>
+            </w:r>
+            <w:r>
+              <w:rPr>
+                <w:rFonts w:ascii="BRH Tamil Tab Extra" w:hAnsi="BRH Tamil Tab Extra" w:cs="Latha"/>
+                <w:b/>
+                <w:sz w:val="32"/>
+                <w:szCs w:val="28"/>
+                <w:lang w:bidi="ta-IN"/>
+              </w:rPr>
+              <w:t>…</w:t>
+            </w:r>
+            <w:r>
+              <w:rPr>
+                <w:rFonts w:ascii="Latha" w:hAnsi="Latha" w:cs="Latha"/>
+                <w:sz w:val="28"/>
+                <w:szCs w:val="28"/>
+                <w:cs/>
+                <w:lang w:bidi="ta-IN"/>
+              </w:rPr>
+              <w:t>வ</w:t>
+            </w:r>
+            <w:r>
+              <w:rPr>
+                <w:rFonts w:ascii="Latha" w:hAnsi="Latha" w:cs="Latha"/>
+                <w:sz w:val="28"/>
+                <w:szCs w:val="28"/>
+                <w:lang w:bidi="ta-IN"/>
+              </w:rPr>
+              <w:t xml:space="preserve"> </w:t>
+            </w:r>
+            <w:r>
+              <w:rPr>
+                <w:rFonts w:ascii="Latha" w:hAnsi="Latha" w:cs="Latha"/>
+                <w:sz w:val="28"/>
+                <w:szCs w:val="28"/>
+                <w:cs/>
+                <w:lang w:bidi="ta-IN"/>
+              </w:rPr>
+              <w:t>ப</w:t>
+            </w:r>
+            <w:r>
+              <w:rPr>
+                <w:rFonts w:ascii="BRH Tamil Tab Extra" w:hAnsi="BRH Tamil Tab Extra" w:cs="Latha"/>
+                <w:b/>
+                <w:sz w:val="32"/>
+                <w:szCs w:val="28"/>
+                <w:lang w:bidi="ta-IN"/>
+              </w:rPr>
+              <w:t>…</w:t>
+            </w:r>
+            <w:r>
+              <w:rPr>
+                <w:rFonts w:ascii="Latha" w:hAnsi="Latha" w:cs="Latha"/>
+                <w:sz w:val="28"/>
+                <w:szCs w:val="28"/>
+                <w:cs/>
+                <w:lang w:bidi="ta-IN"/>
+              </w:rPr>
+              <w:t>ஶூன்</w:t>
+            </w:r>
+            <w:r>
+              <w:rPr>
+                <w:rFonts w:ascii="Latha" w:hAnsi="Latha" w:cs="Latha"/>
+                <w:sz w:val="28"/>
+                <w:szCs w:val="28"/>
+                <w:lang w:bidi="ta-IN"/>
+              </w:rPr>
+              <w:t xml:space="preserve"> | </w:t>
+            </w:r>
+            <w:r>
+              <w:rPr>
+                <w:rFonts w:ascii="Latha" w:hAnsi="Latha" w:cs="Latha"/>
+                <w:sz w:val="28"/>
+                <w:szCs w:val="28"/>
+                <w:cs/>
+                <w:lang w:bidi="ta-IN"/>
+              </w:rPr>
+              <w:br/>
+            </w:r>
+            <w:r>
+              <w:rPr>
+                <w:rFonts w:ascii="Latha" w:hAnsi="Latha" w:cs="Latha"/>
+                <w:sz w:val="28"/>
+                <w:szCs w:val="28"/>
+                <w:cs/>
+                <w:lang w:bidi="ta-IN"/>
+              </w:rPr>
+              <w:t>ப</w:t>
+            </w:r>
+            <w:r>
+              <w:rPr>
+                <w:rFonts w:ascii="BRH Tamil Tab Extra" w:hAnsi="BRH Tamil Tab Extra" w:cs="Latha"/>
+                <w:b/>
+                <w:sz w:val="32"/>
+                <w:szCs w:val="28"/>
+                <w:lang w:bidi="ta-IN"/>
+              </w:rPr>
+              <w:t>…</w:t>
+            </w:r>
+            <w:r>
+              <w:rPr>
+                <w:rFonts w:ascii="Latha" w:hAnsi="Latha" w:cs="Latha"/>
+                <w:sz w:val="28"/>
+                <w:szCs w:val="28"/>
+                <w:highlight w:val="green"/>
+                <w:cs/>
+                <w:lang w:bidi="ta-IN"/>
+              </w:rPr>
+              <w:t>ஶூ</w:t>
+            </w:r>
+            <w:r>
+              <w:rPr>
+                <w:rFonts w:ascii="Latha" w:hAnsi="Latha" w:cs="Latha"/>
+                <w:sz w:val="28"/>
+                <w:szCs w:val="28"/>
+                <w:cs/>
+                <w:lang w:bidi="ta-IN"/>
+              </w:rPr>
+              <w:t>ன்</w:t>
+            </w:r>
+            <w:r>
+              <w:rPr>
+                <w:rFonts w:ascii="Latha" w:hAnsi="Latha" w:cs="Latha"/>
+                <w:sz w:val="28"/>
+                <w:szCs w:val="28"/>
+                <w:lang w:bidi="ta-IN"/>
+              </w:rPr>
+              <w:t xml:space="preserve"> </w:t>
+            </w:r>
+            <w:r>
+              <w:rPr>
+                <w:rFonts w:ascii="Latha" w:hAnsi="Latha" w:cs="Latha"/>
+                <w:sz w:val="28"/>
+                <w:szCs w:val="28"/>
+                <w:cs/>
+                <w:lang w:bidi="ta-IN"/>
+              </w:rPr>
+              <w:t>நி</w:t>
+            </w:r>
+            <w:r>
+              <w:rPr>
+                <w:rFonts w:ascii="BRH Tamil Tab Extra" w:hAnsi="BRH Tamil Tab Extra" w:cs="Latha"/>
+                <w:b/>
+                <w:sz w:val="32"/>
+                <w:szCs w:val="28"/>
+                <w:lang w:bidi="ta-IN"/>
+              </w:rPr>
+              <w:t>…</w:t>
+            </w:r>
+            <w:r>
+              <w:rPr>
+                <w:rFonts w:ascii="Latha" w:hAnsi="Latha" w:cs="Latha"/>
+                <w:sz w:val="28"/>
+                <w:szCs w:val="28"/>
+                <w:cs/>
+                <w:lang w:bidi="ta-IN"/>
+              </w:rPr>
+              <w:t>ர்யாச்ய</w:t>
+            </w:r>
+            <w:r>
+              <w:rPr>
+                <w:rFonts w:ascii="BRH Tamil Tab Extra" w:hAnsi="BRH Tamil Tab Extra" w:cs="Latha"/>
+                <w:b/>
+                <w:sz w:val="36"/>
+                <w:szCs w:val="28"/>
+                <w:lang w:bidi="ta-IN"/>
+              </w:rPr>
+              <w:t>†</w:t>
+            </w:r>
+            <w:r>
+              <w:rPr>
+                <w:rFonts w:ascii="Latha" w:hAnsi="Latha" w:cs="Latha"/>
+                <w:sz w:val="28"/>
+                <w:szCs w:val="28"/>
+                <w:lang w:bidi="ta-IN"/>
+              </w:rPr>
+              <w:t xml:space="preserve"> |</w:t>
+            </w:r>
+          </w:p>
+        </w:tc>
+      </w:tr>
+      <w:tr>
+        <w:trPr>
+          <w:trHeight w:val="962"/>
+        </w:trPr>
+        <w:tc>
+          <w:tcPr>
+            <w:tcW w:w="3764" w:type="dxa"/>
+          </w:tcPr>
+          <w:p>
+            <w:pPr>
+              <w:widowControl w:val="0"/>
+              <w:tabs>
+                <w:tab w:val="left" w:pos="993"/>
+              </w:tabs>
+              <w:autoSpaceDE w:val="0"/>
+              <w:autoSpaceDN w:val="0"/>
+              <w:adjustRightInd w:val="0"/>
+              <w:spacing w:before="0" w:line="252" w:lineRule="auto"/>
+              <w:ind w:right="297"/>
+              <w:rPr>
+                <w:rFonts w:cs="Arial"/>
+                <w:b/>
+                <w:color w:val="000000"/>
+                <w:sz w:val="28"/>
+                <w:szCs w:val="28"/>
+              </w:rPr>
+            </w:pPr>
+            <w:r>
+              <w:rPr>
+                <w:rFonts w:cs="Arial"/>
+                <w:b/>
+                <w:color w:val="000000"/>
+                <w:sz w:val="28"/>
+                <w:szCs w:val="28"/>
+              </w:rPr>
+              <w:t>T.S.5.1.2.</w:t>
+            </w:r>
+            <w:r>
+              <w:rPr>
+                <w:rFonts w:cs="Arial"/>
+                <w:b/>
+                <w:color w:val="000000"/>
+                <w:sz w:val="28"/>
+                <w:szCs w:val="28"/>
+              </w:rPr>
+              <w:t>4</w:t>
+            </w:r>
+            <w:r>
+              <w:rPr>
+                <w:rFonts w:cs="Arial"/>
+                <w:b/>
+                <w:color w:val="000000"/>
+                <w:sz w:val="28"/>
+                <w:szCs w:val="28"/>
+              </w:rPr>
+              <w:t xml:space="preserve"> – Kramam</w:t>
+            </w:r>
+          </w:p>
+          <w:p>
+            <w:pPr>
+              <w:widowControl w:val="0"/>
+              <w:tabs>
+                <w:tab w:val="left" w:pos="993"/>
+              </w:tabs>
+              <w:autoSpaceDE w:val="0"/>
+              <w:autoSpaceDN w:val="0"/>
+              <w:adjustRightInd w:val="0"/>
+              <w:spacing w:before="0" w:line="252" w:lineRule="auto"/>
+              <w:ind w:right="297"/>
+              <w:rPr>
+                <w:rFonts w:cstheme="minorBidi" w:hint="cs"/>
+                <w:b/>
+                <w:color w:val="000000"/>
+                <w:sz w:val="28"/>
+                <w:szCs w:val="28"/>
+                <w:lang w:val="en-IN" w:bidi="ta-IN"/>
+              </w:rPr>
+            </w:pPr>
+            <w:r>
+              <w:rPr>
+                <w:rFonts w:cs="Arial"/>
+                <w:b/>
+                <w:color w:val="000000"/>
+                <w:sz w:val="28"/>
+                <w:szCs w:val="28"/>
+              </w:rPr>
+              <w:t xml:space="preserve">Krama Vaakyam No.– </w:t>
+            </w:r>
+            <w:r>
+              <w:rPr>
+                <w:rFonts w:cs="Arial"/>
+                <w:b/>
+                <w:color w:val="000000"/>
+                <w:sz w:val="28"/>
+                <w:szCs w:val="28"/>
+                <w:lang w:val="en-IN"/>
+              </w:rPr>
+              <w:t>41</w:t>
+            </w:r>
+          </w:p>
+          <w:p>
+            <w:pPr>
+              <w:widowControl w:val="0"/>
+              <w:tabs>
+                <w:tab w:val="left" w:pos="993"/>
+              </w:tabs>
+              <w:autoSpaceDE w:val="0"/>
+              <w:autoSpaceDN w:val="0"/>
+              <w:adjustRightInd w:val="0"/>
+              <w:spacing w:before="0" w:line="252" w:lineRule="auto"/>
+              <w:ind w:right="297"/>
+              <w:rPr>
+                <w:rFonts w:cs="Arial"/>
+                <w:b/>
+                <w:color w:val="000000"/>
+                <w:sz w:val="28"/>
+                <w:szCs w:val="28"/>
+              </w:rPr>
+            </w:pPr>
+            <w:r>
+              <w:rPr>
+                <w:rFonts w:cs="Arial"/>
+                <w:b/>
+                <w:color w:val="000000"/>
+                <w:sz w:val="28"/>
+                <w:szCs w:val="28"/>
+              </w:rPr>
+              <w:t xml:space="preserve">Panchaati No. - </w:t>
+            </w:r>
+            <w:r>
+              <w:rPr>
+                <w:rFonts w:cs="Arial"/>
+                <w:b/>
+                <w:color w:val="000000"/>
+                <w:sz w:val="28"/>
+                <w:szCs w:val="28"/>
+              </w:rPr>
+              <w:t>8</w:t>
+            </w:r>
+          </w:p>
+        </w:tc>
+        <w:tc>
+          <w:tcPr>
+            <w:tcW w:w="5245" w:type="dxa"/>
+          </w:tcPr>
+          <w:p>
+            <w:pPr>
+              <w:widowControl w:val="0"/>
+              <w:autoSpaceDE w:val="0"/>
+              <w:autoSpaceDN w:val="0"/>
+              <w:adjustRightInd w:val="0"/>
+              <w:spacing w:before="0" w:line="240" w:lineRule="auto"/>
+              <w:rPr>
+                <w:rFonts w:ascii="Latha" w:hAnsi="Latha" w:cs="Latha"/>
+                <w:sz w:val="28"/>
+                <w:szCs w:val="28"/>
+                <w:cs/>
+                <w:lang w:bidi="ta-IN"/>
+              </w:rPr>
+            </w:pPr>
+            <w:r>
+              <w:rPr>
+                <w:rFonts w:ascii="Latha" w:hAnsi="Latha" w:cs="Latha"/>
+                <w:sz w:val="28"/>
+                <w:szCs w:val="28"/>
+                <w:cs/>
+                <w:lang w:bidi="ta-IN"/>
+              </w:rPr>
+              <w:t>அச்சே</w:t>
+            </w:r>
+            <w:r>
+              <w:rPr>
+                <w:rFonts w:ascii="BRH Tamil Tab Extra" w:hAnsi="BRH Tamil Tab Extra" w:cs="Latha"/>
+                <w:b/>
+                <w:sz w:val="36"/>
+                <w:szCs w:val="28"/>
+                <w:lang w:bidi="ta-IN"/>
+              </w:rPr>
+              <w:t>†</w:t>
+            </w:r>
+            <w:r>
+              <w:rPr>
+                <w:rFonts w:ascii="Latha" w:hAnsi="Latha" w:cs="Latha"/>
+                <w:b/>
+                <w:bCs/>
+                <w:position w:val="-12"/>
+                <w:sz w:val="28"/>
+                <w:szCs w:val="28"/>
+                <w:cs/>
+                <w:lang w:bidi="ta-IN"/>
+              </w:rPr>
+              <w:t>2</w:t>
+            </w:r>
+            <w:r>
+              <w:rPr>
+                <w:rFonts w:ascii="Latha" w:hAnsi="Latha" w:cs="Latha"/>
+                <w:sz w:val="28"/>
+                <w:szCs w:val="28"/>
+                <w:cs/>
+                <w:lang w:bidi="ta-IN"/>
+              </w:rPr>
+              <w:t>ஹி</w:t>
+            </w:r>
+            <w:r>
+              <w:rPr>
+                <w:rFonts w:ascii="Latha" w:hAnsi="Latha" w:cs="Latha"/>
+                <w:sz w:val="28"/>
+                <w:szCs w:val="28"/>
+                <w:lang w:bidi="ta-IN"/>
+              </w:rPr>
+              <w:t xml:space="preserve"> | </w:t>
+            </w:r>
+            <w:r>
+              <w:rPr>
+                <w:rFonts w:ascii="Latha" w:hAnsi="Latha" w:cs="Latha"/>
+                <w:sz w:val="28"/>
+                <w:szCs w:val="28"/>
+                <w:highlight w:val="yellow"/>
+                <w:cs/>
+                <w:lang w:bidi="ta-IN"/>
+              </w:rPr>
+              <w:t>ஏஹீதி</w:t>
+            </w:r>
+            <w:r>
+              <w:rPr>
+                <w:rFonts w:ascii="BRH Tamil Tab Extra" w:hAnsi="BRH Tamil Tab Extra" w:cs="Latha"/>
+                <w:b/>
+                <w:sz w:val="36"/>
+                <w:szCs w:val="28"/>
+                <w:lang w:bidi="ta-IN"/>
+              </w:rPr>
+              <w:t>†</w:t>
+            </w:r>
+            <w:r>
+              <w:rPr>
+                <w:rFonts w:ascii="Latha" w:hAnsi="Latha" w:cs="Latha"/>
+                <w:sz w:val="28"/>
+                <w:szCs w:val="28"/>
+                <w:lang w:bidi="ta-IN"/>
+              </w:rPr>
+              <w:t xml:space="preserve"> |</w:t>
+            </w:r>
+          </w:p>
+        </w:tc>
+        <w:tc>
+          <w:tcPr>
+            <w:tcW w:w="5386" w:type="dxa"/>
+          </w:tcPr>
+          <w:p>
+            <w:pPr>
+              <w:widowControl w:val="0"/>
+              <w:autoSpaceDE w:val="0"/>
+              <w:autoSpaceDN w:val="0"/>
+              <w:adjustRightInd w:val="0"/>
+              <w:spacing w:before="0" w:line="240" w:lineRule="auto"/>
+              <w:rPr>
+                <w:rFonts w:ascii="Latha" w:hAnsi="Latha" w:cs="Latha"/>
+                <w:sz w:val="28"/>
+                <w:szCs w:val="28"/>
+                <w:cs/>
+                <w:lang w:bidi="ta-IN"/>
+              </w:rPr>
+            </w:pPr>
+            <w:r>
+              <w:rPr>
+                <w:rFonts w:ascii="Latha" w:hAnsi="Latha" w:cs="Latha"/>
+                <w:sz w:val="28"/>
+                <w:szCs w:val="28"/>
+                <w:cs/>
+                <w:lang w:bidi="ta-IN"/>
+              </w:rPr>
+              <w:t>அச்சே</w:t>
+            </w:r>
+            <w:r>
+              <w:rPr>
+                <w:rFonts w:ascii="BRH Tamil Tab Extra" w:hAnsi="BRH Tamil Tab Extra" w:cs="Latha"/>
+                <w:b/>
+                <w:sz w:val="36"/>
+                <w:szCs w:val="28"/>
+                <w:lang w:bidi="ta-IN"/>
+              </w:rPr>
+              <w:t>†</w:t>
+            </w:r>
+            <w:r>
+              <w:rPr>
+                <w:rFonts w:ascii="Latha" w:hAnsi="Latha" w:cs="Latha"/>
+                <w:b/>
+                <w:bCs/>
+                <w:position w:val="-12"/>
+                <w:sz w:val="28"/>
+                <w:szCs w:val="28"/>
+                <w:cs/>
+                <w:lang w:bidi="ta-IN"/>
+              </w:rPr>
+              <w:t>2</w:t>
+            </w:r>
+            <w:r>
+              <w:rPr>
+                <w:rFonts w:ascii="Latha" w:hAnsi="Latha" w:cs="Latha"/>
+                <w:sz w:val="28"/>
+                <w:szCs w:val="28"/>
+                <w:cs/>
+                <w:lang w:bidi="ta-IN"/>
+              </w:rPr>
+              <w:t>ஹி</w:t>
+            </w:r>
+            <w:r>
+              <w:rPr>
+                <w:rFonts w:ascii="Latha" w:hAnsi="Latha" w:cs="Latha"/>
+                <w:sz w:val="28"/>
+                <w:szCs w:val="28"/>
+                <w:lang w:bidi="ta-IN"/>
+              </w:rPr>
+              <w:t xml:space="preserve"> | </w:t>
+            </w:r>
+            <w:r>
+              <w:rPr>
+                <w:rFonts w:ascii="Latha" w:hAnsi="Latha" w:cs="Latha"/>
+                <w:sz w:val="28"/>
+                <w:szCs w:val="28"/>
+                <w:highlight w:val="green"/>
+                <w:cs/>
+                <w:lang w:bidi="ta-IN"/>
+              </w:rPr>
+              <w:t>இ</w:t>
+            </w:r>
+            <w:r>
+              <w:rPr>
+                <w:rFonts w:ascii="BRH Tamil Tab Extra" w:hAnsi="BRH Tamil Tab Extra" w:cs="Latha"/>
+                <w:b/>
+                <w:sz w:val="32"/>
+                <w:szCs w:val="28"/>
+                <w:lang w:bidi="ta-IN"/>
+              </w:rPr>
+              <w:t>…</w:t>
+            </w:r>
+            <w:r>
+              <w:rPr>
+                <w:rFonts w:ascii="Latha" w:hAnsi="Latha" w:cs="Latha"/>
+                <w:sz w:val="28"/>
+                <w:szCs w:val="28"/>
+                <w:highlight w:val="green"/>
+                <w:cs/>
+                <w:lang w:bidi="ta-IN"/>
+              </w:rPr>
+              <w:t>ஹீதி</w:t>
+            </w:r>
+            <w:r>
+              <w:rPr>
+                <w:rFonts w:ascii="BRH Tamil Tab Extra" w:hAnsi="BRH Tamil Tab Extra" w:cs="Latha"/>
+                <w:b/>
+                <w:sz w:val="36"/>
+                <w:szCs w:val="28"/>
+                <w:lang w:bidi="ta-IN"/>
+              </w:rPr>
+              <w:t>†</w:t>
+            </w:r>
+            <w:r>
+              <w:rPr>
+                <w:rFonts w:ascii="Latha" w:hAnsi="Latha" w:cs="Latha"/>
+                <w:sz w:val="28"/>
+                <w:szCs w:val="28"/>
+                <w:lang w:bidi="ta-IN"/>
+              </w:rPr>
+              <w:t xml:space="preserve"> |</w:t>
+            </w:r>
+          </w:p>
+        </w:tc>
+      </w:tr>
+      <w:tr>
+        <w:trPr>
+          <w:trHeight w:val="962"/>
+        </w:trPr>
+        <w:tc>
+          <w:tcPr>
+            <w:tcW w:w="3764" w:type="dxa"/>
+          </w:tcPr>
+          <w:p>
+            <w:pPr>
+              <w:widowControl w:val="0"/>
+              <w:tabs>
+                <w:tab w:val="left" w:pos="993"/>
+              </w:tabs>
+              <w:autoSpaceDE w:val="0"/>
+              <w:autoSpaceDN w:val="0"/>
+              <w:adjustRightInd w:val="0"/>
+              <w:spacing w:before="0" w:line="252" w:lineRule="auto"/>
+              <w:ind w:right="297"/>
+              <w:rPr>
+                <w:rFonts w:cs="Arial"/>
+                <w:b/>
+                <w:color w:val="000000"/>
+                <w:sz w:val="28"/>
+                <w:szCs w:val="28"/>
+              </w:rPr>
+            </w:pPr>
+            <w:r>
+              <w:rPr>
+                <w:rFonts w:cs="Arial"/>
+                <w:b/>
+                <w:color w:val="000000"/>
+                <w:sz w:val="28"/>
+                <w:szCs w:val="28"/>
+              </w:rPr>
+              <w:t>T.S.5.1.</w:t>
+            </w:r>
+            <w:r>
+              <w:rPr>
+                <w:rFonts w:cs="Arial"/>
+                <w:b/>
+                <w:color w:val="000000"/>
+                <w:sz w:val="28"/>
+                <w:szCs w:val="28"/>
+              </w:rPr>
+              <w:t>6</w:t>
+            </w:r>
+            <w:r>
+              <w:rPr>
+                <w:rFonts w:cs="Arial"/>
+                <w:b/>
+                <w:color w:val="000000"/>
+                <w:sz w:val="28"/>
+                <w:szCs w:val="28"/>
+              </w:rPr>
+              <w:t>.</w:t>
+            </w:r>
+            <w:r>
+              <w:rPr>
+                <w:rFonts w:cs="Arial"/>
+                <w:b/>
+                <w:color w:val="000000"/>
+                <w:sz w:val="28"/>
+                <w:szCs w:val="28"/>
+              </w:rPr>
+              <w:t>4</w:t>
+            </w:r>
+            <w:r>
+              <w:rPr>
+                <w:rFonts w:cs="Arial"/>
+                <w:b/>
+                <w:color w:val="000000"/>
+                <w:sz w:val="28"/>
+                <w:szCs w:val="28"/>
+              </w:rPr>
+              <w:t xml:space="preserve"> – Kramam</w:t>
+            </w:r>
+          </w:p>
+          <w:p>
+            <w:pPr>
+              <w:widowControl w:val="0"/>
+              <w:tabs>
+                <w:tab w:val="left" w:pos="993"/>
+              </w:tabs>
+              <w:autoSpaceDE w:val="0"/>
+              <w:autoSpaceDN w:val="0"/>
+              <w:adjustRightInd w:val="0"/>
+              <w:spacing w:before="0" w:line="252" w:lineRule="auto"/>
+              <w:ind w:right="297"/>
+              <w:rPr>
+                <w:rFonts w:cstheme="minorBidi" w:hint="cs"/>
+                <w:b/>
+                <w:color w:val="000000"/>
+                <w:sz w:val="28"/>
+                <w:szCs w:val="28"/>
+                <w:lang w:val="en-IN" w:bidi="ta-IN"/>
+              </w:rPr>
+            </w:pPr>
+            <w:r>
+              <w:rPr>
+                <w:rFonts w:cs="Arial"/>
+                <w:b/>
+                <w:color w:val="000000"/>
+                <w:sz w:val="28"/>
+                <w:szCs w:val="28"/>
+              </w:rPr>
+              <w:t xml:space="preserve">Krama Vaakyam No.– </w:t>
+            </w:r>
+            <w:r>
+              <w:rPr>
+                <w:rFonts w:cs="Arial"/>
+                <w:b/>
+                <w:color w:val="000000"/>
+                <w:sz w:val="28"/>
+                <w:szCs w:val="28"/>
+              </w:rPr>
+              <w:t>1</w:t>
+            </w:r>
+            <w:r>
+              <w:rPr>
+                <w:rFonts w:cs="Arial"/>
+                <w:b/>
+                <w:color w:val="000000"/>
+                <w:sz w:val="28"/>
+                <w:szCs w:val="28"/>
+                <w:lang w:val="en-IN"/>
+              </w:rPr>
+              <w:t>1</w:t>
+            </w:r>
+          </w:p>
+          <w:p>
+            <w:pPr>
+              <w:widowControl w:val="0"/>
+              <w:tabs>
+                <w:tab w:val="left" w:pos="993"/>
+              </w:tabs>
+              <w:autoSpaceDE w:val="0"/>
+              <w:autoSpaceDN w:val="0"/>
+              <w:adjustRightInd w:val="0"/>
+              <w:spacing w:before="0" w:line="252" w:lineRule="auto"/>
+              <w:ind w:right="297"/>
+              <w:rPr>
+                <w:rFonts w:cs="Arial"/>
+                <w:b/>
+                <w:color w:val="000000"/>
+                <w:sz w:val="28"/>
+                <w:szCs w:val="28"/>
+              </w:rPr>
+            </w:pPr>
+            <w:r>
+              <w:rPr>
+                <w:rFonts w:cs="Arial"/>
+                <w:b/>
+                <w:color w:val="000000"/>
+                <w:sz w:val="28"/>
+                <w:szCs w:val="28"/>
+              </w:rPr>
+              <w:t xml:space="preserve">Panchaati No. - </w:t>
+            </w:r>
+            <w:r>
+              <w:rPr>
+                <w:rFonts w:cs="Arial"/>
+                <w:b/>
+                <w:color w:val="000000"/>
+                <w:sz w:val="28"/>
+                <w:szCs w:val="28"/>
+              </w:rPr>
+              <w:t>34</w:t>
+            </w:r>
+          </w:p>
+        </w:tc>
+        <w:tc>
+          <w:tcPr>
+            <w:tcW w:w="5245" w:type="dxa"/>
+          </w:tcPr>
+          <w:p>
+            <w:pPr>
+              <w:widowControl w:val="0"/>
+              <w:autoSpaceDE w:val="0"/>
+              <w:autoSpaceDN w:val="0"/>
+              <w:adjustRightInd w:val="0"/>
+              <w:spacing w:before="0" w:line="240" w:lineRule="auto"/>
+              <w:rPr>
+                <w:rFonts w:ascii="Latha" w:hAnsi="Latha" w:cs="Latha"/>
+                <w:sz w:val="28"/>
+                <w:szCs w:val="28"/>
+                <w:cs/>
+                <w:lang w:bidi="ta-IN"/>
+              </w:rPr>
+            </w:pPr>
+            <w:r>
+              <w:rPr>
+                <w:rFonts w:ascii="Latha" w:hAnsi="Latha" w:cs="Latha"/>
+                <w:sz w:val="28"/>
+                <w:szCs w:val="28"/>
+                <w:cs/>
+                <w:lang w:bidi="ta-IN"/>
+              </w:rPr>
+              <w:t>அன்வ</w:t>
+            </w:r>
+            <w:r>
+              <w:rPr>
+                <w:rFonts w:ascii="BRH Tamil Tab Extra" w:hAnsi="BRH Tamil Tab Extra" w:cs="Latha"/>
+                <w:b/>
+                <w:sz w:val="32"/>
+                <w:szCs w:val="28"/>
+                <w:lang w:bidi="ta-IN"/>
+              </w:rPr>
+              <w:t>…</w:t>
+            </w:r>
+            <w:r>
+              <w:rPr>
+                <w:rFonts w:ascii="Latha" w:hAnsi="Latha" w:cs="Latha"/>
+                <w:sz w:val="28"/>
+                <w:szCs w:val="28"/>
+                <w:cs/>
+                <w:lang w:bidi="ta-IN"/>
+              </w:rPr>
+              <w:t>ன்யை</w:t>
+            </w:r>
+            <w:r>
+              <w:rPr>
+                <w:rFonts w:ascii="Latha" w:hAnsi="Latha" w:cs="Latha"/>
+                <w:b/>
+                <w:bCs/>
+                <w:sz w:val="32"/>
+                <w:szCs w:val="32"/>
+                <w:cs/>
+                <w:lang w:bidi="ta-IN"/>
+              </w:rPr>
+              <w:t>:</w:t>
+            </w:r>
+            <w:r>
+              <w:rPr>
+                <w:rFonts w:ascii="Latha" w:hAnsi="Latha" w:cs="Latha"/>
+                <w:sz w:val="28"/>
+                <w:szCs w:val="28"/>
+                <w:lang w:bidi="ta-IN"/>
+              </w:rPr>
+              <w:t xml:space="preserve"> | </w:t>
+            </w:r>
+            <w:r>
+              <w:rPr>
+                <w:rFonts w:ascii="Latha" w:hAnsi="Latha" w:cs="Latha"/>
+                <w:sz w:val="28"/>
+                <w:szCs w:val="28"/>
+                <w:lang w:bidi="ta-IN"/>
+              </w:rPr>
+              <w:br/>
+            </w:r>
+            <w:r>
+              <w:rPr>
+                <w:rFonts w:ascii="Latha" w:hAnsi="Latha" w:cs="Latha"/>
+                <w:sz w:val="28"/>
+                <w:szCs w:val="28"/>
+                <w:highlight w:val="yellow"/>
+                <w:cs/>
+                <w:lang w:bidi="ta-IN"/>
+              </w:rPr>
+              <w:t>அ</w:t>
+            </w:r>
+            <w:r>
+              <w:rPr>
+                <w:rFonts w:ascii="BRH Tamil Tab Extra" w:hAnsi="BRH Tamil Tab Extra" w:cs="Latha"/>
+                <w:b/>
+                <w:sz w:val="32"/>
+                <w:szCs w:val="28"/>
+                <w:highlight w:val="yellow"/>
+                <w:lang w:bidi="ta-IN"/>
+              </w:rPr>
+              <w:t>…</w:t>
+            </w:r>
+            <w:r>
+              <w:rPr>
+                <w:rFonts w:ascii="Latha" w:hAnsi="Latha" w:cs="Latha"/>
+                <w:sz w:val="28"/>
+                <w:szCs w:val="28"/>
+                <w:highlight w:val="yellow"/>
+                <w:cs/>
+                <w:lang w:bidi="ta-IN"/>
+              </w:rPr>
+              <w:t>ன்</w:t>
+            </w:r>
+            <w:r>
+              <w:rPr>
+                <w:rFonts w:ascii="Latha" w:hAnsi="Latha" w:cs="Latha"/>
+                <w:color w:val="EE0000"/>
+                <w:sz w:val="28"/>
+                <w:szCs w:val="28"/>
+                <w:highlight w:val="yellow"/>
+                <w:cs/>
+                <w:lang w:bidi="ta-IN"/>
+              </w:rPr>
+              <w:t>வ</w:t>
+            </w:r>
+            <w:r>
+              <w:rPr>
+                <w:rFonts w:ascii="BRH Tamil Tab Extra" w:hAnsi="BRH Tamil Tab Extra" w:cs="Latha"/>
+                <w:b/>
+                <w:color w:val="EE0000"/>
+                <w:sz w:val="32"/>
+                <w:szCs w:val="28"/>
+                <w:highlight w:val="yellow"/>
+                <w:lang w:bidi="ta-IN"/>
+              </w:rPr>
+              <w:t>…</w:t>
+            </w:r>
+            <w:r>
+              <w:rPr>
+                <w:rFonts w:ascii="Latha" w:hAnsi="Latha" w:cs="Latha"/>
+                <w:color w:val="EE0000"/>
+                <w:sz w:val="28"/>
+                <w:szCs w:val="28"/>
+                <w:highlight w:val="yellow"/>
+                <w:cs/>
+                <w:lang w:bidi="ta-IN"/>
+              </w:rPr>
+              <w:t>ன்</w:t>
+            </w:r>
+            <w:r>
+              <w:rPr>
+                <w:rFonts w:ascii="Latha" w:hAnsi="Latha" w:cs="Latha"/>
+                <w:sz w:val="28"/>
+                <w:szCs w:val="28"/>
+                <w:highlight w:val="yellow"/>
+                <w:cs/>
+                <w:lang w:bidi="ta-IN"/>
+              </w:rPr>
+              <w:t>யைர்</w:t>
+            </w:r>
+            <w:r>
+              <w:rPr>
+                <w:rFonts w:ascii="Latha" w:hAnsi="Latha" w:cs="Latha"/>
+                <w:sz w:val="28"/>
+                <w:szCs w:val="28"/>
+                <w:lang w:bidi="ta-IN"/>
+              </w:rPr>
+              <w:t xml:space="preserve"> </w:t>
+            </w:r>
+            <w:r>
+              <w:rPr>
+                <w:rFonts w:ascii="Latha" w:hAnsi="Latha" w:cs="Latha"/>
+                <w:sz w:val="28"/>
+                <w:szCs w:val="28"/>
+                <w:cs/>
+                <w:lang w:bidi="ta-IN"/>
+              </w:rPr>
+              <w:t>ம</w:t>
+            </w:r>
+            <w:r>
+              <w:rPr>
+                <w:rFonts w:ascii="BRH Tamil Tab Extra" w:hAnsi="BRH Tamil Tab Extra" w:cs="Latha"/>
+                <w:b/>
+                <w:sz w:val="36"/>
+                <w:szCs w:val="28"/>
+                <w:lang w:bidi="ta-IN"/>
+              </w:rPr>
+              <w:t>†</w:t>
+            </w:r>
+            <w:r>
+              <w:rPr>
+                <w:rFonts w:ascii="Latha" w:hAnsi="Latha" w:cs="Latha"/>
+                <w:sz w:val="28"/>
+                <w:szCs w:val="28"/>
+                <w:cs/>
+                <w:lang w:bidi="ta-IN"/>
+              </w:rPr>
+              <w:t>ந்த்ரயதே</w:t>
+            </w:r>
+            <w:r>
+              <w:rPr>
+                <w:rFonts w:ascii="Latha" w:hAnsi="Latha" w:cs="Latha"/>
+                <w:sz w:val="28"/>
+                <w:szCs w:val="28"/>
+                <w:lang w:bidi="ta-IN"/>
+              </w:rPr>
+              <w:t xml:space="preserve"> |</w:t>
+            </w:r>
+          </w:p>
+        </w:tc>
+        <w:tc>
+          <w:tcPr>
+            <w:tcW w:w="5386" w:type="dxa"/>
+          </w:tcPr>
+          <w:p>
+            <w:pPr>
+              <w:widowControl w:val="0"/>
+              <w:autoSpaceDE w:val="0"/>
+              <w:autoSpaceDN w:val="0"/>
+              <w:adjustRightInd w:val="0"/>
+              <w:spacing w:before="0" w:line="240" w:lineRule="auto"/>
+              <w:rPr>
+                <w:rFonts w:ascii="Latha" w:hAnsi="Latha" w:cs="Latha"/>
+                <w:sz w:val="28"/>
+                <w:szCs w:val="28"/>
+                <w:cs/>
+                <w:lang w:bidi="ta-IN"/>
+              </w:rPr>
+            </w:pPr>
+            <w:r>
+              <w:rPr>
+                <w:rFonts w:ascii="Latha" w:hAnsi="Latha" w:cs="Latha"/>
+                <w:sz w:val="28"/>
+                <w:szCs w:val="28"/>
+                <w:cs/>
+                <w:lang w:bidi="ta-IN"/>
+              </w:rPr>
+              <w:t>அன்வ</w:t>
+            </w:r>
+            <w:r>
+              <w:rPr>
+                <w:rFonts w:ascii="BRH Tamil Tab Extra" w:hAnsi="BRH Tamil Tab Extra" w:cs="Latha"/>
+                <w:b/>
+                <w:sz w:val="32"/>
+                <w:szCs w:val="28"/>
+                <w:lang w:bidi="ta-IN"/>
+              </w:rPr>
+              <w:t>…</w:t>
+            </w:r>
+            <w:r>
+              <w:rPr>
+                <w:rFonts w:ascii="Latha" w:hAnsi="Latha" w:cs="Latha"/>
+                <w:sz w:val="28"/>
+                <w:szCs w:val="28"/>
+                <w:cs/>
+                <w:lang w:bidi="ta-IN"/>
+              </w:rPr>
+              <w:t>ன்யை</w:t>
+            </w:r>
+            <w:r>
+              <w:rPr>
+                <w:rFonts w:ascii="Latha" w:hAnsi="Latha" w:cs="Latha"/>
+                <w:b/>
+                <w:bCs/>
+                <w:sz w:val="32"/>
+                <w:szCs w:val="32"/>
+                <w:cs/>
+                <w:lang w:bidi="ta-IN"/>
+              </w:rPr>
+              <w:t>:</w:t>
+            </w:r>
+            <w:r>
+              <w:rPr>
+                <w:rFonts w:ascii="Latha" w:hAnsi="Latha" w:cs="Latha"/>
+                <w:sz w:val="28"/>
+                <w:szCs w:val="28"/>
+                <w:lang w:bidi="ta-IN"/>
+              </w:rPr>
+              <w:t xml:space="preserve"> | </w:t>
+            </w:r>
+            <w:r>
+              <w:rPr>
+                <w:rFonts w:ascii="Latha" w:hAnsi="Latha" w:cs="Latha"/>
+                <w:sz w:val="28"/>
+                <w:szCs w:val="28"/>
+                <w:lang w:bidi="ta-IN"/>
+              </w:rPr>
+              <w:br/>
+            </w:r>
+            <w:r>
+              <w:rPr>
+                <w:rFonts w:ascii="Latha" w:hAnsi="Latha" w:cs="Latha"/>
+                <w:sz w:val="28"/>
+                <w:szCs w:val="28"/>
+                <w:highlight w:val="green"/>
+                <w:cs/>
+                <w:lang w:bidi="ta-IN"/>
+              </w:rPr>
+              <w:t>அ</w:t>
+            </w:r>
+            <w:r>
+              <w:rPr>
+                <w:rFonts w:ascii="BRH Tamil Tab Extra" w:hAnsi="BRH Tamil Tab Extra" w:cs="Latha"/>
+                <w:b/>
+                <w:sz w:val="32"/>
+                <w:szCs w:val="28"/>
+                <w:highlight w:val="green"/>
+                <w:lang w:bidi="ta-IN"/>
+              </w:rPr>
+              <w:t>…</w:t>
+            </w:r>
+            <w:r>
+              <w:rPr>
+                <w:rFonts w:ascii="Latha" w:hAnsi="Latha" w:cs="Latha"/>
+                <w:sz w:val="28"/>
+                <w:szCs w:val="28"/>
+                <w:highlight w:val="green"/>
+                <w:cs/>
+                <w:lang w:bidi="ta-IN"/>
+              </w:rPr>
+              <w:t>ன்யைர்</w:t>
+            </w:r>
+            <w:r>
+              <w:rPr>
+                <w:rFonts w:ascii="Latha" w:hAnsi="Latha" w:cs="Latha"/>
+                <w:sz w:val="28"/>
+                <w:szCs w:val="28"/>
+                <w:lang w:bidi="ta-IN"/>
+              </w:rPr>
+              <w:t xml:space="preserve"> </w:t>
+            </w:r>
+            <w:r>
+              <w:rPr>
+                <w:rFonts w:ascii="Latha" w:hAnsi="Latha" w:cs="Latha"/>
+                <w:sz w:val="28"/>
+                <w:szCs w:val="28"/>
+                <w:cs/>
+                <w:lang w:bidi="ta-IN"/>
+              </w:rPr>
+              <w:t>ம</w:t>
+            </w:r>
+            <w:r>
+              <w:rPr>
+                <w:rFonts w:ascii="BRH Tamil Tab Extra" w:hAnsi="BRH Tamil Tab Extra" w:cs="Latha"/>
+                <w:b/>
+                <w:sz w:val="36"/>
+                <w:szCs w:val="28"/>
+                <w:lang w:bidi="ta-IN"/>
+              </w:rPr>
+              <w:t>†</w:t>
+            </w:r>
+            <w:r>
+              <w:rPr>
+                <w:rFonts w:ascii="Latha" w:hAnsi="Latha" w:cs="Latha"/>
+                <w:sz w:val="28"/>
+                <w:szCs w:val="28"/>
+                <w:cs/>
+                <w:lang w:bidi="ta-IN"/>
+              </w:rPr>
+              <w:t>ந்த்ரயதே</w:t>
+            </w:r>
+            <w:r>
+              <w:rPr>
+                <w:rFonts w:ascii="Latha" w:hAnsi="Latha" w:cs="Latha"/>
+                <w:sz w:val="28"/>
+                <w:szCs w:val="28"/>
+                <w:lang w:bidi="ta-IN"/>
+              </w:rPr>
+              <w:t xml:space="preserve"> |</w:t>
+            </w:r>
+          </w:p>
+        </w:tc>
+      </w:tr>
+      <w:tr>
+        <w:trPr>
+          <w:trHeight w:val="962"/>
+        </w:trPr>
+        <w:tc>
+          <w:tcPr>
+            <w:tcW w:w="3764" w:type="dxa"/>
+          </w:tcPr>
+          <w:p>
+            <w:pPr>
+              <w:widowControl w:val="0"/>
+              <w:tabs>
+                <w:tab w:val="left" w:pos="993"/>
+              </w:tabs>
+              <w:autoSpaceDE w:val="0"/>
+              <w:autoSpaceDN w:val="0"/>
+              <w:adjustRightInd w:val="0"/>
+              <w:spacing w:before="0" w:line="252" w:lineRule="auto"/>
+              <w:ind w:right="297"/>
+              <w:rPr>
+                <w:rFonts w:cs="Arial"/>
+                <w:b/>
+                <w:color w:val="000000"/>
+                <w:sz w:val="28"/>
+                <w:szCs w:val="28"/>
+              </w:rPr>
+            </w:pPr>
+            <w:r>
+              <w:rPr>
+                <w:rFonts w:cs="Arial"/>
+                <w:b/>
+                <w:color w:val="000000"/>
+                <w:sz w:val="28"/>
+                <w:szCs w:val="28"/>
+              </w:rPr>
+              <w:lastRenderedPageBreak/>
+              <w:t>T.S.5.1.</w:t>
+            </w:r>
+            <w:r>
+              <w:rPr>
+                <w:rFonts w:cs="Arial"/>
+                <w:b/>
+                <w:color w:val="000000"/>
+                <w:sz w:val="28"/>
+                <w:szCs w:val="28"/>
+              </w:rPr>
+              <w:t>8.1</w:t>
+            </w:r>
+            <w:r>
+              <w:rPr>
+                <w:rFonts w:cs="Arial"/>
+                <w:b/>
+                <w:color w:val="000000"/>
+                <w:sz w:val="28"/>
+                <w:szCs w:val="28"/>
+              </w:rPr>
+              <w:t xml:space="preserve"> – Kramam</w:t>
+            </w:r>
+          </w:p>
+          <w:p>
+            <w:pPr>
+              <w:widowControl w:val="0"/>
+              <w:tabs>
+                <w:tab w:val="left" w:pos="993"/>
+              </w:tabs>
+              <w:autoSpaceDE w:val="0"/>
+              <w:autoSpaceDN w:val="0"/>
+              <w:adjustRightInd w:val="0"/>
+              <w:spacing w:before="0" w:line="252" w:lineRule="auto"/>
+              <w:ind w:right="297"/>
+              <w:rPr>
+                <w:rFonts w:cstheme="minorBidi" w:hint="cs"/>
+                <w:b/>
+                <w:color w:val="000000"/>
+                <w:sz w:val="28"/>
+                <w:szCs w:val="28"/>
+                <w:lang w:val="en-IN" w:bidi="ta-IN"/>
+              </w:rPr>
+            </w:pPr>
+            <w:r>
+              <w:rPr>
+                <w:rFonts w:cs="Arial"/>
+                <w:b/>
+                <w:color w:val="000000"/>
+                <w:sz w:val="28"/>
+                <w:szCs w:val="28"/>
+              </w:rPr>
+              <w:t xml:space="preserve">Krama Vaakyam No.– </w:t>
+            </w:r>
+            <w:r>
+              <w:rPr>
+                <w:rFonts w:cs="Arial"/>
+                <w:b/>
+                <w:color w:val="000000"/>
+                <w:sz w:val="28"/>
+                <w:szCs w:val="28"/>
+              </w:rPr>
+              <w:t>6</w:t>
+            </w:r>
+          </w:p>
+          <w:p>
+            <w:pPr>
+              <w:widowControl w:val="0"/>
+              <w:tabs>
+                <w:tab w:val="left" w:pos="993"/>
+              </w:tabs>
+              <w:autoSpaceDE w:val="0"/>
+              <w:autoSpaceDN w:val="0"/>
+              <w:adjustRightInd w:val="0"/>
+              <w:spacing w:before="0" w:line="252" w:lineRule="auto"/>
+              <w:ind w:right="297"/>
+              <w:rPr>
+                <w:rFonts w:cs="Arial"/>
+                <w:b/>
+                <w:color w:val="000000"/>
+                <w:sz w:val="28"/>
+                <w:szCs w:val="28"/>
+              </w:rPr>
+            </w:pPr>
+            <w:r>
+              <w:rPr>
+                <w:rFonts w:cs="Arial"/>
+                <w:b/>
+                <w:color w:val="000000"/>
+                <w:sz w:val="28"/>
+                <w:szCs w:val="28"/>
+              </w:rPr>
+              <w:t xml:space="preserve">Panchaati No. - </w:t>
+            </w:r>
+            <w:r>
+              <w:rPr>
+                <w:rFonts w:cs="Arial"/>
+                <w:b/>
+                <w:color w:val="000000"/>
+                <w:sz w:val="28"/>
+                <w:szCs w:val="28"/>
+              </w:rPr>
+              <w:t>3</w:t>
+            </w:r>
+            <w:r>
+              <w:rPr>
+                <w:rFonts w:cs="Arial"/>
+                <w:b/>
+                <w:color w:val="000000"/>
+                <w:sz w:val="28"/>
+                <w:szCs w:val="28"/>
+              </w:rPr>
+              <w:t>9</w:t>
+            </w:r>
+          </w:p>
+        </w:tc>
+        <w:tc>
+          <w:tcPr>
+            <w:tcW w:w="5245" w:type="dxa"/>
+          </w:tcPr>
+          <w:p>
+            <w:pPr>
+              <w:widowControl w:val="0"/>
+              <w:autoSpaceDE w:val="0"/>
+              <w:autoSpaceDN w:val="0"/>
+              <w:adjustRightInd w:val="0"/>
+              <w:spacing w:before="0" w:line="240" w:lineRule="auto"/>
+              <w:rPr>
+                <w:rFonts w:ascii="Latha" w:hAnsi="Latha" w:cs="Latha"/>
+                <w:sz w:val="28"/>
+                <w:szCs w:val="28"/>
+                <w:cs/>
+                <w:lang w:bidi="ta-IN"/>
+              </w:rPr>
+            </w:pPr>
+            <w:r>
+              <w:rPr>
+                <w:rFonts w:ascii="Latha" w:hAnsi="Latha" w:cs="Latha"/>
+                <w:sz w:val="28"/>
+                <w:szCs w:val="28"/>
+                <w:cs/>
+                <w:lang w:bidi="ta-IN"/>
+              </w:rPr>
+              <w:t>அச்</w:t>
+            </w:r>
+            <w:r>
+              <w:rPr>
+                <w:rFonts w:ascii="Latha" w:hAnsi="Latha" w:cs="Latha"/>
+                <w:sz w:val="28"/>
+                <w:szCs w:val="28"/>
+                <w:highlight w:val="yellow"/>
+                <w:cs/>
+                <w:lang w:bidi="ta-IN"/>
+              </w:rPr>
+              <w:t>ச</w:t>
+            </w:r>
+            <w:r>
+              <w:rPr>
+                <w:rFonts w:ascii="Latha" w:hAnsi="Latha" w:cs="Latha"/>
+                <w:b/>
+                <w:bCs/>
+                <w:position w:val="-12"/>
+                <w:sz w:val="28"/>
+                <w:szCs w:val="28"/>
+                <w:highlight w:val="yellow"/>
+                <w:cs/>
+                <w:lang w:bidi="ta-IN"/>
+              </w:rPr>
+              <w:t>2</w:t>
+            </w:r>
+            <w:r>
+              <w:rPr>
+                <w:rFonts w:ascii="Latha" w:hAnsi="Latha" w:cs="Latha"/>
+                <w:sz w:val="28"/>
+                <w:szCs w:val="28"/>
+                <w:highlight w:val="yellow"/>
+                <w:cs/>
+                <w:lang w:bidi="ta-IN"/>
+              </w:rPr>
+              <w:t>இ</w:t>
+            </w:r>
+            <w:r>
+              <w:rPr>
+                <w:rFonts w:ascii="BRH Tamil Tab Extra" w:hAnsi="BRH Tamil Tab Extra" w:cs="Latha"/>
+                <w:b/>
+                <w:sz w:val="36"/>
+                <w:szCs w:val="28"/>
+                <w:highlight w:val="green"/>
+                <w:lang w:bidi="ta-IN"/>
+              </w:rPr>
+              <w:t>†</w:t>
+            </w:r>
+            <w:r>
+              <w:rPr>
+                <w:rFonts w:ascii="BRH Tamil Tab Extra" w:hAnsi="BRH Tamil Tab Extra" w:cs="Latha" w:hint="cs"/>
+                <w:b/>
+                <w:sz w:val="36"/>
+                <w:szCs w:val="28"/>
+                <w:highlight w:val="green"/>
+                <w:cs/>
+                <w:lang w:bidi="ta-IN"/>
+              </w:rPr>
+              <w:t>சை</w:t>
+            </w:r>
+            <w:r>
+              <w:rPr>
+                <w:rFonts w:ascii="Latha" w:hAnsi="Latha" w:cs="Latha"/>
+                <w:sz w:val="28"/>
+                <w:szCs w:val="28"/>
+                <w:cs/>
+                <w:lang w:bidi="ta-IN"/>
+              </w:rPr>
+              <w:t>தி</w:t>
+            </w:r>
+            <w:r>
+              <w:rPr>
+                <w:rFonts w:ascii="Latha" w:hAnsi="Latha" w:cs="Latha"/>
+                <w:sz w:val="28"/>
+                <w:szCs w:val="28"/>
+                <w:lang w:bidi="ta-IN"/>
+              </w:rPr>
+              <w:t xml:space="preserve"> | </w:t>
+            </w:r>
+            <w:r>
+              <w:rPr>
+                <w:rFonts w:ascii="Latha" w:hAnsi="Latha" w:cs="Latha"/>
+                <w:sz w:val="28"/>
+                <w:szCs w:val="28"/>
+                <w:cs/>
+                <w:lang w:bidi="ta-IN"/>
+              </w:rPr>
+              <w:t>ஏ</w:t>
+            </w:r>
+            <w:r>
+              <w:rPr>
+                <w:rFonts w:ascii="BRH Tamil Tab Extra" w:hAnsi="BRH Tamil Tab Extra" w:cs="Latha"/>
+                <w:b/>
+                <w:sz w:val="32"/>
+                <w:szCs w:val="28"/>
+                <w:lang w:bidi="ta-IN"/>
+              </w:rPr>
+              <w:t>…</w:t>
+            </w:r>
+            <w:r>
+              <w:rPr>
+                <w:rFonts w:ascii="Latha" w:hAnsi="Latha" w:cs="Latha"/>
+                <w:sz w:val="28"/>
+                <w:szCs w:val="28"/>
+                <w:cs/>
+                <w:lang w:bidi="ta-IN"/>
+              </w:rPr>
+              <w:t>த்ய</w:t>
+            </w:r>
+            <w:r>
+              <w:rPr>
+                <w:rFonts w:ascii="BRH Tamil Tab Extra" w:hAnsi="BRH Tamil Tab Extra" w:cs="Latha"/>
+                <w:b/>
+                <w:sz w:val="32"/>
+                <w:szCs w:val="28"/>
+                <w:lang w:bidi="ta-IN"/>
+              </w:rPr>
+              <w:t>…</w:t>
+            </w:r>
+            <w:r>
+              <w:rPr>
+                <w:rFonts w:ascii="Latha" w:hAnsi="Latha" w:cs="Latha"/>
+                <w:sz w:val="28"/>
+                <w:szCs w:val="28"/>
+                <w:cs/>
+                <w:lang w:bidi="ta-IN"/>
+              </w:rPr>
+              <w:t>மே</w:t>
+            </w:r>
+            <w:r>
+              <w:rPr>
+                <w:rFonts w:ascii="BRH Tamil Tab Extra" w:hAnsi="BRH Tamil Tab Extra" w:cs="Latha"/>
+                <w:b/>
+                <w:sz w:val="32"/>
+                <w:szCs w:val="28"/>
+                <w:lang w:bidi="ta-IN"/>
+              </w:rPr>
+              <w:t>…</w:t>
+            </w:r>
+            <w:r>
+              <w:rPr>
+                <w:rFonts w:ascii="Latha" w:hAnsi="Latha" w:cs="Latha"/>
+                <w:sz w:val="28"/>
+                <w:szCs w:val="28"/>
+                <w:cs/>
+                <w:lang w:bidi="ta-IN"/>
+              </w:rPr>
+              <w:t>த்</w:t>
+            </w:r>
+            <w:r>
+              <w:rPr>
+                <w:rFonts w:ascii="Latha" w:hAnsi="Latha" w:cs="Latha"/>
+                <w:b/>
+                <w:bCs/>
+                <w:position w:val="-12"/>
+                <w:sz w:val="28"/>
+                <w:szCs w:val="28"/>
+                <w:cs/>
+                <w:lang w:bidi="ta-IN"/>
+              </w:rPr>
+              <w:t>3</w:t>
+            </w:r>
+            <w:r>
+              <w:rPr>
+                <w:rFonts w:ascii="Latha" w:hAnsi="Latha" w:cs="Latha"/>
+                <w:sz w:val="28"/>
+                <w:szCs w:val="28"/>
+                <w:cs/>
+                <w:lang w:bidi="ta-IN"/>
+              </w:rPr>
+              <w:t>த்</w:t>
+            </w:r>
+            <w:r>
+              <w:rPr>
+                <w:rFonts w:ascii="Latha" w:hAnsi="Latha" w:cs="Latha"/>
+                <w:b/>
+                <w:bCs/>
+                <w:position w:val="-12"/>
+                <w:sz w:val="28"/>
+                <w:szCs w:val="28"/>
+                <w:cs/>
+                <w:lang w:bidi="ta-IN"/>
+              </w:rPr>
+              <w:t>4</w:t>
+            </w:r>
+            <w:r>
+              <w:rPr>
+                <w:rFonts w:ascii="Latha" w:hAnsi="Latha" w:cs="Latha"/>
+                <w:sz w:val="28"/>
+                <w:szCs w:val="28"/>
+                <w:cs/>
+                <w:lang w:bidi="ta-IN"/>
+              </w:rPr>
+              <w:t>யா</w:t>
+            </w:r>
+            <w:r>
+              <w:rPr>
+                <w:rFonts w:ascii="Latha" w:hAnsi="Latha" w:cs="Latha"/>
+                <w:b/>
+                <w:bCs/>
+                <w:sz w:val="32"/>
+                <w:szCs w:val="32"/>
+                <w:cs/>
+                <w:lang w:bidi="ta-IN"/>
+              </w:rPr>
+              <w:t>:</w:t>
+            </w:r>
+            <w:r>
+              <w:rPr>
+                <w:rFonts w:ascii="Latha" w:hAnsi="Latha" w:cs="Latha"/>
+                <w:sz w:val="28"/>
+                <w:szCs w:val="28"/>
+                <w:lang w:bidi="ta-IN"/>
+              </w:rPr>
+              <w:t xml:space="preserve"> |</w:t>
+            </w:r>
+          </w:p>
+        </w:tc>
+        <w:tc>
+          <w:tcPr>
+            <w:tcW w:w="5386" w:type="dxa"/>
+          </w:tcPr>
+          <w:p>
+            <w:pPr>
+              <w:widowControl w:val="0"/>
+              <w:autoSpaceDE w:val="0"/>
+              <w:autoSpaceDN w:val="0"/>
+              <w:adjustRightInd w:val="0"/>
+              <w:spacing w:before="0" w:line="240" w:lineRule="auto"/>
+              <w:rPr>
+                <w:rFonts w:ascii="Latha" w:hAnsi="Latha" w:cs="Latha"/>
+                <w:sz w:val="28"/>
+                <w:szCs w:val="28"/>
+                <w:cs/>
+                <w:lang w:bidi="ta-IN"/>
+              </w:rPr>
+            </w:pPr>
+            <w:r>
+              <w:rPr>
+                <w:rFonts w:ascii="Latha" w:hAnsi="Latha" w:cs="Latha"/>
+                <w:sz w:val="28"/>
+                <w:szCs w:val="28"/>
+                <w:cs/>
+                <w:lang w:bidi="ta-IN"/>
+              </w:rPr>
+              <w:t>அச்</w:t>
+            </w:r>
+            <w:r>
+              <w:rPr>
+                <w:rFonts w:ascii="BRH Tamil Tab Extra" w:hAnsi="BRH Tamil Tab Extra" w:cs="Latha" w:hint="cs"/>
+                <w:b/>
+                <w:sz w:val="36"/>
+                <w:szCs w:val="28"/>
+                <w:highlight w:val="green"/>
+                <w:cs/>
+                <w:lang w:bidi="ta-IN"/>
+              </w:rPr>
+              <w:t>சை</w:t>
+            </w:r>
+            <w:r>
+              <w:rPr>
+                <w:rFonts w:ascii="BRH Tamil Tab Extra" w:hAnsi="BRH Tamil Tab Extra" w:cs="Latha"/>
+                <w:b/>
+                <w:sz w:val="36"/>
+                <w:szCs w:val="28"/>
+                <w:highlight w:val="green"/>
+                <w:lang w:bidi="ta-IN"/>
+              </w:rPr>
+              <w:t>†</w:t>
+            </w:r>
+            <w:r>
+              <w:rPr>
+                <w:rFonts w:ascii="Latha" w:hAnsi="Latha" w:cs="Latha"/>
+                <w:b/>
+                <w:bCs/>
+                <w:position w:val="-12"/>
+                <w:sz w:val="28"/>
+                <w:szCs w:val="28"/>
+                <w:highlight w:val="green"/>
+                <w:cs/>
+                <w:lang w:bidi="ta-IN"/>
+              </w:rPr>
+              <w:t>2</w:t>
+            </w:r>
+            <w:r>
+              <w:rPr>
+                <w:rFonts w:ascii="Latha" w:hAnsi="Latha" w:cs="Latha"/>
+                <w:sz w:val="28"/>
+                <w:szCs w:val="28"/>
+                <w:highlight w:val="green"/>
+                <w:cs/>
+                <w:lang w:bidi="ta-IN"/>
+              </w:rPr>
+              <w:t>தி</w:t>
+            </w:r>
+            <w:r>
+              <w:rPr>
+                <w:rFonts w:ascii="Latha" w:hAnsi="Latha" w:cs="Latha"/>
+                <w:sz w:val="28"/>
+                <w:szCs w:val="28"/>
+                <w:lang w:bidi="ta-IN"/>
+              </w:rPr>
+              <w:t xml:space="preserve"> | </w:t>
+            </w:r>
+            <w:r>
+              <w:rPr>
+                <w:rFonts w:ascii="Latha" w:hAnsi="Latha" w:cs="Latha"/>
+                <w:sz w:val="28"/>
+                <w:szCs w:val="28"/>
+                <w:cs/>
+                <w:lang w:bidi="ta-IN"/>
+              </w:rPr>
+              <w:t>ஏ</w:t>
+            </w:r>
+            <w:r>
+              <w:rPr>
+                <w:rFonts w:ascii="BRH Tamil Tab Extra" w:hAnsi="BRH Tamil Tab Extra" w:cs="Latha"/>
+                <w:b/>
+                <w:sz w:val="32"/>
+                <w:szCs w:val="28"/>
+                <w:lang w:bidi="ta-IN"/>
+              </w:rPr>
+              <w:t>…</w:t>
+            </w:r>
+            <w:r>
+              <w:rPr>
+                <w:rFonts w:ascii="Latha" w:hAnsi="Latha" w:cs="Latha"/>
+                <w:sz w:val="28"/>
+                <w:szCs w:val="28"/>
+                <w:cs/>
+                <w:lang w:bidi="ta-IN"/>
+              </w:rPr>
+              <w:t>த்ய</w:t>
+            </w:r>
+            <w:r>
+              <w:rPr>
+                <w:rFonts w:ascii="BRH Tamil Tab Extra" w:hAnsi="BRH Tamil Tab Extra" w:cs="Latha"/>
+                <w:b/>
+                <w:sz w:val="32"/>
+                <w:szCs w:val="28"/>
+                <w:lang w:bidi="ta-IN"/>
+              </w:rPr>
+              <w:t>…</w:t>
+            </w:r>
+            <w:r>
+              <w:rPr>
+                <w:rFonts w:ascii="Latha" w:hAnsi="Latha" w:cs="Latha"/>
+                <w:sz w:val="28"/>
+                <w:szCs w:val="28"/>
+                <w:cs/>
+                <w:lang w:bidi="ta-IN"/>
+              </w:rPr>
+              <w:t>மே</w:t>
+            </w:r>
+            <w:r>
+              <w:rPr>
+                <w:rFonts w:ascii="BRH Tamil Tab Extra" w:hAnsi="BRH Tamil Tab Extra" w:cs="Latha"/>
+                <w:b/>
+                <w:sz w:val="32"/>
+                <w:szCs w:val="28"/>
+                <w:lang w:bidi="ta-IN"/>
+              </w:rPr>
+              <w:t>…</w:t>
+            </w:r>
+            <w:r>
+              <w:rPr>
+                <w:rFonts w:ascii="Latha" w:hAnsi="Latha" w:cs="Latha"/>
+                <w:sz w:val="28"/>
+                <w:szCs w:val="28"/>
+                <w:cs/>
+                <w:lang w:bidi="ta-IN"/>
+              </w:rPr>
+              <w:t>த்</w:t>
+            </w:r>
+            <w:r>
+              <w:rPr>
+                <w:rFonts w:ascii="Latha" w:hAnsi="Latha" w:cs="Latha"/>
+                <w:b/>
+                <w:bCs/>
+                <w:position w:val="-12"/>
+                <w:sz w:val="28"/>
+                <w:szCs w:val="28"/>
+                <w:cs/>
+                <w:lang w:bidi="ta-IN"/>
+              </w:rPr>
+              <w:t>3</w:t>
+            </w:r>
+            <w:r>
+              <w:rPr>
+                <w:rFonts w:ascii="Latha" w:hAnsi="Latha" w:cs="Latha"/>
+                <w:sz w:val="28"/>
+                <w:szCs w:val="28"/>
+                <w:cs/>
+                <w:lang w:bidi="ta-IN"/>
+              </w:rPr>
+              <w:t>த்</w:t>
+            </w:r>
+            <w:r>
+              <w:rPr>
+                <w:rFonts w:ascii="Latha" w:hAnsi="Latha" w:cs="Latha"/>
+                <w:b/>
+                <w:bCs/>
+                <w:position w:val="-12"/>
+                <w:sz w:val="28"/>
+                <w:szCs w:val="28"/>
+                <w:cs/>
+                <w:lang w:bidi="ta-IN"/>
+              </w:rPr>
+              <w:t>4</w:t>
+            </w:r>
+            <w:r>
+              <w:rPr>
+                <w:rFonts w:ascii="Latha" w:hAnsi="Latha" w:cs="Latha"/>
+                <w:sz w:val="28"/>
+                <w:szCs w:val="28"/>
+                <w:cs/>
+                <w:lang w:bidi="ta-IN"/>
+              </w:rPr>
+              <w:t>யா</w:t>
+            </w:r>
+            <w:r>
+              <w:rPr>
+                <w:rFonts w:ascii="Latha" w:hAnsi="Latha" w:cs="Latha"/>
+                <w:b/>
+                <w:bCs/>
+                <w:sz w:val="32"/>
+                <w:szCs w:val="32"/>
+                <w:cs/>
+                <w:lang w:bidi="ta-IN"/>
+              </w:rPr>
+              <w:t>:</w:t>
+            </w:r>
+            <w:r>
+              <w:rPr>
+                <w:rFonts w:ascii="Latha" w:hAnsi="Latha" w:cs="Latha"/>
+                <w:sz w:val="28"/>
+                <w:szCs w:val="28"/>
+                <w:lang w:bidi="ta-IN"/>
+              </w:rPr>
+              <w:t xml:space="preserve"> |</w:t>
+            </w:r>
+          </w:p>
+        </w:tc>
+      </w:tr>
+      <w:tr>
+        <w:trPr>
+          <w:trHeight w:val="962"/>
+        </w:trPr>
+        <w:tc>
+          <w:tcPr>
+            <w:tcW w:w="3764" w:type="dxa"/>
+          </w:tcPr>
+          <w:p>
+            <w:pPr>
+              <w:widowControl w:val="0"/>
+              <w:tabs>
+                <w:tab w:val="left" w:pos="993"/>
+              </w:tabs>
+              <w:autoSpaceDE w:val="0"/>
+              <w:autoSpaceDN w:val="0"/>
+              <w:adjustRightInd w:val="0"/>
+              <w:spacing w:before="0" w:line="252" w:lineRule="auto"/>
+              <w:ind w:right="297"/>
+              <w:rPr>
+                <w:rFonts w:cs="Arial"/>
+                <w:b/>
+                <w:color w:val="000000"/>
+                <w:sz w:val="28"/>
+                <w:szCs w:val="28"/>
+              </w:rPr>
+            </w:pPr>
+            <w:r>
+              <w:rPr>
+                <w:rFonts w:cs="Arial"/>
+                <w:b/>
+                <w:color w:val="000000"/>
+                <w:sz w:val="28"/>
+                <w:szCs w:val="28"/>
+              </w:rPr>
+              <w:t>T.S.5.1.</w:t>
+            </w:r>
+            <w:r>
+              <w:rPr>
+                <w:rFonts w:cs="Arial"/>
+                <w:b/>
+                <w:color w:val="000000"/>
+                <w:sz w:val="28"/>
+                <w:szCs w:val="28"/>
+              </w:rPr>
+              <w:t>9</w:t>
+            </w:r>
+            <w:r>
+              <w:rPr>
+                <w:rFonts w:cs="Arial"/>
+                <w:b/>
+                <w:color w:val="000000"/>
+                <w:sz w:val="28"/>
+                <w:szCs w:val="28"/>
+              </w:rPr>
+              <w:t>.</w:t>
+            </w:r>
+            <w:r>
+              <w:rPr>
+                <w:rFonts w:cs="Arial"/>
+                <w:b/>
+                <w:color w:val="000000"/>
+                <w:sz w:val="28"/>
+                <w:szCs w:val="28"/>
+              </w:rPr>
+              <w:t>3</w:t>
+            </w:r>
+            <w:r>
+              <w:rPr>
+                <w:rFonts w:cs="Arial"/>
+                <w:b/>
+                <w:color w:val="000000"/>
+                <w:sz w:val="28"/>
+                <w:szCs w:val="28"/>
+              </w:rPr>
+              <w:t xml:space="preserve"> – Kramam</w:t>
+            </w:r>
+          </w:p>
+          <w:p>
+            <w:pPr>
+              <w:widowControl w:val="0"/>
+              <w:tabs>
+                <w:tab w:val="left" w:pos="993"/>
+              </w:tabs>
+              <w:autoSpaceDE w:val="0"/>
+              <w:autoSpaceDN w:val="0"/>
+              <w:adjustRightInd w:val="0"/>
+              <w:spacing w:before="0" w:line="252" w:lineRule="auto"/>
+              <w:ind w:right="297"/>
+              <w:rPr>
+                <w:rFonts w:cstheme="minorBidi" w:hint="cs"/>
+                <w:b/>
+                <w:color w:val="000000"/>
+                <w:sz w:val="28"/>
+                <w:szCs w:val="28"/>
+                <w:lang w:val="en-IN" w:bidi="ta-IN"/>
+              </w:rPr>
+            </w:pPr>
+            <w:r>
+              <w:rPr>
+                <w:rFonts w:cs="Arial"/>
+                <w:b/>
+                <w:color w:val="000000"/>
+                <w:sz w:val="28"/>
+                <w:szCs w:val="28"/>
+              </w:rPr>
+              <w:t xml:space="preserve">Krama Vaakyam No.– </w:t>
+            </w:r>
+            <w:r>
+              <w:rPr>
+                <w:rFonts w:cs="Arial"/>
+                <w:b/>
+                <w:color w:val="000000"/>
+                <w:sz w:val="28"/>
+                <w:szCs w:val="28"/>
+              </w:rPr>
+              <w:t>37,38</w:t>
+            </w:r>
+          </w:p>
+          <w:p>
+            <w:pPr>
+              <w:widowControl w:val="0"/>
+              <w:tabs>
+                <w:tab w:val="left" w:pos="993"/>
+              </w:tabs>
+              <w:autoSpaceDE w:val="0"/>
+              <w:autoSpaceDN w:val="0"/>
+              <w:adjustRightInd w:val="0"/>
+              <w:spacing w:before="0" w:line="252" w:lineRule="auto"/>
+              <w:ind w:right="297"/>
+              <w:rPr>
+                <w:rFonts w:cs="Arial"/>
+                <w:b/>
+                <w:color w:val="000000"/>
+                <w:sz w:val="28"/>
+                <w:szCs w:val="28"/>
+              </w:rPr>
+            </w:pPr>
+            <w:r>
+              <w:rPr>
+                <w:rFonts w:cs="Arial"/>
+                <w:b/>
+                <w:color w:val="000000"/>
+                <w:sz w:val="28"/>
+                <w:szCs w:val="28"/>
+              </w:rPr>
+              <w:t xml:space="preserve">Panchaati No. - </w:t>
+            </w:r>
+            <w:r>
+              <w:rPr>
+                <w:rFonts w:cs="Arial"/>
+                <w:b/>
+                <w:color w:val="000000"/>
+                <w:sz w:val="28"/>
+                <w:szCs w:val="28"/>
+              </w:rPr>
+              <w:t>47</w:t>
+            </w:r>
+          </w:p>
+        </w:tc>
+        <w:tc>
+          <w:tcPr>
+            <w:tcW w:w="5245" w:type="dxa"/>
+          </w:tcPr>
+          <w:p>
+            <w:pPr>
+              <w:widowControl w:val="0"/>
+              <w:autoSpaceDE w:val="0"/>
+              <w:autoSpaceDN w:val="0"/>
+              <w:adjustRightInd w:val="0"/>
+              <w:spacing w:before="0" w:line="240" w:lineRule="auto"/>
+              <w:rPr>
+                <w:rFonts w:ascii="Latha" w:hAnsi="Latha" w:cs="Latha"/>
+                <w:sz w:val="28"/>
+                <w:szCs w:val="28"/>
+                <w:cs/>
+                <w:lang w:bidi="ta-IN"/>
+              </w:rPr>
+            </w:pPr>
+            <w:r>
+              <w:rPr>
+                <w:rFonts w:ascii="Latha" w:hAnsi="Latha" w:cs="Latha"/>
+                <w:sz w:val="28"/>
+                <w:szCs w:val="28"/>
+                <w:cs/>
+                <w:lang w:bidi="ta-IN"/>
+              </w:rPr>
+              <w:t>தத</w:t>
+            </w:r>
+            <w:r>
+              <w:rPr>
+                <w:rFonts w:ascii="BRH Tamil Tab Extra" w:hAnsi="BRH Tamil Tab Extra" w:cs="Latha"/>
+                <w:b/>
+                <w:sz w:val="32"/>
+                <w:szCs w:val="28"/>
+                <w:lang w:bidi="ta-IN"/>
+              </w:rPr>
+              <w:t>…</w:t>
+            </w:r>
+            <w:r>
+              <w:rPr>
+                <w:rFonts w:ascii="Latha" w:hAnsi="Latha" w:cs="Latha"/>
+                <w:b/>
+                <w:bCs/>
+                <w:sz w:val="32"/>
+                <w:szCs w:val="32"/>
+                <w:cs/>
+                <w:lang w:bidi="ta-IN"/>
+              </w:rPr>
+              <w:t>:</w:t>
+            </w:r>
+            <w:r>
+              <w:rPr>
+                <w:rFonts w:ascii="Latha" w:hAnsi="Latha" w:cs="Latha"/>
+                <w:sz w:val="28"/>
+                <w:szCs w:val="28"/>
+                <w:lang w:bidi="ta-IN"/>
+              </w:rPr>
+              <w:t xml:space="preserve"> </w:t>
+            </w:r>
+            <w:r>
+              <w:rPr>
+                <w:rFonts w:ascii="Latha" w:hAnsi="Latha" w:cs="Latha"/>
+                <w:sz w:val="28"/>
+                <w:szCs w:val="28"/>
+                <w:cs/>
+                <w:lang w:bidi="ta-IN"/>
+              </w:rPr>
+              <w:t>ப்ராய</w:t>
+            </w:r>
+            <w:r>
+              <w:rPr>
+                <w:rFonts w:ascii="BRH Tamil Tab Extra" w:hAnsi="BRH Tamil Tab Extra" w:cs="Latha"/>
+                <w:b/>
+                <w:sz w:val="36"/>
+                <w:szCs w:val="28"/>
+                <w:lang w:bidi="ta-IN"/>
+              </w:rPr>
+              <w:t>†</w:t>
+            </w:r>
+            <w:r>
+              <w:rPr>
+                <w:rFonts w:ascii="Latha" w:hAnsi="Latha" w:cs="Latha"/>
+                <w:sz w:val="28"/>
+                <w:szCs w:val="28"/>
+                <w:cs/>
+                <w:lang w:bidi="ta-IN"/>
+              </w:rPr>
+              <w:t>ஶ்</w:t>
+            </w:r>
+            <w:r>
+              <w:rPr>
+                <w:rFonts w:ascii="Latha" w:hAnsi="Latha" w:cs="Latha"/>
+                <w:sz w:val="28"/>
+                <w:szCs w:val="28"/>
+                <w:highlight w:val="yellow"/>
+                <w:cs/>
+                <w:lang w:bidi="ta-IN"/>
+              </w:rPr>
+              <w:t>சிதி</w:t>
+            </w:r>
+            <w:r>
+              <w:rPr>
+                <w:rFonts w:ascii="Latha" w:hAnsi="Latha" w:cs="Latha"/>
+                <w:b/>
+                <w:bCs/>
+                <w:sz w:val="32"/>
+                <w:szCs w:val="32"/>
+                <w:highlight w:val="yellow"/>
+                <w:cs/>
+                <w:lang w:bidi="ta-IN"/>
+              </w:rPr>
+              <w:t>:</w:t>
+            </w:r>
+            <w:r>
+              <w:rPr>
+                <w:rFonts w:ascii="Latha" w:hAnsi="Latha" w:cs="Latha"/>
+                <w:sz w:val="28"/>
+                <w:szCs w:val="28"/>
+                <w:lang w:bidi="ta-IN"/>
+              </w:rPr>
+              <w:t xml:space="preserve"> | </w:t>
+            </w:r>
+            <w:r>
+              <w:rPr>
+                <w:rFonts w:ascii="Latha" w:hAnsi="Latha" w:cs="Latha"/>
+                <w:sz w:val="28"/>
+                <w:szCs w:val="28"/>
+                <w:lang w:bidi="ta-IN"/>
+              </w:rPr>
+              <w:br/>
+            </w:r>
+            <w:r>
+              <w:rPr>
+                <w:rFonts w:ascii="Latha" w:hAnsi="Latha" w:cs="Latha"/>
+                <w:sz w:val="28"/>
+                <w:szCs w:val="28"/>
+                <w:cs/>
+                <w:lang w:bidi="ta-IN"/>
+              </w:rPr>
+              <w:t>ப்ராய</w:t>
+            </w:r>
+            <w:r>
+              <w:rPr>
+                <w:rFonts w:ascii="BRH Tamil Tab Extra" w:hAnsi="BRH Tamil Tab Extra" w:cs="Latha"/>
+                <w:b/>
+                <w:sz w:val="36"/>
+                <w:szCs w:val="28"/>
+                <w:lang w:bidi="ta-IN"/>
+              </w:rPr>
+              <w:t>†</w:t>
+            </w:r>
+            <w:r>
+              <w:rPr>
+                <w:rFonts w:ascii="Latha" w:hAnsi="Latha" w:cs="Latha"/>
+                <w:sz w:val="28"/>
+                <w:szCs w:val="28"/>
+                <w:cs/>
+                <w:lang w:bidi="ta-IN"/>
+              </w:rPr>
+              <w:t>ஶ்</w:t>
+            </w:r>
+            <w:r>
+              <w:rPr>
+                <w:rFonts w:ascii="Latha" w:hAnsi="Latha" w:cs="Latha"/>
+                <w:sz w:val="28"/>
+                <w:szCs w:val="28"/>
+                <w:highlight w:val="yellow"/>
+                <w:cs/>
+                <w:lang w:bidi="ta-IN"/>
+              </w:rPr>
+              <w:t>சிதி</w:t>
+            </w:r>
+            <w:r>
+              <w:rPr>
+                <w:rFonts w:ascii="BRH Tamil Tab Extra" w:hAnsi="BRH Tamil Tab Extra" w:cs="Latha"/>
+                <w:b/>
+                <w:sz w:val="32"/>
+                <w:szCs w:val="28"/>
+                <w:highlight w:val="yellow"/>
+                <w:lang w:bidi="ta-IN"/>
+              </w:rPr>
+              <w:t>…</w:t>
+            </w:r>
+            <w:r>
+              <w:rPr>
+                <w:rFonts w:ascii="Latha" w:hAnsi="Latha" w:cs="Latha"/>
+                <w:sz w:val="28"/>
+                <w:szCs w:val="28"/>
+                <w:highlight w:val="yellow"/>
+                <w:cs/>
+                <w:lang w:bidi="ta-IN"/>
+              </w:rPr>
+              <w:t>ர்</w:t>
+            </w:r>
+            <w:r>
+              <w:rPr>
+                <w:rFonts w:ascii="Latha" w:hAnsi="Latha" w:cs="Latha"/>
+                <w:sz w:val="28"/>
+                <w:szCs w:val="28"/>
+                <w:lang w:bidi="ta-IN"/>
+              </w:rPr>
+              <w:t xml:space="preserve"> </w:t>
+            </w:r>
+            <w:r>
+              <w:rPr>
+                <w:rFonts w:ascii="Latha" w:hAnsi="Latha" w:cs="Latha"/>
+                <w:sz w:val="28"/>
+                <w:szCs w:val="28"/>
+                <w:cs/>
+                <w:lang w:bidi="ta-IN"/>
+              </w:rPr>
+              <w:t>ய</w:t>
+            </w:r>
+            <w:r>
+              <w:rPr>
+                <w:rFonts w:ascii="Latha" w:hAnsi="Latha" w:cs="Latha"/>
+                <w:b/>
+                <w:bCs/>
+                <w:sz w:val="32"/>
+                <w:szCs w:val="32"/>
+                <w:cs/>
+                <w:lang w:bidi="ta-IN"/>
+              </w:rPr>
+              <w:t>:</w:t>
+            </w:r>
+            <w:r>
+              <w:rPr>
+                <w:rFonts w:ascii="Latha" w:hAnsi="Latha" w:cs="Latha"/>
+                <w:sz w:val="28"/>
+                <w:szCs w:val="28"/>
+                <w:lang w:bidi="ta-IN"/>
+              </w:rPr>
+              <w:t xml:space="preserve"> |</w:t>
+            </w:r>
+          </w:p>
+        </w:tc>
+        <w:tc>
+          <w:tcPr>
+            <w:tcW w:w="5386" w:type="dxa"/>
+          </w:tcPr>
+          <w:p>
+            <w:pPr>
+              <w:widowControl w:val="0"/>
+              <w:autoSpaceDE w:val="0"/>
+              <w:autoSpaceDN w:val="0"/>
+              <w:adjustRightInd w:val="0"/>
+              <w:spacing w:before="0" w:line="240" w:lineRule="auto"/>
+              <w:rPr>
+                <w:rFonts w:ascii="Latha" w:hAnsi="Latha" w:cs="Latha"/>
+                <w:sz w:val="28"/>
+                <w:szCs w:val="28"/>
+                <w:cs/>
+                <w:lang w:bidi="ta-IN"/>
+              </w:rPr>
+            </w:pPr>
+            <w:r>
+              <w:rPr>
+                <w:rFonts w:ascii="Latha" w:hAnsi="Latha" w:cs="Latha"/>
+                <w:sz w:val="28"/>
+                <w:szCs w:val="28"/>
+                <w:cs/>
+                <w:lang w:bidi="ta-IN"/>
+              </w:rPr>
+              <w:t>தத</w:t>
+            </w:r>
+            <w:r>
+              <w:rPr>
+                <w:rFonts w:ascii="BRH Tamil Tab Extra" w:hAnsi="BRH Tamil Tab Extra" w:cs="Latha"/>
+                <w:b/>
+                <w:sz w:val="32"/>
+                <w:szCs w:val="28"/>
+                <w:lang w:bidi="ta-IN"/>
+              </w:rPr>
+              <w:t>…</w:t>
+            </w:r>
+            <w:r>
+              <w:rPr>
+                <w:rFonts w:ascii="Latha" w:hAnsi="Latha" w:cs="Latha"/>
+                <w:b/>
+                <w:bCs/>
+                <w:sz w:val="32"/>
+                <w:szCs w:val="32"/>
+                <w:cs/>
+                <w:lang w:bidi="ta-IN"/>
+              </w:rPr>
+              <w:t>:</w:t>
+            </w:r>
+            <w:r>
+              <w:rPr>
+                <w:rFonts w:ascii="Latha" w:hAnsi="Latha" w:cs="Latha"/>
+                <w:sz w:val="28"/>
+                <w:szCs w:val="28"/>
+                <w:lang w:bidi="ta-IN"/>
+              </w:rPr>
+              <w:t xml:space="preserve"> </w:t>
+            </w:r>
+            <w:r>
+              <w:rPr>
+                <w:rFonts w:ascii="Latha" w:hAnsi="Latha" w:cs="Latha"/>
+                <w:sz w:val="28"/>
+                <w:szCs w:val="28"/>
+                <w:cs/>
+                <w:lang w:bidi="ta-IN"/>
+              </w:rPr>
+              <w:t>ப்ராய</w:t>
+            </w:r>
+            <w:r>
+              <w:rPr>
+                <w:rFonts w:ascii="BRH Tamil Tab Extra" w:hAnsi="BRH Tamil Tab Extra" w:cs="Latha"/>
+                <w:b/>
+                <w:sz w:val="36"/>
+                <w:szCs w:val="28"/>
+                <w:lang w:bidi="ta-IN"/>
+              </w:rPr>
+              <w:t>†</w:t>
+            </w:r>
+            <w:r>
+              <w:rPr>
+                <w:rFonts w:ascii="Latha" w:hAnsi="Latha" w:cs="Latha"/>
+                <w:sz w:val="28"/>
+                <w:szCs w:val="28"/>
+                <w:cs/>
+                <w:lang w:bidi="ta-IN"/>
+              </w:rPr>
+              <w:t>ஶ்</w:t>
+            </w:r>
+            <w:r>
+              <w:rPr>
+                <w:rFonts w:ascii="Latha" w:hAnsi="Latha" w:cs="Latha"/>
+                <w:sz w:val="28"/>
+                <w:szCs w:val="28"/>
+                <w:highlight w:val="green"/>
+                <w:cs/>
+                <w:lang w:bidi="ta-IN"/>
+              </w:rPr>
+              <w:t>சி</w:t>
+            </w:r>
+            <w:r>
+              <w:rPr>
+                <w:rFonts w:ascii="Latha" w:hAnsi="Latha" w:cs="Latha" w:hint="cs"/>
+                <w:sz w:val="28"/>
+                <w:szCs w:val="28"/>
+                <w:highlight w:val="green"/>
+                <w:cs/>
+                <w:lang w:bidi="ta-IN"/>
+              </w:rPr>
+              <w:t>த்</w:t>
+            </w:r>
+            <w:r>
+              <w:rPr>
+                <w:rFonts w:ascii="Latha" w:hAnsi="Latha" w:cs="Latha"/>
+                <w:sz w:val="28"/>
+                <w:szCs w:val="28"/>
+                <w:highlight w:val="green"/>
+                <w:cs/>
+                <w:lang w:bidi="ta-IN"/>
+              </w:rPr>
+              <w:t>தி</w:t>
+            </w:r>
+            <w:r>
+              <w:rPr>
+                <w:rFonts w:ascii="Latha" w:hAnsi="Latha" w:cs="Latha"/>
+                <w:b/>
+                <w:bCs/>
+                <w:sz w:val="32"/>
+                <w:szCs w:val="32"/>
+                <w:highlight w:val="green"/>
+                <w:cs/>
+                <w:lang w:bidi="ta-IN"/>
+              </w:rPr>
+              <w:t>:</w:t>
+            </w:r>
+            <w:r>
+              <w:rPr>
+                <w:rFonts w:ascii="Latha" w:hAnsi="Latha" w:cs="Latha"/>
+                <w:sz w:val="28"/>
+                <w:szCs w:val="28"/>
+                <w:lang w:bidi="ta-IN"/>
+              </w:rPr>
+              <w:t xml:space="preserve"> | </w:t>
+            </w:r>
+            <w:r>
+              <w:rPr>
+                <w:rFonts w:ascii="Latha" w:hAnsi="Latha" w:cs="Latha"/>
+                <w:sz w:val="28"/>
+                <w:szCs w:val="28"/>
+                <w:cs/>
+                <w:lang w:bidi="ta-IN"/>
+              </w:rPr>
+              <w:t>ப்ராய</w:t>
+            </w:r>
+            <w:r>
+              <w:rPr>
+                <w:rFonts w:ascii="BRH Tamil Tab Extra" w:hAnsi="BRH Tamil Tab Extra" w:cs="Latha"/>
+                <w:b/>
+                <w:sz w:val="36"/>
+                <w:szCs w:val="28"/>
+                <w:lang w:bidi="ta-IN"/>
+              </w:rPr>
+              <w:t>†</w:t>
+            </w:r>
+            <w:r>
+              <w:rPr>
+                <w:rFonts w:ascii="Latha" w:hAnsi="Latha" w:cs="Latha"/>
+                <w:sz w:val="28"/>
+                <w:szCs w:val="28"/>
+                <w:cs/>
+                <w:lang w:bidi="ta-IN"/>
+              </w:rPr>
+              <w:t>ஶ்</w:t>
+            </w:r>
+            <w:r>
+              <w:rPr>
+                <w:rFonts w:ascii="Latha" w:hAnsi="Latha" w:cs="Latha"/>
+                <w:sz w:val="28"/>
+                <w:szCs w:val="28"/>
+                <w:highlight w:val="green"/>
+                <w:cs/>
+                <w:lang w:bidi="ta-IN"/>
+              </w:rPr>
+              <w:t>சி</w:t>
+            </w:r>
+            <w:r>
+              <w:rPr>
+                <w:rFonts w:ascii="Latha" w:hAnsi="Latha" w:cs="Latha" w:hint="cs"/>
+                <w:sz w:val="28"/>
+                <w:szCs w:val="28"/>
+                <w:highlight w:val="green"/>
+                <w:cs/>
+                <w:lang w:bidi="ta-IN"/>
+              </w:rPr>
+              <w:t>த்</w:t>
+            </w:r>
+            <w:r>
+              <w:rPr>
+                <w:rFonts w:ascii="Latha" w:hAnsi="Latha" w:cs="Latha"/>
+                <w:sz w:val="28"/>
+                <w:szCs w:val="28"/>
+                <w:highlight w:val="green"/>
+                <w:cs/>
+                <w:lang w:bidi="ta-IN"/>
+              </w:rPr>
+              <w:t>தி</w:t>
+            </w:r>
+            <w:r>
+              <w:rPr>
+                <w:rFonts w:ascii="BRH Tamil Tab Extra" w:hAnsi="BRH Tamil Tab Extra" w:cs="Latha"/>
+                <w:b/>
+                <w:sz w:val="32"/>
+                <w:szCs w:val="28"/>
+                <w:highlight w:val="green"/>
+                <w:lang w:bidi="ta-IN"/>
+              </w:rPr>
+              <w:t>…</w:t>
+            </w:r>
+            <w:r>
+              <w:rPr>
+                <w:rFonts w:ascii="Latha" w:hAnsi="Latha" w:cs="Latha"/>
+                <w:sz w:val="28"/>
+                <w:szCs w:val="28"/>
+                <w:highlight w:val="green"/>
+                <w:cs/>
+                <w:lang w:bidi="ta-IN"/>
+              </w:rPr>
+              <w:t>ர்</w:t>
+            </w:r>
+            <w:r>
+              <w:rPr>
+                <w:rFonts w:ascii="Latha" w:hAnsi="Latha" w:cs="Latha"/>
+                <w:sz w:val="28"/>
+                <w:szCs w:val="28"/>
+                <w:lang w:bidi="ta-IN"/>
+              </w:rPr>
+              <w:t xml:space="preserve"> </w:t>
+            </w:r>
+            <w:r>
+              <w:rPr>
+                <w:rFonts w:ascii="Latha" w:hAnsi="Latha" w:cs="Latha"/>
+                <w:sz w:val="28"/>
+                <w:szCs w:val="28"/>
+                <w:cs/>
+                <w:lang w:bidi="ta-IN"/>
+              </w:rPr>
+              <w:t>ய</w:t>
+            </w:r>
+            <w:r>
+              <w:rPr>
+                <w:rFonts w:ascii="Latha" w:hAnsi="Latha" w:cs="Latha"/>
+                <w:b/>
+                <w:bCs/>
+                <w:sz w:val="32"/>
+                <w:szCs w:val="32"/>
+                <w:cs/>
+                <w:lang w:bidi="ta-IN"/>
+              </w:rPr>
+              <w:t>:</w:t>
+            </w:r>
+            <w:r>
+              <w:rPr>
+                <w:rFonts w:ascii="Latha" w:hAnsi="Latha" w:cs="Latha"/>
+                <w:sz w:val="28"/>
+                <w:szCs w:val="28"/>
+                <w:lang w:bidi="ta-IN"/>
+              </w:rPr>
+              <w:t xml:space="preserve"> |</w:t>
+            </w:r>
+          </w:p>
+        </w:tc>
+      </w:tr>
+    </w:tbl>
+    <w:p>
+      <w:pPr>
+        <w:jc w:val="center"/>
+        <w:rPr>
+          <w:b/>
+          <w:bCs/>
+          <w:sz w:val="32"/>
+          <w:szCs w:val="32"/>
+          <w:u w:val="single"/>
+        </w:rPr>
+      </w:pPr>
+      <w:r>
+        <w:rPr>
+          <w:b/>
+          <w:bCs/>
+          <w:sz w:val="32"/>
+          <w:szCs w:val="32"/>
+          <w:u w:val="single"/>
+        </w:rPr>
+        <w:t>====================</w:t>
+      </w:r>
+    </w:p>
     <w:p>
       <w:pPr>
         <w:jc w:val="center"/>
@@ -108,23 +4700,7 @@
           <w:b/>
           <w:bCs/>
         </w:rPr>
-        <w:t>(</w:t>
-      </w:r>
-      <w:proofErr w:type="gramStart"/>
-      <w:r>
-        <w:rPr>
-          <w:b/>
-          <w:bCs/>
-        </w:rPr>
-        <w:t>ignore</w:t>
-      </w:r>
-      <w:proofErr w:type="gramEnd"/>
-      <w:r>
-        <w:rPr>
-          <w:b/>
-          <w:bCs/>
-        </w:rPr>
-        <w:t xml:space="preserve"> those which are already incorporated in your book’s version and date)</w:t>
+        <w:t>(ignore those which are already incorporated in your book’s version and date)</w:t>
       </w:r>
     </w:p>
     <w:tbl>
@@ -2389,6 +6965,7 @@
           <w:szCs w:val="32"/>
           <w:u w:val="single"/>
         </w:rPr>
+        <w:lastRenderedPageBreak/>
         <w:t xml:space="preserve">TS </w:t>
       </w:r>
       <w:r>
@@ -3379,7 +7956,6 @@
                 <w:sz w:val="28"/>
                 <w:szCs w:val="32"/>
               </w:rPr>
-              <w:lastRenderedPageBreak/>
               <w:t>T.S.5.1.4.1 – Kramam</w:t>
             </w:r>
           </w:p>
@@ -5761,6 +10337,7 @@
                 <w:sz w:val="28"/>
                 <w:szCs w:val="32"/>
               </w:rPr>
+              <w:lastRenderedPageBreak/>
               <w:t>T.S.5.1.8.4 – Kramam</w:t>
             </w:r>
           </w:p>
@@ -6904,6 +11481,24 @@
                 <w:rFonts w:ascii="Latha" w:hAnsi="Latha" w:cs="Latha"/>
                 <w:sz w:val="28"/>
                 <w:szCs w:val="28"/>
+                <w:lang w:bidi="ta-IN"/>
+              </w:rPr>
+              <w:t xml:space="preserve"> </w:t>
+            </w:r>
+            <w:r>
+              <w:rPr>
+                <w:rFonts w:ascii="Latha" w:hAnsi="Latha" w:cs="Latha"/>
+                <w:sz w:val="28"/>
+                <w:szCs w:val="28"/>
+                <w:lang w:bidi="ta-IN"/>
+              </w:rPr>
+              <w:br/>
+            </w:r>
+            <w:r>
+              <w:rPr>
+                <w:rFonts w:ascii="Latha" w:hAnsi="Latha" w:cs="Latha"/>
+                <w:sz w:val="28"/>
+                <w:szCs w:val="28"/>
                 <w:cs/>
                 <w:lang w:bidi="ta-IN"/>
               </w:rPr>
@@ -7281,7 +11876,6 @@
                 <w:sz w:val="28"/>
                 <w:szCs w:val="32"/>
               </w:rPr>
-              <w:lastRenderedPageBreak/>
               <w:t>T.S.5.1.9.5 – Kramam</w:t>
             </w:r>
           </w:p>
@@ -7922,7 +12516,6 @@
               </w:rPr>
               <w:t>4</w:t>
             </w:r>
-            <w:proofErr w:type="spellStart"/>
             <w:r>
               <w:rPr>
                 <w:rFonts w:ascii="BRH Devanagari Extra" w:hAnsi="BRH Devanagari Extra" w:cs="Latha"/>
@@ -7944,7 +12537,6 @@
               </w:rPr>
               <w:t>è</w:t>
             </w:r>
-            <w:proofErr w:type="spellEnd"/>
             <w:r>
               <w:rPr>
                 <w:rFonts w:ascii="Latha" w:hAnsi="Latha" w:cs="Latha"/>
@@ -8081,7 +12673,6 @@
               </w:rPr>
               <w:t>4</w:t>
             </w:r>
-            <w:proofErr w:type="spellStart"/>
             <w:r>
               <w:rPr>
                 <w:rFonts w:ascii="BRH Devanagari Extra" w:hAnsi="BRH Devanagari Extra" w:cs="Latha"/>
@@ -8092,7 +12683,6 @@
               </w:rPr>
               <w:t>óè</w:t>
             </w:r>
-            <w:proofErr w:type="spellEnd"/>
             <w:r>
               <w:rPr>
                 <w:rFonts w:ascii="Latha" w:hAnsi="Latha" w:cs="Latha"/>
@@ -8807,6 +13397,7 @@
           <w:szCs w:val="32"/>
           <w:u w:val="single"/>
         </w:rPr>
+        <w:lastRenderedPageBreak/>
         <w:t xml:space="preserve">TS </w:t>
       </w:r>
       <w:r>
@@ -9140,6 +13731,8 @@
       <w:headerReference w:type="default" r:id="rId8"/>
       <w:footerReference w:type="even" r:id="rId9"/>
       <w:footerReference w:type="default" r:id="rId10"/>
+      <w:headerReference w:type="first" r:id="rId11"/>
+      <w:footerReference w:type="first" r:id="rId12"/>
       <w:pgSz w:w="15840" w:h="12240" w:orient="landscape"/>
       <w:pgMar w:top="1440" w:right="1440" w:bottom="1440" w:left="1440" w:header="720" w:footer="720" w:gutter="0"/>
       <w:cols w:space="720"/>
@@ -9150,7 +13743,7 @@
 </file>
 
 <file path=word/endnotes.xml><?xml version="1.0" encoding="utf-8"?>
-<w:endnotes xmlns:wpc="http://schemas.microsoft.com/office/word/2010/wordprocessingCanvas" xmlns:cx="http://schemas.microsoft.com/office/drawing/2014/chartex" xmlns:cx1="http://schemas.microsoft.com/office/drawing/2015/9/8/chartex" xmlns:cx2="http://schemas.microsoft.com/office/drawing/2015/10/21/chartex" xmlns:cx3="http://schemas.microsoft.com/office/drawing/2016/5/9/chartex" xmlns:cx4="http://schemas.microsoft.com/office/drawing/2016/5/10/chartex" xmlns:cx5="http://schemas.microsoft.com/office/drawing/2016/5/11/chartex" xmlns:cx6="http://schemas.microsoft.com/office/drawing/2016/5/12/chartex" xmlns:cx7="http://schemas.microsoft.com/office/drawing/2016/5/13/chartex" xmlns:cx8="http://schemas.microsoft.com/office/drawing/2016/5/14/chartex" xmlns:mc="http://schemas.openxmlformats.org/markup-compatibility/2006" xmlns:aink="http://schemas.microsoft.com/office/drawing/2016/ink" xmlns:am3d="http://schemas.microsoft.com/office/drawing/2017/model3d" xmlns:o="urn:schemas-microsoft-com:office:office" xmlns:oel="http://schemas.microsoft.com/office/2019/extlst" xmlns:r="http://schemas.openxmlformats.org/officeDocument/2006/relationships" xmlns:m="http://schemas.openxmlformats.org/officeDocument/2006/math" xmlns:v="urn:schemas-microsoft-com:vml" xmlns:wp14="http://schemas.microsoft.com/office/word/2010/wordprocessingDrawing" xmlns:wp="http://schemas.openxmlformats.org/drawingml/2006/wordprocessingDrawing" xmlns:w10="urn:schemas-microsoft-com:office:word" xmlns:w="http://schemas.openxmlformats.org/wordprocessingml/2006/main" xmlns:w14="http://schemas.microsoft.com/office/word/2010/wordml" xmlns:w15="http://schemas.microsoft.com/office/word/2012/wordml" xmlns:w16cex="http://schemas.microsoft.com/office/word/2018/wordml/cex" xmlns:w16cid="http://schemas.microsoft.com/office/word/2016/wordml/cid" xmlns:w16="http://schemas.microsoft.com/office/word/2018/wordml" xmlns:w16sdtdh="http://schemas.microsoft.com/office/word/2020/wordml/sdtdatahash" xmlns:w16se="http://schemas.microsoft.com/office/word/2015/wordml/symex" xmlns:wpg="http://schemas.microsoft.com/office/word/2010/wordprocessingGroup" xmlns:wpi="http://schemas.microsoft.com/office/word/2010/wordprocessingInk" xmlns:wne="http://schemas.microsoft.com/office/word/2006/wordml" xmlns:wps="http://schemas.microsoft.com/office/word/2010/wordprocessingShape" mc:Ignorable="w14 w15 w16se w16cid w16 w16cex w16sdtdh wp14">
+<w:endnotes xmlns:wpc="http://schemas.microsoft.com/office/word/2010/wordprocessingCanvas" xmlns:cx="http://schemas.microsoft.com/office/drawing/2014/chartex" xmlns:cx1="http://schemas.microsoft.com/office/drawing/2015/9/8/chartex" xmlns:cx2="http://schemas.microsoft.com/office/drawing/2015/10/21/chartex" xmlns:cx3="http://schemas.microsoft.com/office/drawing/2016/5/9/chartex" xmlns:cx4="http://schemas.microsoft.com/office/drawing/2016/5/10/chartex" xmlns:cx5="http://schemas.microsoft.com/office/drawing/2016/5/11/chartex" xmlns:cx6="http://schemas.microsoft.com/office/drawing/2016/5/12/chartex" xmlns:cx7="http://schemas.microsoft.com/office/drawing/2016/5/13/chartex" xmlns:cx8="http://schemas.microsoft.com/office/drawing/2016/5/14/chartex" xmlns:mc="http://schemas.openxmlformats.org/markup-compatibility/2006" xmlns:aink="http://schemas.microsoft.com/office/drawing/2016/ink" xmlns:am3d="http://schemas.microsoft.com/office/drawing/2017/model3d" xmlns:o="urn:schemas-microsoft-com:office:office" xmlns:oel="http://schemas.microsoft.com/office/2019/extlst" xmlns:r="http://schemas.openxmlformats.org/officeDocument/2006/relationships" xmlns:m="http://schemas.openxmlformats.org/officeDocument/2006/math" xmlns:v="urn:schemas-microsoft-com:vml" xmlns:wp14="http://schemas.microsoft.com/office/word/2010/wordprocessingDrawing" xmlns:wp="http://schemas.openxmlformats.org/drawingml/2006/wordprocessingDrawing" xmlns:w10="urn:schemas-microsoft-com:office:word" xmlns:w="http://schemas.openxmlformats.org/wordprocessingml/2006/main" xmlns:w14="http://schemas.microsoft.com/office/word/2010/wordml" xmlns:w15="http://schemas.microsoft.com/office/word/2012/wordml" xmlns:w16cex="http://schemas.microsoft.com/office/word/2018/wordml/cex" xmlns:w16cid="http://schemas.microsoft.com/office/word/2016/wordml/cid" xmlns:w16="http://schemas.microsoft.com/office/word/2018/wordml" xmlns:w16du="http://schemas.microsoft.com/office/word/2023/wordml/word16du" xmlns:w16sdtdh="http://schemas.microsoft.com/office/word/2020/wordml/sdtdatahash" xmlns:w16sdtfl="http://schemas.microsoft.com/office/word/2024/wordml/sdtformatlock" xmlns:w16se="http://schemas.microsoft.com/office/word/2015/wordml/symex" xmlns:wpg="http://schemas.microsoft.com/office/word/2010/wordprocessingGroup" xmlns:wpi="http://schemas.microsoft.com/office/word/2010/wordprocessingInk" xmlns:wne="http://schemas.microsoft.com/office/word/2006/wordml" xmlns:wps="http://schemas.microsoft.com/office/word/2010/wordprocessingShape" mc:Ignorable="w14 w15 w16se w16cid w16 w16cex w16sdtdh w16sdtfl w16du wp14">
   <w:endnote w:type="separator" w:id="-1">
     <w:p>
       <w:pPr>
@@ -9175,12 +13768,13 @@
 </file>
 
 <file path=word/footer1.xml><?xml version="1.0" encoding="utf-8"?>
-<w:ftr xmlns:wpc="http://schemas.microsoft.com/office/word/2010/wordprocessingCanvas" xmlns:cx="http://schemas.microsoft.com/office/drawing/2014/chartex" xmlns:cx1="http://schemas.microsoft.com/office/drawing/2015/9/8/chartex" xmlns:cx2="http://schemas.microsoft.com/office/drawing/2015/10/21/chartex" xmlns:cx3="http://schemas.microsoft.com/office/drawing/2016/5/9/chartex" xmlns:cx4="http://schemas.microsoft.com/office/drawing/2016/5/10/chartex" xmlns:cx5="http://schemas.microsoft.com/office/drawing/2016/5/11/chartex" xmlns:cx6="http://schemas.microsoft.com/office/drawing/2016/5/12/chartex" xmlns:cx7="http://schemas.microsoft.com/office/drawing/2016/5/13/chartex" xmlns:cx8="http://schemas.microsoft.com/office/drawing/2016/5/14/chartex" xmlns:mc="http://schemas.openxmlformats.org/markup-compatibility/2006" xmlns:aink="http://schemas.microsoft.com/office/drawing/2016/ink" xmlns:am3d="http://schemas.microsoft.com/office/drawing/2017/model3d" xmlns:o="urn:schemas-microsoft-com:office:office" xmlns:oel="http://schemas.microsoft.com/office/2019/extlst" xmlns:r="http://schemas.openxmlformats.org/officeDocument/2006/relationships" xmlns:m="http://schemas.openxmlformats.org/officeDocument/2006/math" xmlns:v="urn:schemas-microsoft-com:vml" xmlns:wp14="http://schemas.microsoft.com/office/word/2010/wordprocessingDrawing" xmlns:wp="http://schemas.openxmlformats.org/drawingml/2006/wordprocessingDrawing" xmlns:w10="urn:schemas-microsoft-com:office:word" xmlns:w="http://schemas.openxmlformats.org/wordprocessingml/2006/main" xmlns:w14="http://schemas.microsoft.com/office/word/2010/wordml" xmlns:w15="http://schemas.microsoft.com/office/word/2012/wordml" xmlns:w16cex="http://schemas.microsoft.com/office/word/2018/wordml/cex" xmlns:w16cid="http://schemas.microsoft.com/office/word/2016/wordml/cid" xmlns:w16="http://schemas.microsoft.com/office/word/2018/wordml" xmlns:w16sdtdh="http://schemas.microsoft.com/office/word/2020/wordml/sdtdatahash" xmlns:w16se="http://schemas.microsoft.com/office/word/2015/wordml/symex" xmlns:wpg="http://schemas.microsoft.com/office/word/2010/wordprocessingGroup" xmlns:wpi="http://schemas.microsoft.com/office/word/2010/wordprocessingInk" xmlns:wne="http://schemas.microsoft.com/office/word/2006/wordml" xmlns:wps="http://schemas.microsoft.com/office/word/2010/wordprocessingShape" mc:Ignorable="w14 w15 w16se w16cid w16 w16cex w16sdtdh wp14">
+<w:ftr xmlns:wpc="http://schemas.microsoft.com/office/word/2010/wordprocessingCanvas" xmlns:cx="http://schemas.microsoft.com/office/drawing/2014/chartex" xmlns:cx1="http://schemas.microsoft.com/office/drawing/2015/9/8/chartex" xmlns:cx2="http://schemas.microsoft.com/office/drawing/2015/10/21/chartex" xmlns:cx3="http://schemas.microsoft.com/office/drawing/2016/5/9/chartex" xmlns:cx4="http://schemas.microsoft.com/office/drawing/2016/5/10/chartex" xmlns:cx5="http://schemas.microsoft.com/office/drawing/2016/5/11/chartex" xmlns:cx6="http://schemas.microsoft.com/office/drawing/2016/5/12/chartex" xmlns:cx7="http://schemas.microsoft.com/office/drawing/2016/5/13/chartex" xmlns:cx8="http://schemas.microsoft.com/office/drawing/2016/5/14/chartex" xmlns:mc="http://schemas.openxmlformats.org/markup-compatibility/2006" xmlns:aink="http://schemas.microsoft.com/office/drawing/2016/ink" xmlns:am3d="http://schemas.microsoft.com/office/drawing/2017/model3d" xmlns:o="urn:schemas-microsoft-com:office:office" xmlns:oel="http://schemas.microsoft.com/office/2019/extlst" xmlns:r="http://schemas.openxmlformats.org/officeDocument/2006/relationships" xmlns:m="http://schemas.openxmlformats.org/officeDocument/2006/math" xmlns:v="urn:schemas-microsoft-com:vml" xmlns:wp14="http://schemas.microsoft.com/office/word/2010/wordprocessingDrawing" xmlns:wp="http://schemas.openxmlformats.org/drawingml/2006/wordprocessingDrawing" xmlns:w10="urn:schemas-microsoft-com:office:word" xmlns:w="http://schemas.openxmlformats.org/wordprocessingml/2006/main" xmlns:w14="http://schemas.microsoft.com/office/word/2010/wordml" xmlns:w15="http://schemas.microsoft.com/office/word/2012/wordml" xmlns:w16cex="http://schemas.microsoft.com/office/word/2018/wordml/cex" xmlns:w16cid="http://schemas.microsoft.com/office/word/2016/wordml/cid" xmlns:w16="http://schemas.microsoft.com/office/word/2018/wordml" xmlns:w16du="http://schemas.microsoft.com/office/word/2023/wordml/word16du" xmlns:w16sdtdh="http://schemas.microsoft.com/office/word/2020/wordml/sdtdatahash" xmlns:w16sdtfl="http://schemas.microsoft.com/office/word/2024/wordml/sdtformatlock" xmlns:w16se="http://schemas.microsoft.com/office/word/2015/wordml/symex" xmlns:wpg="http://schemas.microsoft.com/office/word/2010/wordprocessingGroup" xmlns:wpi="http://schemas.microsoft.com/office/word/2010/wordprocessingInk" xmlns:wne="http://schemas.microsoft.com/office/word/2006/wordml" xmlns:wps="http://schemas.microsoft.com/office/word/2010/wordprocessingShape" mc:Ignorable="w14 w15 w16se w16cid w16 w16cex w16sdtdh w16sdtfl w16du wp14">
   <w:p>
     <w:pPr>
       <w:pBdr>
         <w:top w:val="single" w:sz="4" w:space="1" w:color="auto"/>
       </w:pBdr>
+      <w:jc w:val="right"/>
       <w:rPr>
         <w:b/>
         <w:bCs/>
@@ -9227,14 +13821,35 @@
         <w:bCs/>
       </w:rPr>
       <w:tab/>
-      <w:t xml:space="preserve">              v</w:t>
+      <w:t xml:space="preserve">              </w:t>
     </w:r>
     <w:r>
       <w:rPr>
         <w:b/>
         <w:bCs/>
       </w:rPr>
-      <w:t>edavms@gmail.com</w:t>
+      <w:t>www.</w:t>
+    </w:r>
+    <w:r>
+      <w:rPr>
+        <w:b/>
+        <w:bCs/>
+      </w:rPr>
+      <w:t>v</w:t>
+    </w:r>
+    <w:r>
+      <w:rPr>
+        <w:b/>
+        <w:bCs/>
+      </w:rPr>
+      <w:t>edavms</w:t>
+    </w:r>
+    <w:r>
+      <w:rPr>
+        <w:b/>
+        <w:bCs/>
+      </w:rPr>
+      <w:t>.in</w:t>
     </w:r>
     <w:r>
       <w:rPr>
@@ -9258,7 +13873,7 @@
       <w:tab/>
     </w:r>
     <w:r>
-      <w:tab/>
+      <w:t xml:space="preserve">                                 </w:t>
     </w:r>
     <w:r>
       <w:rPr>
@@ -9356,12 +13971,13 @@
 </file>
 
 <file path=word/footer2.xml><?xml version="1.0" encoding="utf-8"?>
-<w:ftr xmlns:wpc="http://schemas.microsoft.com/office/word/2010/wordprocessingCanvas" xmlns:cx="http://schemas.microsoft.com/office/drawing/2014/chartex" xmlns:cx1="http://schemas.microsoft.com/office/drawing/2015/9/8/chartex" xmlns:cx2="http://schemas.microsoft.com/office/drawing/2015/10/21/chartex" xmlns:cx3="http://schemas.microsoft.com/office/drawing/2016/5/9/chartex" xmlns:cx4="http://schemas.microsoft.com/office/drawing/2016/5/10/chartex" xmlns:cx5="http://schemas.microsoft.com/office/drawing/2016/5/11/chartex" xmlns:cx6="http://schemas.microsoft.com/office/drawing/2016/5/12/chartex" xmlns:cx7="http://schemas.microsoft.com/office/drawing/2016/5/13/chartex" xmlns:cx8="http://schemas.microsoft.com/office/drawing/2016/5/14/chartex" xmlns:mc="http://schemas.openxmlformats.org/markup-compatibility/2006" xmlns:aink="http://schemas.microsoft.com/office/drawing/2016/ink" xmlns:am3d="http://schemas.microsoft.com/office/drawing/2017/model3d" xmlns:o="urn:schemas-microsoft-com:office:office" xmlns:oel="http://schemas.microsoft.com/office/2019/extlst" xmlns:r="http://schemas.openxmlformats.org/officeDocument/2006/relationships" xmlns:m="http://schemas.openxmlformats.org/officeDocument/2006/math" xmlns:v="urn:schemas-microsoft-com:vml" xmlns:wp14="http://schemas.microsoft.com/office/word/2010/wordprocessingDrawing" xmlns:wp="http://schemas.openxmlformats.org/drawingml/2006/wordprocessingDrawing" xmlns:w10="urn:schemas-microsoft-com:office:word" xmlns:w="http://schemas.openxmlformats.org/wordprocessingml/2006/main" xmlns:w14="http://schemas.microsoft.com/office/word/2010/wordml" xmlns:w15="http://schemas.microsoft.com/office/word/2012/wordml" xmlns:w16cex="http://schemas.microsoft.com/office/word/2018/wordml/cex" xmlns:w16cid="http://schemas.microsoft.com/office/word/2016/wordml/cid" xmlns:w16="http://schemas.microsoft.com/office/word/2018/wordml" xmlns:w16sdtdh="http://schemas.microsoft.com/office/word/2020/wordml/sdtdatahash" xmlns:w16se="http://schemas.microsoft.com/office/word/2015/wordml/symex" xmlns:wpg="http://schemas.microsoft.com/office/word/2010/wordprocessingGroup" xmlns:wpi="http://schemas.microsoft.com/office/word/2010/wordprocessingInk" xmlns:wne="http://schemas.microsoft.com/office/word/2006/wordml" xmlns:wps="http://schemas.microsoft.com/office/word/2010/wordprocessingShape" mc:Ignorable="w14 w15 w16se w16cid w16 w16cex w16sdtdh wp14">
+<w:ftr xmlns:wpc="http://schemas.microsoft.com/office/word/2010/wordprocessingCanvas" xmlns:cx="http://schemas.microsoft.com/office/drawing/2014/chartex" xmlns:cx1="http://schemas.microsoft.com/office/drawing/2015/9/8/chartex" xmlns:cx2="http://schemas.microsoft.com/office/drawing/2015/10/21/chartex" xmlns:cx3="http://schemas.microsoft.com/office/drawing/2016/5/9/chartex" xmlns:cx4="http://schemas.microsoft.com/office/drawing/2016/5/10/chartex" xmlns:cx5="http://schemas.microsoft.com/office/drawing/2016/5/11/chartex" xmlns:cx6="http://schemas.microsoft.com/office/drawing/2016/5/12/chartex" xmlns:cx7="http://schemas.microsoft.com/office/drawing/2016/5/13/chartex" xmlns:cx8="http://schemas.microsoft.com/office/drawing/2016/5/14/chartex" xmlns:mc="http://schemas.openxmlformats.org/markup-compatibility/2006" xmlns:aink="http://schemas.microsoft.com/office/drawing/2016/ink" xmlns:am3d="http://schemas.microsoft.com/office/drawing/2017/model3d" xmlns:o="urn:schemas-microsoft-com:office:office" xmlns:oel="http://schemas.microsoft.com/office/2019/extlst" xmlns:r="http://schemas.openxmlformats.org/officeDocument/2006/relationships" xmlns:m="http://schemas.openxmlformats.org/officeDocument/2006/math" xmlns:v="urn:schemas-microsoft-com:vml" xmlns:wp14="http://schemas.microsoft.com/office/word/2010/wordprocessingDrawing" xmlns:wp="http://schemas.openxmlformats.org/drawingml/2006/wordprocessingDrawing" xmlns:w10="urn:schemas-microsoft-com:office:word" xmlns:w="http://schemas.openxmlformats.org/wordprocessingml/2006/main" xmlns:w14="http://schemas.microsoft.com/office/word/2010/wordml" xmlns:w15="http://schemas.microsoft.com/office/word/2012/wordml" xmlns:w16cex="http://schemas.microsoft.com/office/word/2018/wordml/cex" xmlns:w16cid="http://schemas.microsoft.com/office/word/2016/wordml/cid" xmlns:w16="http://schemas.microsoft.com/office/word/2018/wordml" xmlns:w16du="http://schemas.microsoft.com/office/word/2023/wordml/word16du" xmlns:w16sdtdh="http://schemas.microsoft.com/office/word/2020/wordml/sdtdatahash" xmlns:w16sdtfl="http://schemas.microsoft.com/office/word/2024/wordml/sdtformatlock" xmlns:w16se="http://schemas.microsoft.com/office/word/2015/wordml/symex" xmlns:wpg="http://schemas.microsoft.com/office/word/2010/wordprocessingGroup" xmlns:wpi="http://schemas.microsoft.com/office/word/2010/wordprocessingInk" xmlns:wne="http://schemas.microsoft.com/office/word/2006/wordml" xmlns:wps="http://schemas.microsoft.com/office/word/2010/wordprocessingShape" mc:Ignorable="w14 w15 w16se w16cid w16 w16cex w16sdtdh w16sdtfl w16du wp14">
   <w:p>
     <w:pPr>
       <w:pBdr>
         <w:top w:val="single" w:sz="4" w:space="1" w:color="auto"/>
       </w:pBdr>
+      <w:jc w:val="right"/>
       <w:rPr>
         <w:b/>
         <w:bCs/>
@@ -9447,6 +14063,9 @@
     </w:r>
     <w:r>
       <w:tab/>
+    </w:r>
+    <w:r>
+      <w:t xml:space="preserve">            </w:t>
     </w:r>
     <w:r>
       <w:tab/>
@@ -9557,8 +14176,18 @@
 </w:ftr>
 </file>
 
+<file path=word/footer3.xml><?xml version="1.0" encoding="utf-8"?>
+<w:ftr xmlns:wpc="http://schemas.microsoft.com/office/word/2010/wordprocessingCanvas" xmlns:cx="http://schemas.microsoft.com/office/drawing/2014/chartex" xmlns:cx1="http://schemas.microsoft.com/office/drawing/2015/9/8/chartex" xmlns:cx2="http://schemas.microsoft.com/office/drawing/2015/10/21/chartex" xmlns:cx3="http://schemas.microsoft.com/office/drawing/2016/5/9/chartex" xmlns:cx4="http://schemas.microsoft.com/office/drawing/2016/5/10/chartex" xmlns:cx5="http://schemas.microsoft.com/office/drawing/2016/5/11/chartex" xmlns:cx6="http://schemas.microsoft.com/office/drawing/2016/5/12/chartex" xmlns:cx7="http://schemas.microsoft.com/office/drawing/2016/5/13/chartex" xmlns:cx8="http://schemas.microsoft.com/office/drawing/2016/5/14/chartex" xmlns:mc="http://schemas.openxmlformats.org/markup-compatibility/2006" xmlns:aink="http://schemas.microsoft.com/office/drawing/2016/ink" xmlns:am3d="http://schemas.microsoft.com/office/drawing/2017/model3d" xmlns:o="urn:schemas-microsoft-com:office:office" xmlns:oel="http://schemas.microsoft.com/office/2019/extlst" xmlns:r="http://schemas.openxmlformats.org/officeDocument/2006/relationships" xmlns:m="http://schemas.openxmlformats.org/officeDocument/2006/math" xmlns:v="urn:schemas-microsoft-com:vml" xmlns:wp14="http://schemas.microsoft.com/office/word/2010/wordprocessingDrawing" xmlns:wp="http://schemas.openxmlformats.org/drawingml/2006/wordprocessingDrawing" xmlns:w10="urn:schemas-microsoft-com:office:word" xmlns:w="http://schemas.openxmlformats.org/wordprocessingml/2006/main" xmlns:w14="http://schemas.microsoft.com/office/word/2010/wordml" xmlns:w15="http://schemas.microsoft.com/office/word/2012/wordml" xmlns:w16cex="http://schemas.microsoft.com/office/word/2018/wordml/cex" xmlns:w16cid="http://schemas.microsoft.com/office/word/2016/wordml/cid" xmlns:w16="http://schemas.microsoft.com/office/word/2018/wordml" xmlns:w16du="http://schemas.microsoft.com/office/word/2023/wordml/word16du" xmlns:w16sdtdh="http://schemas.microsoft.com/office/word/2020/wordml/sdtdatahash" xmlns:w16sdtfl="http://schemas.microsoft.com/office/word/2024/wordml/sdtformatlock" xmlns:w16se="http://schemas.microsoft.com/office/word/2015/wordml/symex" xmlns:wpg="http://schemas.microsoft.com/office/word/2010/wordprocessingGroup" xmlns:wpi="http://schemas.microsoft.com/office/word/2010/wordprocessingInk" xmlns:wne="http://schemas.microsoft.com/office/word/2006/wordml" xmlns:wps="http://schemas.microsoft.com/office/word/2010/wordprocessingShape" mc:Ignorable="w14 w15 w16se w16cid w16 w16cex w16sdtdh w16sdtfl w16du wp14">
+  <w:p>
+    <w:pPr>
+      <w:pStyle w:val="Footer"/>
+    </w:pPr>
+  </w:p>
+</w:ftr>
+</file>
+
 <file path=word/footnotes.xml><?xml version="1.0" encoding="utf-8"?>
-<w:footnotes xmlns:wpc="http://schemas.microsoft.com/office/word/2010/wordprocessingCanvas" xmlns:cx="http://schemas.microsoft.com/office/drawing/2014/chartex" xmlns:cx1="http://schemas.microsoft.com/office/drawing/2015/9/8/chartex" xmlns:cx2="http://schemas.microsoft.com/office/drawing/2015/10/21/chartex" xmlns:cx3="http://schemas.microsoft.com/office/drawing/2016/5/9/chartex" xmlns:cx4="http://schemas.microsoft.com/office/drawing/2016/5/10/chartex" xmlns:cx5="http://schemas.microsoft.com/office/drawing/2016/5/11/chartex" xmlns:cx6="http://schemas.microsoft.com/office/drawing/2016/5/12/chartex" xmlns:cx7="http://schemas.microsoft.com/office/drawing/2016/5/13/chartex" xmlns:cx8="http://schemas.microsoft.com/office/drawing/2016/5/14/chartex" xmlns:mc="http://schemas.openxmlformats.org/markup-compatibility/2006" xmlns:aink="http://schemas.microsoft.com/office/drawing/2016/ink" xmlns:am3d="http://schemas.microsoft.com/office/drawing/2017/model3d" xmlns:o="urn:schemas-microsoft-com:office:office" xmlns:oel="http://schemas.microsoft.com/office/2019/extlst" xmlns:r="http://schemas.openxmlformats.org/officeDocument/2006/relationships" xmlns:m="http://schemas.openxmlformats.org/officeDocument/2006/math" xmlns:v="urn:schemas-microsoft-com:vml" xmlns:wp14="http://schemas.microsoft.com/office/word/2010/wordprocessingDrawing" xmlns:wp="http://schemas.openxmlformats.org/drawingml/2006/wordprocessingDrawing" xmlns:w10="urn:schemas-microsoft-com:office:word" xmlns:w="http://schemas.openxmlformats.org/wordprocessingml/2006/main" xmlns:w14="http://schemas.microsoft.com/office/word/2010/wordml" xmlns:w15="http://schemas.microsoft.com/office/word/2012/wordml" xmlns:w16cex="http://schemas.microsoft.com/office/word/2018/wordml/cex" xmlns:w16cid="http://schemas.microsoft.com/office/word/2016/wordml/cid" xmlns:w16="http://schemas.microsoft.com/office/word/2018/wordml" xmlns:w16sdtdh="http://schemas.microsoft.com/office/word/2020/wordml/sdtdatahash" xmlns:w16se="http://schemas.microsoft.com/office/word/2015/wordml/symex" xmlns:wpg="http://schemas.microsoft.com/office/word/2010/wordprocessingGroup" xmlns:wpi="http://schemas.microsoft.com/office/word/2010/wordprocessingInk" xmlns:wne="http://schemas.microsoft.com/office/word/2006/wordml" xmlns:wps="http://schemas.microsoft.com/office/word/2010/wordprocessingShape" mc:Ignorable="w14 w15 w16se w16cid w16 w16cex w16sdtdh wp14">
+<w:footnotes xmlns:wpc="http://schemas.microsoft.com/office/word/2010/wordprocessingCanvas" xmlns:cx="http://schemas.microsoft.com/office/drawing/2014/chartex" xmlns:cx1="http://schemas.microsoft.com/office/drawing/2015/9/8/chartex" xmlns:cx2="http://schemas.microsoft.com/office/drawing/2015/10/21/chartex" xmlns:cx3="http://schemas.microsoft.com/office/drawing/2016/5/9/chartex" xmlns:cx4="http://schemas.microsoft.com/office/drawing/2016/5/10/chartex" xmlns:cx5="http://schemas.microsoft.com/office/drawing/2016/5/11/chartex" xmlns:cx6="http://schemas.microsoft.com/office/drawing/2016/5/12/chartex" xmlns:cx7="http://schemas.microsoft.com/office/drawing/2016/5/13/chartex" xmlns:cx8="http://schemas.microsoft.com/office/drawing/2016/5/14/chartex" xmlns:mc="http://schemas.openxmlformats.org/markup-compatibility/2006" xmlns:aink="http://schemas.microsoft.com/office/drawing/2016/ink" xmlns:am3d="http://schemas.microsoft.com/office/drawing/2017/model3d" xmlns:o="urn:schemas-microsoft-com:office:office" xmlns:oel="http://schemas.microsoft.com/office/2019/extlst" xmlns:r="http://schemas.openxmlformats.org/officeDocument/2006/relationships" xmlns:m="http://schemas.openxmlformats.org/officeDocument/2006/math" xmlns:v="urn:schemas-microsoft-com:vml" xmlns:wp14="http://schemas.microsoft.com/office/word/2010/wordprocessingDrawing" xmlns:wp="http://schemas.openxmlformats.org/drawingml/2006/wordprocessingDrawing" xmlns:w10="urn:schemas-microsoft-com:office:word" xmlns:w="http://schemas.openxmlformats.org/wordprocessingml/2006/main" xmlns:w14="http://schemas.microsoft.com/office/word/2010/wordml" xmlns:w15="http://schemas.microsoft.com/office/word/2012/wordml" xmlns:w16cex="http://schemas.microsoft.com/office/word/2018/wordml/cex" xmlns:w16cid="http://schemas.microsoft.com/office/word/2016/wordml/cid" xmlns:w16="http://schemas.microsoft.com/office/word/2018/wordml" xmlns:w16du="http://schemas.microsoft.com/office/word/2023/wordml/word16du" xmlns:w16sdtdh="http://schemas.microsoft.com/office/word/2020/wordml/sdtdatahash" xmlns:w16sdtfl="http://schemas.microsoft.com/office/word/2024/wordml/sdtformatlock" xmlns:w16se="http://schemas.microsoft.com/office/word/2015/wordml/symex" xmlns:wpg="http://schemas.microsoft.com/office/word/2010/wordprocessingGroup" xmlns:wpi="http://schemas.microsoft.com/office/word/2010/wordprocessingInk" xmlns:wne="http://schemas.microsoft.com/office/word/2006/wordml" xmlns:wps="http://schemas.microsoft.com/office/word/2010/wordprocessingShape" mc:Ignorable="w14 w15 w16se w16cid w16 w16cex w16sdtdh w16sdtfl w16du wp14">
   <w:footnote w:type="separator" w:id="-1">
     <w:p>
       <w:pPr>
@@ -9583,7 +14212,7 @@
 </file>
 
 <file path=word/header1.xml><?xml version="1.0" encoding="utf-8"?>
-<w:hdr xmlns:wpc="http://schemas.microsoft.com/office/word/2010/wordprocessingCanvas" xmlns:cx="http://schemas.microsoft.com/office/drawing/2014/chartex" xmlns:cx1="http://schemas.microsoft.com/office/drawing/2015/9/8/chartex" xmlns:cx2="http://schemas.microsoft.com/office/drawing/2015/10/21/chartex" xmlns:cx3="http://schemas.microsoft.com/office/drawing/2016/5/9/chartex" xmlns:cx4="http://schemas.microsoft.com/office/drawing/2016/5/10/chartex" xmlns:cx5="http://schemas.microsoft.com/office/drawing/2016/5/11/chartex" xmlns:cx6="http://schemas.microsoft.com/office/drawing/2016/5/12/chartex" xmlns:cx7="http://schemas.microsoft.com/office/drawing/2016/5/13/chartex" xmlns:cx8="http://schemas.microsoft.com/office/drawing/2016/5/14/chartex" xmlns:mc="http://schemas.openxmlformats.org/markup-compatibility/2006" xmlns:aink="http://schemas.microsoft.com/office/drawing/2016/ink" xmlns:am3d="http://schemas.microsoft.com/office/drawing/2017/model3d" xmlns:o="urn:schemas-microsoft-com:office:office" xmlns:oel="http://schemas.microsoft.com/office/2019/extlst" xmlns:r="http://schemas.openxmlformats.org/officeDocument/2006/relationships" xmlns:m="http://schemas.openxmlformats.org/officeDocument/2006/math" xmlns:v="urn:schemas-microsoft-com:vml" xmlns:wp14="http://schemas.microsoft.com/office/word/2010/wordprocessingDrawing" xmlns:wp="http://schemas.openxmlformats.org/drawingml/2006/wordprocessingDrawing" xmlns:w10="urn:schemas-microsoft-com:office:word" xmlns:w="http://schemas.openxmlformats.org/wordprocessingml/2006/main" xmlns:w14="http://schemas.microsoft.com/office/word/2010/wordml" xmlns:w15="http://schemas.microsoft.com/office/word/2012/wordml" xmlns:w16cex="http://schemas.microsoft.com/office/word/2018/wordml/cex" xmlns:w16cid="http://schemas.microsoft.com/office/word/2016/wordml/cid" xmlns:w16="http://schemas.microsoft.com/office/word/2018/wordml" xmlns:w16sdtdh="http://schemas.microsoft.com/office/word/2020/wordml/sdtdatahash" xmlns:w16se="http://schemas.microsoft.com/office/word/2015/wordml/symex" xmlns:wpg="http://schemas.microsoft.com/office/word/2010/wordprocessingGroup" xmlns:wpi="http://schemas.microsoft.com/office/word/2010/wordprocessingInk" xmlns:wne="http://schemas.microsoft.com/office/word/2006/wordml" xmlns:wps="http://schemas.microsoft.com/office/word/2010/wordprocessingShape" mc:Ignorable="w14 w15 w16se w16cid w16 w16cex w16sdtdh wp14">
+<w:hdr xmlns:wpc="http://schemas.microsoft.com/office/word/2010/wordprocessingCanvas" xmlns:cx="http://schemas.microsoft.com/office/drawing/2014/chartex" xmlns:cx1="http://schemas.microsoft.com/office/drawing/2015/9/8/chartex" xmlns:cx2="http://schemas.microsoft.com/office/drawing/2015/10/21/chartex" xmlns:cx3="http://schemas.microsoft.com/office/drawing/2016/5/9/chartex" xmlns:cx4="http://schemas.microsoft.com/office/drawing/2016/5/10/chartex" xmlns:cx5="http://schemas.microsoft.com/office/drawing/2016/5/11/chartex" xmlns:cx6="http://schemas.microsoft.com/office/drawing/2016/5/12/chartex" xmlns:cx7="http://schemas.microsoft.com/office/drawing/2016/5/13/chartex" xmlns:cx8="http://schemas.microsoft.com/office/drawing/2016/5/14/chartex" xmlns:mc="http://schemas.openxmlformats.org/markup-compatibility/2006" xmlns:aink="http://schemas.microsoft.com/office/drawing/2016/ink" xmlns:am3d="http://schemas.microsoft.com/office/drawing/2017/model3d" xmlns:o="urn:schemas-microsoft-com:office:office" xmlns:oel="http://schemas.microsoft.com/office/2019/extlst" xmlns:r="http://schemas.openxmlformats.org/officeDocument/2006/relationships" xmlns:m="http://schemas.openxmlformats.org/officeDocument/2006/math" xmlns:v="urn:schemas-microsoft-com:vml" xmlns:wp14="http://schemas.microsoft.com/office/word/2010/wordprocessingDrawing" xmlns:wp="http://schemas.openxmlformats.org/drawingml/2006/wordprocessingDrawing" xmlns:w10="urn:schemas-microsoft-com:office:word" xmlns:w="http://schemas.openxmlformats.org/wordprocessingml/2006/main" xmlns:w14="http://schemas.microsoft.com/office/word/2010/wordml" xmlns:w15="http://schemas.microsoft.com/office/word/2012/wordml" xmlns:w16cex="http://schemas.microsoft.com/office/word/2018/wordml/cex" xmlns:w16cid="http://schemas.microsoft.com/office/word/2016/wordml/cid" xmlns:w16="http://schemas.microsoft.com/office/word/2018/wordml" xmlns:w16du="http://schemas.microsoft.com/office/word/2023/wordml/word16du" xmlns:w16sdtdh="http://schemas.microsoft.com/office/word/2020/wordml/sdtdatahash" xmlns:w16sdtfl="http://schemas.microsoft.com/office/word/2024/wordml/sdtformatlock" xmlns:w16se="http://schemas.microsoft.com/office/word/2015/wordml/symex" xmlns:wpg="http://schemas.microsoft.com/office/word/2010/wordprocessingGroup" xmlns:wpi="http://schemas.microsoft.com/office/word/2010/wordprocessingInk" xmlns:wne="http://schemas.microsoft.com/office/word/2006/wordml" xmlns:wps="http://schemas.microsoft.com/office/word/2010/wordprocessingShape" mc:Ignorable="w14 w15 w16se w16cid w16 w16cex w16sdtdh w16sdtfl w16du wp14">
   <w:p>
     <w:pPr>
       <w:pStyle w:val="Header"/>
@@ -9596,7 +14225,7 @@
 </file>
 
 <file path=word/header2.xml><?xml version="1.0" encoding="utf-8"?>
-<w:hdr xmlns:wpc="http://schemas.microsoft.com/office/word/2010/wordprocessingCanvas" xmlns:cx="http://schemas.microsoft.com/office/drawing/2014/chartex" xmlns:cx1="http://schemas.microsoft.com/office/drawing/2015/9/8/chartex" xmlns:cx2="http://schemas.microsoft.com/office/drawing/2015/10/21/chartex" xmlns:cx3="http://schemas.microsoft.com/office/drawing/2016/5/9/chartex" xmlns:cx4="http://schemas.microsoft.com/office/drawing/2016/5/10/chartex" xmlns:cx5="http://schemas.microsoft.com/office/drawing/2016/5/11/chartex" xmlns:cx6="http://schemas.microsoft.com/office/drawing/2016/5/12/chartex" xmlns:cx7="http://schemas.microsoft.com/office/drawing/2016/5/13/chartex" xmlns:cx8="http://schemas.microsoft.com/office/drawing/2016/5/14/chartex" xmlns:mc="http://schemas.openxmlformats.org/markup-compatibility/2006" xmlns:aink="http://schemas.microsoft.com/office/drawing/2016/ink" xmlns:am3d="http://schemas.microsoft.com/office/drawing/2017/model3d" xmlns:o="urn:schemas-microsoft-com:office:office" xmlns:oel="http://schemas.microsoft.com/office/2019/extlst" xmlns:r="http://schemas.openxmlformats.org/officeDocument/2006/relationships" xmlns:m="http://schemas.openxmlformats.org/officeDocument/2006/math" xmlns:v="urn:schemas-microsoft-com:vml" xmlns:wp14="http://schemas.microsoft.com/office/word/2010/wordprocessingDrawing" xmlns:wp="http://schemas.openxmlformats.org/drawingml/2006/wordprocessingDrawing" xmlns:w10="urn:schemas-microsoft-com:office:word" xmlns:w="http://schemas.openxmlformats.org/wordprocessingml/2006/main" xmlns:w14="http://schemas.microsoft.com/office/word/2010/wordml" xmlns:w15="http://schemas.microsoft.com/office/word/2012/wordml" xmlns:w16cex="http://schemas.microsoft.com/office/word/2018/wordml/cex" xmlns:w16cid="http://schemas.microsoft.com/office/word/2016/wordml/cid" xmlns:w16="http://schemas.microsoft.com/office/word/2018/wordml" xmlns:w16sdtdh="http://schemas.microsoft.com/office/word/2020/wordml/sdtdatahash" xmlns:w16se="http://schemas.microsoft.com/office/word/2015/wordml/symex" xmlns:wpg="http://schemas.microsoft.com/office/word/2010/wordprocessingGroup" xmlns:wpi="http://schemas.microsoft.com/office/word/2010/wordprocessingInk" xmlns:wne="http://schemas.microsoft.com/office/word/2006/wordml" xmlns:wps="http://schemas.microsoft.com/office/word/2010/wordprocessingShape" mc:Ignorable="w14 w15 w16se w16cid w16 w16cex w16sdtdh wp14">
+<w:hdr xmlns:wpc="http://schemas.microsoft.com/office/word/2010/wordprocessingCanvas" xmlns:cx="http://schemas.microsoft.com/office/drawing/2014/chartex" xmlns:cx1="http://schemas.microsoft.com/office/drawing/2015/9/8/chartex" xmlns:cx2="http://schemas.microsoft.com/office/drawing/2015/10/21/chartex" xmlns:cx3="http://schemas.microsoft.com/office/drawing/2016/5/9/chartex" xmlns:cx4="http://schemas.microsoft.com/office/drawing/2016/5/10/chartex" xmlns:cx5="http://schemas.microsoft.com/office/drawing/2016/5/11/chartex" xmlns:cx6="http://schemas.microsoft.com/office/drawing/2016/5/12/chartex" xmlns:cx7="http://schemas.microsoft.com/office/drawing/2016/5/13/chartex" xmlns:cx8="http://schemas.microsoft.com/office/drawing/2016/5/14/chartex" xmlns:mc="http://schemas.openxmlformats.org/markup-compatibility/2006" xmlns:aink="http://schemas.microsoft.com/office/drawing/2016/ink" xmlns:am3d="http://schemas.microsoft.com/office/drawing/2017/model3d" xmlns:o="urn:schemas-microsoft-com:office:office" xmlns:oel="http://schemas.microsoft.com/office/2019/extlst" xmlns:r="http://schemas.openxmlformats.org/officeDocument/2006/relationships" xmlns:m="http://schemas.openxmlformats.org/officeDocument/2006/math" xmlns:v="urn:schemas-microsoft-com:vml" xmlns:wp14="http://schemas.microsoft.com/office/word/2010/wordprocessingDrawing" xmlns:wp="http://schemas.openxmlformats.org/drawingml/2006/wordprocessingDrawing" xmlns:w10="urn:schemas-microsoft-com:office:word" xmlns:w="http://schemas.openxmlformats.org/wordprocessingml/2006/main" xmlns:w14="http://schemas.microsoft.com/office/word/2010/wordml" xmlns:w15="http://schemas.microsoft.com/office/word/2012/wordml" xmlns:w16cex="http://schemas.microsoft.com/office/word/2018/wordml/cex" xmlns:w16cid="http://schemas.microsoft.com/office/word/2016/wordml/cid" xmlns:w16="http://schemas.microsoft.com/office/word/2018/wordml" xmlns:w16du="http://schemas.microsoft.com/office/word/2023/wordml/word16du" xmlns:w16sdtdh="http://schemas.microsoft.com/office/word/2020/wordml/sdtdatahash" xmlns:w16sdtfl="http://schemas.microsoft.com/office/word/2024/wordml/sdtformatlock" xmlns:w16se="http://schemas.microsoft.com/office/word/2015/wordml/symex" xmlns:wpg="http://schemas.microsoft.com/office/word/2010/wordprocessingGroup" xmlns:wpi="http://schemas.microsoft.com/office/word/2010/wordprocessingInk" xmlns:wne="http://schemas.microsoft.com/office/word/2006/wordml" xmlns:wps="http://schemas.microsoft.com/office/word/2010/wordprocessingShape" mc:Ignorable="w14 w15 w16se w16cid w16 w16cex w16sdtdh w16sdtfl w16du wp14">
   <w:p>
     <w:pPr>
       <w:pStyle w:val="Header"/>
@@ -9608,8 +14237,18 @@
 </w:hdr>
 </file>
 
+<file path=word/header3.xml><?xml version="1.0" encoding="utf-8"?>
+<w:hdr xmlns:wpc="http://schemas.microsoft.com/office/word/2010/wordprocessingCanvas" xmlns:cx="http://schemas.microsoft.com/office/drawing/2014/chartex" xmlns:cx1="http://schemas.microsoft.com/office/drawing/2015/9/8/chartex" xmlns:cx2="http://schemas.microsoft.com/office/drawing/2015/10/21/chartex" xmlns:cx3="http://schemas.microsoft.com/office/drawing/2016/5/9/chartex" xmlns:cx4="http://schemas.microsoft.com/office/drawing/2016/5/10/chartex" xmlns:cx5="http://schemas.microsoft.com/office/drawing/2016/5/11/chartex" xmlns:cx6="http://schemas.microsoft.com/office/drawing/2016/5/12/chartex" xmlns:cx7="http://schemas.microsoft.com/office/drawing/2016/5/13/chartex" xmlns:cx8="http://schemas.microsoft.com/office/drawing/2016/5/14/chartex" xmlns:mc="http://schemas.openxmlformats.org/markup-compatibility/2006" xmlns:aink="http://schemas.microsoft.com/office/drawing/2016/ink" xmlns:am3d="http://schemas.microsoft.com/office/drawing/2017/model3d" xmlns:o="urn:schemas-microsoft-com:office:office" xmlns:oel="http://schemas.microsoft.com/office/2019/extlst" xmlns:r="http://schemas.openxmlformats.org/officeDocument/2006/relationships" xmlns:m="http://schemas.openxmlformats.org/officeDocument/2006/math" xmlns:v="urn:schemas-microsoft-com:vml" xmlns:wp14="http://schemas.microsoft.com/office/word/2010/wordprocessingDrawing" xmlns:wp="http://schemas.openxmlformats.org/drawingml/2006/wordprocessingDrawing" xmlns:w10="urn:schemas-microsoft-com:office:word" xmlns:w="http://schemas.openxmlformats.org/wordprocessingml/2006/main" xmlns:w14="http://schemas.microsoft.com/office/word/2010/wordml" xmlns:w15="http://schemas.microsoft.com/office/word/2012/wordml" xmlns:w16cex="http://schemas.microsoft.com/office/word/2018/wordml/cex" xmlns:w16cid="http://schemas.microsoft.com/office/word/2016/wordml/cid" xmlns:w16="http://schemas.microsoft.com/office/word/2018/wordml" xmlns:w16du="http://schemas.microsoft.com/office/word/2023/wordml/word16du" xmlns:w16sdtdh="http://schemas.microsoft.com/office/word/2020/wordml/sdtdatahash" xmlns:w16sdtfl="http://schemas.microsoft.com/office/word/2024/wordml/sdtformatlock" xmlns:w16se="http://schemas.microsoft.com/office/word/2015/wordml/symex" xmlns:wpg="http://schemas.microsoft.com/office/word/2010/wordprocessingGroup" xmlns:wpi="http://schemas.microsoft.com/office/word/2010/wordprocessingInk" xmlns:wne="http://schemas.microsoft.com/office/word/2006/wordml" xmlns:wps="http://schemas.microsoft.com/office/word/2010/wordprocessingShape" mc:Ignorable="w14 w15 w16se w16cid w16 w16cex w16sdtdh w16sdtfl w16du wp14">
+  <w:p>
+    <w:pPr>
+      <w:pStyle w:val="Header"/>
+    </w:pPr>
+  </w:p>
+</w:hdr>
+</file>
+
 <file path=word/styles.xml><?xml version="1.0" encoding="utf-8"?>
-<w:styles xmlns:mc="http://schemas.openxmlformats.org/markup-compatibility/2006" xmlns:r="http://schemas.openxmlformats.org/officeDocument/2006/relationships" xmlns:w="http://schemas.openxmlformats.org/wordprocessingml/2006/main" xmlns:w14="http://schemas.microsoft.com/office/word/2010/wordml" xmlns:w15="http://schemas.microsoft.com/office/word/2012/wordml" xmlns:w16cex="http://schemas.microsoft.com/office/word/2018/wordml/cex" xmlns:w16cid="http://schemas.microsoft.com/office/word/2016/wordml/cid" xmlns:w16="http://schemas.microsoft.com/office/word/2018/wordml" xmlns:w16sdtdh="http://schemas.microsoft.com/office/word/2020/wordml/sdtdatahash" xmlns:w16se="http://schemas.microsoft.com/office/word/2015/wordml/symex" mc:Ignorable="w14 w15 w16se w16cid w16 w16cex w16sdtdh">
+<w:styles xmlns:mc="http://schemas.openxmlformats.org/markup-compatibility/2006" xmlns:r="http://schemas.openxmlformats.org/officeDocument/2006/relationships" xmlns:w="http://schemas.openxmlformats.org/wordprocessingml/2006/main" xmlns:w14="http://schemas.microsoft.com/office/word/2010/wordml" xmlns:w15="http://schemas.microsoft.com/office/word/2012/wordml" xmlns:w16cex="http://schemas.microsoft.com/office/word/2018/wordml/cex" xmlns:w16cid="http://schemas.microsoft.com/office/word/2016/wordml/cid" xmlns:w16="http://schemas.microsoft.com/office/word/2018/wordml" xmlns:w16du="http://schemas.microsoft.com/office/word/2023/wordml/word16du" xmlns:w16sdtdh="http://schemas.microsoft.com/office/word/2020/wordml/sdtdatahash" xmlns:w16sdtfl="http://schemas.microsoft.com/office/word/2024/wordml/sdtformatlock" xmlns:w16se="http://schemas.microsoft.com/office/word/2015/wordml/symex" mc:Ignorable="w14 w15 w16se w16cid w16 w16cex w16sdtdh w16sdtfl w16du">
   <w:docDefaults>
     <w:rPrDefault>
       <w:rPr>
@@ -9725,6 +14364,7 @@
     <w:lsdException w:name="HTML Sample" w:semiHidden="1" w:unhideWhenUsed="1"/>
     <w:lsdException w:name="HTML Typewriter" w:semiHidden="1" w:unhideWhenUsed="1"/>
     <w:lsdException w:name="HTML Variable" w:semiHidden="1" w:unhideWhenUsed="1"/>
+    <w:lsdException w:name="Normal Table" w:semiHidden="1" w:unhideWhenUsed="1"/>
     <w:lsdException w:name="annotation subject" w:semiHidden="1" w:unhideWhenUsed="1"/>
     <w:lsdException w:name="No List" w:semiHidden="1" w:unhideWhenUsed="1"/>
     <w:lsdException w:name="Outline List 1" w:semiHidden="1" w:unhideWhenUsed="1"/>
@@ -9767,8 +14407,11 @@
     <w:lsdException w:name="Table Contemporary" w:semiHidden="1" w:unhideWhenUsed="1"/>
     <w:lsdException w:name="Table Elegant" w:semiHidden="1" w:unhideWhenUsed="1"/>
     <w:lsdException w:name="Table Professional" w:semiHidden="1" w:unhideWhenUsed="1"/>
+    <w:lsdException w:name="Table Subtle 1" w:semiHidden="1" w:unhideWhenUsed="1"/>
     <w:lsdException w:name="Table Subtle 2" w:semiHidden="1" w:unhideWhenUsed="1"/>
     <w:lsdException w:name="Table Web 1" w:semiHidden="1" w:unhideWhenUsed="1"/>
+    <w:lsdException w:name="Table Web 2" w:semiHidden="1" w:unhideWhenUsed="1"/>
+    <w:lsdException w:name="Table Web 3" w:semiHidden="1" w:unhideWhenUsed="1"/>
     <w:lsdException w:name="Balloon Text" w:semiHidden="1" w:unhideWhenUsed="1"/>
     <w:lsdException w:name="Table Grid" w:uiPriority="59"/>
     <w:lsdException w:name="Table Theme" w:semiHidden="1" w:unhideWhenUsed="1"/>
@@ -9996,7 +14639,7 @@
   <w:style w:type="paragraph" w:default="1" w:styleId="Normal">
     <w:name w:val="Normal"/>
     <w:qFormat/>
-    <w:rsid w:val="00076C05"/>
+    <w:rsid w:val="00F17B47"/>
     <w:pPr>
       <w:spacing w:before="120" w:line="276" w:lineRule="auto"/>
     </w:pPr>

</xml_diff>

<commit_message>
TS 5.1 - 5.3 Tamil Kramam final pushed
</commit_message>
<xml_diff>
--- a/TS-Kramam/TS-5.1/TS 5.1 Tamil Krama Paatam Corrections.docx
+++ b/TS-Kramam/TS-5.1/TS 5.1 Tamil Krama Paatam Corrections.docx
@@ -84,20 +84,37 @@
         </w:rPr>
         <w:t xml:space="preserve">Observed till </w:t>
       </w:r>
-      <w:proofErr w:type="spellStart"/>
       <w:r>
         <w:rPr>
           <w:b/>
           <w:bCs/>
-          <w:color w:val="EE0000"/>
           <w:sz w:val="32"/>
           <w:szCs w:val="32"/>
-          <w:highlight w:val="yellow"/>
           <w:u w:val="single"/>
         </w:rPr>
-        <w:t>xxxxxxxxxx</w:t>
+        <w:t>31</w:t>
       </w:r>
-      <w:proofErr w:type="spellEnd"/>
+      <w:r>
+        <w:rPr>
+          <w:b/>
+          <w:bCs/>
+          <w:sz w:val="32"/>
+          <w:szCs w:val="32"/>
+          <w:u w:val="single"/>
+          <w:vertAlign w:val="superscript"/>
+        </w:rPr>
+        <w:t>st</w:t>
+      </w:r>
+      <w:r>
+        <w:rPr>
+          <w:b/>
+          <w:bCs/>
+          <w:sz w:val="32"/>
+          <w:szCs w:val="32"/>
+          <w:u w:val="single"/>
+        </w:rPr>
+        <w:t xml:space="preserve"> July 2026</w:t>
+      </w:r>
     </w:p>
     <w:p>
       <w:pPr>

</xml_diff>